<commit_message>
+ Complement resultat conherance simulation comportementale FPGA et spectre manipe
</commit_message>
<xml_diff>
--- a/doc/Architecture_resultat_EGSE.docx
+++ b/doc/Architecture_resultat_EGSE.docx
@@ -2676,11 +2676,24 @@
             <w:r>
               <w:t xml:space="preserve">DR </w:t>
             </w:r>
-            <w:fldSimple w:instr=" SEQ DR \* ARABIC ">
-              <w:r>
-                <w:t>1</w:t>
-              </w:r>
-            </w:fldSimple>
+            <w:r>
+              <w:fldChar w:fldCharType="begin"/>
+            </w:r>
+            <w:r>
+              <w:instrText xml:space="preserve"> SEQ DR \* ARABIC </w:instrText>
+            </w:r>
+            <w:r>
+              <w:fldChar w:fldCharType="separate"/>
+            </w:r>
+            <w:r>
+              <w:rPr>
+                <w:noProof/>
+              </w:rPr>
+              <w:t>1</w:t>
+            </w:r>
+            <w:r>
+              <w:fldChar w:fldCharType="end"/>
+            </w:r>
           </w:p>
         </w:tc>
         <w:tc>
@@ -2744,11 +2757,24 @@
             <w:r>
               <w:t xml:space="preserve">DR </w:t>
             </w:r>
-            <w:fldSimple w:instr=" SEQ DR \* ARABIC ">
-              <w:r>
-                <w:t>2</w:t>
-              </w:r>
-            </w:fldSimple>
+            <w:r>
+              <w:fldChar w:fldCharType="begin"/>
+            </w:r>
+            <w:r>
+              <w:instrText xml:space="preserve"> SEQ DR \* ARABIC </w:instrText>
+            </w:r>
+            <w:r>
+              <w:fldChar w:fldCharType="separate"/>
+            </w:r>
+            <w:r>
+              <w:rPr>
+                <w:noProof/>
+              </w:rPr>
+              <w:t>2</w:t>
+            </w:r>
+            <w:r>
+              <w:fldChar w:fldCharType="end"/>
+            </w:r>
           </w:p>
         </w:tc>
         <w:tc>
@@ -2812,11 +2838,24 @@
             <w:r>
               <w:t xml:space="preserve">DR </w:t>
             </w:r>
-            <w:fldSimple w:instr=" SEQ DR \* ARABIC ">
-              <w:r>
-                <w:t>3</w:t>
-              </w:r>
-            </w:fldSimple>
+            <w:r>
+              <w:fldChar w:fldCharType="begin"/>
+            </w:r>
+            <w:r>
+              <w:instrText xml:space="preserve"> SEQ DR \* ARABIC </w:instrText>
+            </w:r>
+            <w:r>
+              <w:fldChar w:fldCharType="separate"/>
+            </w:r>
+            <w:r>
+              <w:rPr>
+                <w:noProof/>
+              </w:rPr>
+              <w:t>3</w:t>
+            </w:r>
+            <w:r>
+              <w:fldChar w:fldCharType="end"/>
+            </w:r>
           </w:p>
         </w:tc>
         <w:tc>
@@ -3063,11 +3102,24 @@
             <w:r>
               <w:t xml:space="preserve">DA </w:t>
             </w:r>
-            <w:fldSimple w:instr=" SEQ AD \* ARABIC ">
-              <w:r>
-                <w:t>1</w:t>
-              </w:r>
-            </w:fldSimple>
+            <w:r>
+              <w:fldChar w:fldCharType="begin"/>
+            </w:r>
+            <w:r>
+              <w:instrText xml:space="preserve"> SEQ AD \* ARABIC </w:instrText>
+            </w:r>
+            <w:r>
+              <w:fldChar w:fldCharType="separate"/>
+            </w:r>
+            <w:r>
+              <w:rPr>
+                <w:noProof/>
+              </w:rPr>
+              <w:t>1</w:t>
+            </w:r>
+            <w:r>
+              <w:fldChar w:fldCharType="end"/>
+            </w:r>
           </w:p>
         </w:tc>
         <w:tc>
@@ -3132,11 +3184,24 @@
             <w:r>
               <w:t xml:space="preserve">DA </w:t>
             </w:r>
-            <w:fldSimple w:instr=" SEQ AD \* ARABIC ">
-              <w:r>
-                <w:t>2</w:t>
-              </w:r>
-            </w:fldSimple>
+            <w:r>
+              <w:fldChar w:fldCharType="begin"/>
+            </w:r>
+            <w:r>
+              <w:instrText xml:space="preserve"> SEQ AD \* ARABIC </w:instrText>
+            </w:r>
+            <w:r>
+              <w:fldChar w:fldCharType="separate"/>
+            </w:r>
+            <w:r>
+              <w:rPr>
+                <w:noProof/>
+              </w:rPr>
+              <w:t>2</w:t>
+            </w:r>
+            <w:r>
+              <w:fldChar w:fldCharType="end"/>
+            </w:r>
           </w:p>
         </w:tc>
         <w:tc>
@@ -3201,11 +3266,24 @@
             <w:r>
               <w:t xml:space="preserve">DA </w:t>
             </w:r>
-            <w:fldSimple w:instr=" SEQ AD \* ARABIC ">
-              <w:r>
-                <w:t>3</w:t>
-              </w:r>
-            </w:fldSimple>
+            <w:r>
+              <w:fldChar w:fldCharType="begin"/>
+            </w:r>
+            <w:r>
+              <w:instrText xml:space="preserve"> SEQ AD \* ARABIC </w:instrText>
+            </w:r>
+            <w:r>
+              <w:fldChar w:fldCharType="separate"/>
+            </w:r>
+            <w:r>
+              <w:rPr>
+                <w:noProof/>
+              </w:rPr>
+              <w:t>3</w:t>
+            </w:r>
+            <w:r>
+              <w:fldChar w:fldCharType="end"/>
+            </w:r>
           </w:p>
         </w:tc>
         <w:tc>
@@ -3321,6 +3399,7 @@
           <w:rFonts w:asciiTheme="minorHAnsi" w:eastAsiaTheme="minorEastAsia" w:hAnsiTheme="minorHAnsi" w:cstheme="minorBidi"/>
           <w:b w:val="0"/>
           <w:caps w:val="0"/>
+          <w:noProof/>
           <w:sz w:val="22"/>
           <w:szCs w:val="22"/>
           <w:lang w:val="fr-FR"/>
@@ -3344,10 +3423,11 @@
         </w:rPr>
         <w:fldChar w:fldCharType="separate"/>
       </w:r>
-      <w:hyperlink w:anchor="_Toc174515902" w:history="1">
+      <w:hyperlink w:anchor="_Toc175154801" w:history="1">
         <w:r>
           <w:rPr>
             <w:rStyle w:val="Lienhypertexte"/>
+            <w:noProof/>
             <w:lang w:val="fr-FR"/>
           </w:rPr>
           <w:t>1.</w:t>
@@ -3357,6 +3437,7 @@
             <w:rFonts w:asciiTheme="minorHAnsi" w:eastAsiaTheme="minorEastAsia" w:hAnsiTheme="minorHAnsi" w:cstheme="minorBidi"/>
             <w:b w:val="0"/>
             <w:caps w:val="0"/>
+            <w:noProof/>
             <w:sz w:val="22"/>
             <w:szCs w:val="22"/>
             <w:lang w:val="fr-FR"/>
@@ -3366,55 +3447,56 @@
         <w:r>
           <w:rPr>
             <w:rStyle w:val="Lienhypertexte"/>
+            <w:noProof/>
             <w:lang w:val="fr-FR"/>
           </w:rPr>
           <w:t>Bance de test de l'EGSE</w:t>
         </w:r>
         <w:r>
           <w:rPr>
+            <w:noProof/>
             <w:webHidden/>
-            <w:lang w:val="fr-FR"/>
           </w:rPr>
           <w:tab/>
         </w:r>
         <w:r>
           <w:rPr>
+            <w:noProof/>
             <w:webHidden/>
-            <w:lang w:val="fr-FR"/>
           </w:rPr>
           <w:fldChar w:fldCharType="begin"/>
         </w:r>
         <w:r>
           <w:rPr>
+            <w:noProof/>
             <w:webHidden/>
-            <w:lang w:val="fr-FR"/>
           </w:rPr>
-          <w:instrText xml:space="preserve"> PAGEREF _Toc174515902 \h </w:instrText>
+          <w:instrText xml:space="preserve"> PAGEREF _Toc175154801 \h </w:instrText>
         </w:r>
         <w:r>
           <w:rPr>
+            <w:noProof/>
             <w:webHidden/>
-            <w:lang w:val="fr-FR"/>
           </w:rPr>
         </w:r>
         <w:r>
           <w:rPr>
+            <w:noProof/>
             <w:webHidden/>
-            <w:lang w:val="fr-FR"/>
           </w:rPr>
           <w:fldChar w:fldCharType="separate"/>
         </w:r>
         <w:r>
           <w:rPr>
+            <w:noProof/>
             <w:webHidden/>
-            <w:lang w:val="fr-FR"/>
           </w:rPr>
           <w:t>5</w:t>
         </w:r>
         <w:r>
           <w:rPr>
+            <w:noProof/>
             <w:webHidden/>
-            <w:lang w:val="fr-FR"/>
           </w:rPr>
           <w:fldChar w:fldCharType="end"/>
         </w:r>
@@ -3431,15 +3513,17 @@
           <w:rFonts w:asciiTheme="minorHAnsi" w:eastAsiaTheme="minorEastAsia" w:hAnsiTheme="minorHAnsi" w:cstheme="minorBidi"/>
           <w:b w:val="0"/>
           <w:caps w:val="0"/>
+          <w:noProof/>
           <w:sz w:val="22"/>
           <w:szCs w:val="22"/>
           <w:lang w:val="fr-FR"/>
         </w:rPr>
       </w:pPr>
-      <w:hyperlink w:anchor="_Toc174515903" w:history="1">
+      <w:hyperlink w:anchor="_Toc175154802" w:history="1">
         <w:r>
           <w:rPr>
             <w:rStyle w:val="Lienhypertexte"/>
+            <w:noProof/>
             <w:lang w:val="fr-FR"/>
           </w:rPr>
           <w:t>2.</w:t>
@@ -3449,6 +3533,7 @@
             <w:rFonts w:asciiTheme="minorHAnsi" w:eastAsiaTheme="minorEastAsia" w:hAnsiTheme="minorHAnsi" w:cstheme="minorBidi"/>
             <w:b w:val="0"/>
             <w:caps w:val="0"/>
+            <w:noProof/>
             <w:sz w:val="22"/>
             <w:szCs w:val="22"/>
             <w:lang w:val="fr-FR"/>
@@ -3458,55 +3543,56 @@
         <w:r>
           <w:rPr>
             <w:rStyle w:val="Lienhypertexte"/>
+            <w:noProof/>
             <w:lang w:val="fr-FR"/>
           </w:rPr>
           <w:t>Un schéma bloc de l'EGSE</w:t>
         </w:r>
         <w:r>
           <w:rPr>
+            <w:noProof/>
             <w:webHidden/>
-            <w:lang w:val="fr-FR"/>
           </w:rPr>
           <w:tab/>
         </w:r>
         <w:r>
           <w:rPr>
+            <w:noProof/>
             <w:webHidden/>
-            <w:lang w:val="fr-FR"/>
           </w:rPr>
           <w:fldChar w:fldCharType="begin"/>
         </w:r>
         <w:r>
           <w:rPr>
+            <w:noProof/>
             <w:webHidden/>
-            <w:lang w:val="fr-FR"/>
           </w:rPr>
-          <w:instrText xml:space="preserve"> PAGEREF _Toc174515903 \h </w:instrText>
+          <w:instrText xml:space="preserve"> PAGEREF _Toc175154802 \h </w:instrText>
         </w:r>
         <w:r>
           <w:rPr>
+            <w:noProof/>
             <w:webHidden/>
-            <w:lang w:val="fr-FR"/>
           </w:rPr>
         </w:r>
         <w:r>
           <w:rPr>
+            <w:noProof/>
             <w:webHidden/>
-            <w:lang w:val="fr-FR"/>
           </w:rPr>
           <w:fldChar w:fldCharType="separate"/>
         </w:r>
         <w:r>
           <w:rPr>
+            <w:noProof/>
             <w:webHidden/>
-            <w:lang w:val="fr-FR"/>
           </w:rPr>
           <w:t>5</w:t>
         </w:r>
         <w:r>
           <w:rPr>
+            <w:noProof/>
             <w:webHidden/>
-            <w:lang w:val="fr-FR"/>
           </w:rPr>
           <w:fldChar w:fldCharType="end"/>
         </w:r>
@@ -3523,15 +3609,17 @@
           <w:rFonts w:asciiTheme="minorHAnsi" w:eastAsiaTheme="minorEastAsia" w:hAnsiTheme="minorHAnsi" w:cstheme="minorBidi"/>
           <w:b w:val="0"/>
           <w:caps w:val="0"/>
+          <w:noProof/>
           <w:sz w:val="22"/>
           <w:szCs w:val="22"/>
           <w:lang w:val="fr-FR"/>
         </w:rPr>
       </w:pPr>
-      <w:hyperlink w:anchor="_Toc174515904" w:history="1">
+      <w:hyperlink w:anchor="_Toc175154803" w:history="1">
         <w:r>
           <w:rPr>
             <w:rStyle w:val="Lienhypertexte"/>
+            <w:noProof/>
             <w:lang w:val="fr-FR"/>
           </w:rPr>
           <w:t>3.</w:t>
@@ -3541,6 +3629,7 @@
             <w:rFonts w:asciiTheme="minorHAnsi" w:eastAsiaTheme="minorEastAsia" w:hAnsiTheme="minorHAnsi" w:cstheme="minorBidi"/>
             <w:b w:val="0"/>
             <w:caps w:val="0"/>
+            <w:noProof/>
             <w:sz w:val="22"/>
             <w:szCs w:val="22"/>
             <w:lang w:val="fr-FR"/>
@@ -3550,55 +3639,56 @@
         <w:r>
           <w:rPr>
             <w:rStyle w:val="Lienhypertexte"/>
+            <w:noProof/>
             <w:lang w:val="fr-FR"/>
           </w:rPr>
           <w:t>fonctionnalite de l’egse</w:t>
         </w:r>
         <w:r>
           <w:rPr>
+            <w:noProof/>
             <w:webHidden/>
-            <w:lang w:val="fr-FR"/>
           </w:rPr>
           <w:tab/>
         </w:r>
         <w:r>
           <w:rPr>
+            <w:noProof/>
             <w:webHidden/>
-            <w:lang w:val="fr-FR"/>
           </w:rPr>
           <w:fldChar w:fldCharType="begin"/>
         </w:r>
         <w:r>
           <w:rPr>
+            <w:noProof/>
             <w:webHidden/>
-            <w:lang w:val="fr-FR"/>
           </w:rPr>
-          <w:instrText xml:space="preserve"> PAGEREF _Toc174515904 \h </w:instrText>
+          <w:instrText xml:space="preserve"> PAGEREF _Toc175154803 \h </w:instrText>
         </w:r>
         <w:r>
           <w:rPr>
+            <w:noProof/>
             <w:webHidden/>
-            <w:lang w:val="fr-FR"/>
           </w:rPr>
         </w:r>
         <w:r>
           <w:rPr>
+            <w:noProof/>
             <w:webHidden/>
-            <w:lang w:val="fr-FR"/>
           </w:rPr>
           <w:fldChar w:fldCharType="separate"/>
         </w:r>
         <w:r>
           <w:rPr>
+            <w:noProof/>
             <w:webHidden/>
-            <w:lang w:val="fr-FR"/>
           </w:rPr>
           <w:t>6</w:t>
         </w:r>
         <w:r>
           <w:rPr>
+            <w:noProof/>
             <w:webHidden/>
-            <w:lang w:val="fr-FR"/>
           </w:rPr>
           <w:fldChar w:fldCharType="end"/>
         </w:r>
@@ -3614,15 +3704,17 @@
         <w:rPr>
           <w:rFonts w:asciiTheme="minorHAnsi" w:eastAsiaTheme="minorEastAsia" w:hAnsiTheme="minorHAnsi" w:cstheme="minorBidi"/>
           <w:smallCaps w:val="0"/>
+          <w:noProof/>
           <w:sz w:val="22"/>
           <w:szCs w:val="22"/>
           <w:lang w:val="fr-FR"/>
         </w:rPr>
       </w:pPr>
-      <w:hyperlink w:anchor="_Toc174515905" w:history="1">
+      <w:hyperlink w:anchor="_Toc175154804" w:history="1">
         <w:r>
           <w:rPr>
             <w:rStyle w:val="Lienhypertexte"/>
+            <w:noProof/>
             <w:lang w:val="fr-FR"/>
           </w:rPr>
           <w:t>3.1.</w:t>
@@ -3631,6 +3723,7 @@
           <w:rPr>
             <w:rFonts w:asciiTheme="minorHAnsi" w:eastAsiaTheme="minorEastAsia" w:hAnsiTheme="minorHAnsi" w:cstheme="minorBidi"/>
             <w:smallCaps w:val="0"/>
+            <w:noProof/>
             <w:sz w:val="22"/>
             <w:szCs w:val="22"/>
             <w:lang w:val="fr-FR"/>
@@ -3640,55 +3733,56 @@
         <w:r>
           <w:rPr>
             <w:rStyle w:val="Lienhypertexte"/>
+            <w:noProof/>
             <w:lang w:val="fr-FR"/>
           </w:rPr>
           <w:t>Module d’injection</w:t>
         </w:r>
         <w:r>
           <w:rPr>
+            <w:noProof/>
             <w:webHidden/>
-            <w:lang w:val="fr-FR"/>
           </w:rPr>
           <w:tab/>
         </w:r>
         <w:r>
           <w:rPr>
+            <w:noProof/>
             <w:webHidden/>
-            <w:lang w:val="fr-FR"/>
           </w:rPr>
           <w:fldChar w:fldCharType="begin"/>
         </w:r>
         <w:r>
           <w:rPr>
+            <w:noProof/>
             <w:webHidden/>
-            <w:lang w:val="fr-FR"/>
           </w:rPr>
-          <w:instrText xml:space="preserve"> PAGEREF _Toc174515905 \h </w:instrText>
+          <w:instrText xml:space="preserve"> PAGEREF _Toc175154804 \h </w:instrText>
         </w:r>
         <w:r>
           <w:rPr>
+            <w:noProof/>
             <w:webHidden/>
-            <w:lang w:val="fr-FR"/>
           </w:rPr>
         </w:r>
         <w:r>
           <w:rPr>
+            <w:noProof/>
             <w:webHidden/>
-            <w:lang w:val="fr-FR"/>
           </w:rPr>
           <w:fldChar w:fldCharType="separate"/>
         </w:r>
         <w:r>
           <w:rPr>
+            <w:noProof/>
             <w:webHidden/>
-            <w:lang w:val="fr-FR"/>
           </w:rPr>
           <w:t>6</w:t>
         </w:r>
         <w:r>
           <w:rPr>
+            <w:noProof/>
             <w:webHidden/>
-            <w:lang w:val="fr-FR"/>
           </w:rPr>
           <w:fldChar w:fldCharType="end"/>
         </w:r>
@@ -3704,15 +3798,17 @@
         <w:rPr>
           <w:rFonts w:asciiTheme="minorHAnsi" w:eastAsiaTheme="minorEastAsia" w:hAnsiTheme="minorHAnsi" w:cstheme="minorBidi"/>
           <w:smallCaps w:val="0"/>
+          <w:noProof/>
           <w:sz w:val="22"/>
           <w:szCs w:val="22"/>
           <w:lang w:val="fr-FR"/>
         </w:rPr>
       </w:pPr>
-      <w:hyperlink w:anchor="_Toc174515906" w:history="1">
+      <w:hyperlink w:anchor="_Toc175154805" w:history="1">
         <w:r>
           <w:rPr>
             <w:rStyle w:val="Lienhypertexte"/>
+            <w:noProof/>
             <w:lang w:val="fr-FR"/>
           </w:rPr>
           <w:t>3.2.</w:t>
@@ -3721,6 +3817,7 @@
           <w:rPr>
             <w:rFonts w:asciiTheme="minorHAnsi" w:eastAsiaTheme="minorEastAsia" w:hAnsiTheme="minorHAnsi" w:cstheme="minorBidi"/>
             <w:smallCaps w:val="0"/>
+            <w:noProof/>
             <w:sz w:val="22"/>
             <w:szCs w:val="22"/>
             <w:lang w:val="fr-FR"/>
@@ -3730,55 +3827,56 @@
         <w:r>
           <w:rPr>
             <w:rStyle w:val="Lienhypertexte"/>
+            <w:noProof/>
             <w:lang w:val="fr-FR"/>
           </w:rPr>
           <w:t>Configuration des gains</w:t>
         </w:r>
         <w:r>
           <w:rPr>
+            <w:noProof/>
             <w:webHidden/>
-            <w:lang w:val="fr-FR"/>
           </w:rPr>
           <w:tab/>
         </w:r>
         <w:r>
           <w:rPr>
+            <w:noProof/>
             <w:webHidden/>
-            <w:lang w:val="fr-FR"/>
           </w:rPr>
           <w:fldChar w:fldCharType="begin"/>
         </w:r>
         <w:r>
           <w:rPr>
+            <w:noProof/>
             <w:webHidden/>
-            <w:lang w:val="fr-FR"/>
           </w:rPr>
-          <w:instrText xml:space="preserve"> PAGEREF _Toc174515906 \h </w:instrText>
+          <w:instrText xml:space="preserve"> PAGEREF _Toc175154805 \h </w:instrText>
         </w:r>
         <w:r>
           <w:rPr>
+            <w:noProof/>
             <w:webHidden/>
-            <w:lang w:val="fr-FR"/>
           </w:rPr>
         </w:r>
         <w:r>
           <w:rPr>
+            <w:noProof/>
             <w:webHidden/>
-            <w:lang w:val="fr-FR"/>
           </w:rPr>
           <w:fldChar w:fldCharType="separate"/>
         </w:r>
         <w:r>
           <w:rPr>
+            <w:noProof/>
             <w:webHidden/>
-            <w:lang w:val="fr-FR"/>
           </w:rPr>
           <w:t>6</w:t>
         </w:r>
         <w:r>
           <w:rPr>
+            <w:noProof/>
             <w:webHidden/>
-            <w:lang w:val="fr-FR"/>
           </w:rPr>
           <w:fldChar w:fldCharType="end"/>
         </w:r>
@@ -3794,15 +3892,17 @@
         <w:rPr>
           <w:rFonts w:asciiTheme="minorHAnsi" w:eastAsiaTheme="minorEastAsia" w:hAnsiTheme="minorHAnsi" w:cstheme="minorBidi"/>
           <w:smallCaps w:val="0"/>
+          <w:noProof/>
           <w:sz w:val="22"/>
           <w:szCs w:val="22"/>
           <w:lang w:val="fr-FR"/>
         </w:rPr>
       </w:pPr>
-      <w:hyperlink w:anchor="_Toc174515907" w:history="1">
+      <w:hyperlink w:anchor="_Toc175154806" w:history="1">
         <w:r>
           <w:rPr>
             <w:rStyle w:val="Lienhypertexte"/>
+            <w:noProof/>
             <w:lang w:val="fr-FR"/>
           </w:rPr>
           <w:t>3.3.</w:t>
@@ -3811,6 +3911,7 @@
           <w:rPr>
             <w:rFonts w:asciiTheme="minorHAnsi" w:eastAsiaTheme="minorEastAsia" w:hAnsiTheme="minorHAnsi" w:cstheme="minorBidi"/>
             <w:smallCaps w:val="0"/>
+            <w:noProof/>
             <w:sz w:val="22"/>
             <w:szCs w:val="22"/>
             <w:lang w:val="fr-FR"/>
@@ -3820,55 +3921,56 @@
         <w:r>
           <w:rPr>
             <w:rStyle w:val="Lienhypertexte"/>
+            <w:noProof/>
             <w:lang w:val="fr-FR"/>
           </w:rPr>
           <w:t>Configuration des filtres</w:t>
         </w:r>
         <w:r>
           <w:rPr>
+            <w:noProof/>
             <w:webHidden/>
-            <w:lang w:val="fr-FR"/>
           </w:rPr>
           <w:tab/>
         </w:r>
         <w:r>
           <w:rPr>
+            <w:noProof/>
             <w:webHidden/>
-            <w:lang w:val="fr-FR"/>
           </w:rPr>
           <w:fldChar w:fldCharType="begin"/>
         </w:r>
         <w:r>
           <w:rPr>
+            <w:noProof/>
             <w:webHidden/>
-            <w:lang w:val="fr-FR"/>
           </w:rPr>
-          <w:instrText xml:space="preserve"> PAGEREF _Toc174515907 \h </w:instrText>
+          <w:instrText xml:space="preserve"> PAGEREF _Toc175154806 \h </w:instrText>
         </w:r>
         <w:r>
           <w:rPr>
+            <w:noProof/>
             <w:webHidden/>
-            <w:lang w:val="fr-FR"/>
           </w:rPr>
         </w:r>
         <w:r>
           <w:rPr>
+            <w:noProof/>
             <w:webHidden/>
-            <w:lang w:val="fr-FR"/>
           </w:rPr>
           <w:fldChar w:fldCharType="separate"/>
         </w:r>
         <w:r>
           <w:rPr>
+            <w:noProof/>
             <w:webHidden/>
-            <w:lang w:val="fr-FR"/>
           </w:rPr>
           <w:t>6</w:t>
         </w:r>
         <w:r>
           <w:rPr>
+            <w:noProof/>
             <w:webHidden/>
-            <w:lang w:val="fr-FR"/>
           </w:rPr>
           <w:fldChar w:fldCharType="end"/>
         </w:r>
@@ -3885,15 +3987,17 @@
           <w:rFonts w:asciiTheme="minorHAnsi" w:eastAsiaTheme="minorEastAsia" w:hAnsiTheme="minorHAnsi" w:cstheme="minorBidi"/>
           <w:b w:val="0"/>
           <w:caps w:val="0"/>
+          <w:noProof/>
           <w:sz w:val="22"/>
           <w:szCs w:val="22"/>
           <w:lang w:val="fr-FR"/>
         </w:rPr>
       </w:pPr>
-      <w:hyperlink w:anchor="_Toc174515908" w:history="1">
+      <w:hyperlink w:anchor="_Toc175154807" w:history="1">
         <w:r>
           <w:rPr>
             <w:rStyle w:val="Lienhypertexte"/>
+            <w:noProof/>
             <w:lang w:val="fr-FR"/>
           </w:rPr>
           <w:t>4.</w:t>
@@ -3903,6 +4007,7 @@
             <w:rFonts w:asciiTheme="minorHAnsi" w:eastAsiaTheme="minorEastAsia" w:hAnsiTheme="minorHAnsi" w:cstheme="minorBidi"/>
             <w:b w:val="0"/>
             <w:caps w:val="0"/>
+            <w:noProof/>
             <w:sz w:val="22"/>
             <w:szCs w:val="22"/>
             <w:lang w:val="fr-FR"/>
@@ -3912,55 +4017,56 @@
         <w:r>
           <w:rPr>
             <w:rStyle w:val="Lienhypertexte"/>
+            <w:noProof/>
             <w:lang w:val="fr-FR"/>
           </w:rPr>
           <w:t>Les fonctions de transfer</w:t>
         </w:r>
         <w:r>
           <w:rPr>
+            <w:noProof/>
             <w:webHidden/>
-            <w:lang w:val="fr-FR"/>
           </w:rPr>
           <w:tab/>
         </w:r>
         <w:r>
           <w:rPr>
+            <w:noProof/>
             <w:webHidden/>
-            <w:lang w:val="fr-FR"/>
           </w:rPr>
           <w:fldChar w:fldCharType="begin"/>
         </w:r>
         <w:r>
           <w:rPr>
+            <w:noProof/>
             <w:webHidden/>
-            <w:lang w:val="fr-FR"/>
           </w:rPr>
-          <w:instrText xml:space="preserve"> PAGEREF _Toc174515908 \h </w:instrText>
+          <w:instrText xml:space="preserve"> PAGEREF _Toc175154807 \h </w:instrText>
         </w:r>
         <w:r>
           <w:rPr>
+            <w:noProof/>
             <w:webHidden/>
-            <w:lang w:val="fr-FR"/>
           </w:rPr>
         </w:r>
         <w:r>
           <w:rPr>
+            <w:noProof/>
             <w:webHidden/>
-            <w:lang w:val="fr-FR"/>
           </w:rPr>
           <w:fldChar w:fldCharType="separate"/>
         </w:r>
         <w:r>
           <w:rPr>
+            <w:noProof/>
             <w:webHidden/>
-            <w:lang w:val="fr-FR"/>
           </w:rPr>
           <w:t>7</w:t>
         </w:r>
         <w:r>
           <w:rPr>
+            <w:noProof/>
             <w:webHidden/>
-            <w:lang w:val="fr-FR"/>
           </w:rPr>
           <w:fldChar w:fldCharType="end"/>
         </w:r>
@@ -3976,15 +4082,17 @@
         <w:rPr>
           <w:rFonts w:asciiTheme="minorHAnsi" w:eastAsiaTheme="minorEastAsia" w:hAnsiTheme="minorHAnsi" w:cstheme="minorBidi"/>
           <w:smallCaps w:val="0"/>
+          <w:noProof/>
           <w:sz w:val="22"/>
           <w:szCs w:val="22"/>
           <w:lang w:val="fr-FR"/>
         </w:rPr>
       </w:pPr>
-      <w:hyperlink w:anchor="_Toc174515909" w:history="1">
+      <w:hyperlink w:anchor="_Toc175154808" w:history="1">
         <w:r>
           <w:rPr>
             <w:rStyle w:val="Lienhypertexte"/>
+            <w:noProof/>
             <w:lang w:val="fr-FR"/>
           </w:rPr>
           <w:t>4.1.</w:t>
@@ -3993,6 +4101,7 @@
           <w:rPr>
             <w:rFonts w:asciiTheme="minorHAnsi" w:eastAsiaTheme="minorEastAsia" w:hAnsiTheme="minorHAnsi" w:cstheme="minorBidi"/>
             <w:smallCaps w:val="0"/>
+            <w:noProof/>
             <w:sz w:val="22"/>
             <w:szCs w:val="22"/>
             <w:lang w:val="fr-FR"/>
@@ -4002,55 +4111,56 @@
         <w:r>
           <w:rPr>
             <w:rStyle w:val="Lienhypertexte"/>
+            <w:noProof/>
             <w:lang w:val="fr-FR"/>
           </w:rPr>
-          <w:t>Fonction de transfert de la lecture du CAN</w:t>
+          <w:t>“Shaper” analogique et CAN</w:t>
         </w:r>
         <w:r>
           <w:rPr>
+            <w:noProof/>
             <w:webHidden/>
-            <w:lang w:val="fr-FR"/>
           </w:rPr>
           <w:tab/>
         </w:r>
         <w:r>
           <w:rPr>
+            <w:noProof/>
             <w:webHidden/>
-            <w:lang w:val="fr-FR"/>
           </w:rPr>
           <w:fldChar w:fldCharType="begin"/>
         </w:r>
         <w:r>
           <w:rPr>
+            <w:noProof/>
             <w:webHidden/>
-            <w:lang w:val="fr-FR"/>
           </w:rPr>
-          <w:instrText xml:space="preserve"> PAGEREF _Toc174515909 \h </w:instrText>
+          <w:instrText xml:space="preserve"> PAGEREF _Toc175154808 \h </w:instrText>
         </w:r>
         <w:r>
           <w:rPr>
+            <w:noProof/>
             <w:webHidden/>
-            <w:lang w:val="fr-FR"/>
           </w:rPr>
         </w:r>
         <w:r>
           <w:rPr>
+            <w:noProof/>
             <w:webHidden/>
-            <w:lang w:val="fr-FR"/>
           </w:rPr>
           <w:fldChar w:fldCharType="separate"/>
         </w:r>
         <w:r>
           <w:rPr>
+            <w:noProof/>
             <w:webHidden/>
-            <w:lang w:val="fr-FR"/>
           </w:rPr>
           <w:t>7</w:t>
         </w:r>
         <w:r>
           <w:rPr>
+            <w:noProof/>
             <w:webHidden/>
-            <w:lang w:val="fr-FR"/>
           </w:rPr>
           <w:fldChar w:fldCharType="end"/>
         </w:r>
@@ -4066,15 +4176,17 @@
         <w:rPr>
           <w:rFonts w:asciiTheme="minorHAnsi" w:eastAsiaTheme="minorEastAsia" w:hAnsiTheme="minorHAnsi" w:cstheme="minorBidi"/>
           <w:smallCaps w:val="0"/>
+          <w:noProof/>
           <w:sz w:val="22"/>
           <w:szCs w:val="22"/>
           <w:lang w:val="fr-FR"/>
         </w:rPr>
       </w:pPr>
-      <w:hyperlink w:anchor="_Toc174515910" w:history="1">
+      <w:hyperlink w:anchor="_Toc175154809" w:history="1">
         <w:r>
           <w:rPr>
             <w:rStyle w:val="Lienhypertexte"/>
+            <w:noProof/>
             <w:lang w:val="fr-FR"/>
           </w:rPr>
           <w:t>4.2.</w:t>
@@ -4083,6 +4195,7 @@
           <w:rPr>
             <w:rFonts w:asciiTheme="minorHAnsi" w:eastAsiaTheme="minorEastAsia" w:hAnsiTheme="minorHAnsi" w:cstheme="minorBidi"/>
             <w:smallCaps w:val="0"/>
+            <w:noProof/>
             <w:sz w:val="22"/>
             <w:szCs w:val="22"/>
             <w:lang w:val="fr-FR"/>
@@ -4092,55 +4205,56 @@
         <w:r>
           <w:rPr>
             <w:rStyle w:val="Lienhypertexte"/>
+            <w:noProof/>
             <w:lang w:val="fr-FR"/>
           </w:rPr>
-          <w:t>Fonction de transfert du filtre à réponse impulsionnelle finie</w:t>
+          <w:t>Fonction de transfert de la lecture du CAN</w:t>
         </w:r>
         <w:r>
           <w:rPr>
+            <w:noProof/>
             <w:webHidden/>
-            <w:lang w:val="fr-FR"/>
           </w:rPr>
           <w:tab/>
         </w:r>
         <w:r>
           <w:rPr>
+            <w:noProof/>
             <w:webHidden/>
-            <w:lang w:val="fr-FR"/>
           </w:rPr>
           <w:fldChar w:fldCharType="begin"/>
         </w:r>
         <w:r>
           <w:rPr>
+            <w:noProof/>
             <w:webHidden/>
-            <w:lang w:val="fr-FR"/>
           </w:rPr>
-          <w:instrText xml:space="preserve"> PAGEREF _Toc174515910 \h </w:instrText>
+          <w:instrText xml:space="preserve"> PAGEREF _Toc175154809 \h </w:instrText>
         </w:r>
         <w:r>
           <w:rPr>
+            <w:noProof/>
             <w:webHidden/>
-            <w:lang w:val="fr-FR"/>
           </w:rPr>
         </w:r>
         <w:r>
           <w:rPr>
+            <w:noProof/>
             <w:webHidden/>
-            <w:lang w:val="fr-FR"/>
           </w:rPr>
           <w:fldChar w:fldCharType="separate"/>
         </w:r>
         <w:r>
           <w:rPr>
+            <w:noProof/>
             <w:webHidden/>
-            <w:lang w:val="fr-FR"/>
           </w:rPr>
           <w:t>7</w:t>
         </w:r>
         <w:r>
           <w:rPr>
+            <w:noProof/>
             <w:webHidden/>
-            <w:lang w:val="fr-FR"/>
           </w:rPr>
           <w:fldChar w:fldCharType="end"/>
         </w:r>
@@ -4156,15 +4270,17 @@
         <w:rPr>
           <w:rFonts w:asciiTheme="minorHAnsi" w:eastAsiaTheme="minorEastAsia" w:hAnsiTheme="minorHAnsi" w:cstheme="minorBidi"/>
           <w:smallCaps w:val="0"/>
+          <w:noProof/>
           <w:sz w:val="22"/>
           <w:szCs w:val="22"/>
           <w:lang w:val="fr-FR"/>
         </w:rPr>
       </w:pPr>
-      <w:hyperlink w:anchor="_Toc174515911" w:history="1">
+      <w:hyperlink w:anchor="_Toc175154810" w:history="1">
         <w:r>
           <w:rPr>
             <w:rStyle w:val="Lienhypertexte"/>
+            <w:noProof/>
             <w:lang w:val="fr-FR"/>
           </w:rPr>
           <w:t>4.3.</w:t>
@@ -4173,6 +4289,7 @@
           <w:rPr>
             <w:rFonts w:asciiTheme="minorHAnsi" w:eastAsiaTheme="minorEastAsia" w:hAnsiTheme="minorHAnsi" w:cstheme="minorBidi"/>
             <w:smallCaps w:val="0"/>
+            <w:noProof/>
             <w:sz w:val="22"/>
             <w:szCs w:val="22"/>
             <w:lang w:val="fr-FR"/>
@@ -4182,55 +4299,810 @@
         <w:r>
           <w:rPr>
             <w:rStyle w:val="Lienhypertexte"/>
+            <w:noProof/>
             <w:lang w:val="fr-FR"/>
           </w:rPr>
-          <w:t>Fonction de transfert entrée “shaper -&gt; spectre”</w:t>
+          <w:t>Fonction de transfert du filtre à réponse impulsionnelle finie</w:t>
         </w:r>
         <w:r>
           <w:rPr>
+            <w:noProof/>
             <w:webHidden/>
+          </w:rPr>
+          <w:tab/>
+        </w:r>
+        <w:r>
+          <w:rPr>
+            <w:noProof/>
+            <w:webHidden/>
+          </w:rPr>
+          <w:fldChar w:fldCharType="begin"/>
+        </w:r>
+        <w:r>
+          <w:rPr>
+            <w:noProof/>
+            <w:webHidden/>
+          </w:rPr>
+          <w:instrText xml:space="preserve"> PAGEREF _Toc175154810 \h </w:instrText>
+        </w:r>
+        <w:r>
+          <w:rPr>
+            <w:noProof/>
+            <w:webHidden/>
+          </w:rPr>
+        </w:r>
+        <w:r>
+          <w:rPr>
+            <w:noProof/>
+            <w:webHidden/>
+          </w:rPr>
+          <w:fldChar w:fldCharType="separate"/>
+        </w:r>
+        <w:r>
+          <w:rPr>
+            <w:noProof/>
+            <w:webHidden/>
+          </w:rPr>
+          <w:t>8</w:t>
+        </w:r>
+        <w:r>
+          <w:rPr>
+            <w:noProof/>
+            <w:webHidden/>
+          </w:rPr>
+          <w:fldChar w:fldCharType="end"/>
+        </w:r>
+      </w:hyperlink>
+    </w:p>
+    <w:p>
+      <w:pPr>
+        <w:pStyle w:val="TM3"/>
+        <w:tabs>
+          <w:tab w:val="left" w:pos="1200"/>
+          <w:tab w:val="right" w:leader="dot" w:pos="9622"/>
+        </w:tabs>
+        <w:rPr>
+          <w:rFonts w:asciiTheme="minorHAnsi" w:eastAsiaTheme="minorEastAsia" w:hAnsiTheme="minorHAnsi" w:cstheme="minorBidi"/>
+          <w:i w:val="0"/>
+          <w:noProof/>
+          <w:sz w:val="22"/>
+          <w:szCs w:val="22"/>
+          <w:lang w:val="fr-FR"/>
+        </w:rPr>
+      </w:pPr>
+      <w:hyperlink w:anchor="_Toc175154811" w:history="1">
+        <w:r>
+          <w:rPr>
+            <w:rStyle w:val="Lienhypertexte"/>
+            <w:noProof/>
+            <w:lang w:val="fr-FR"/>
+          </w:rPr>
+          <w:t>4.3.1.</w:t>
+        </w:r>
+        <w:r>
+          <w:rPr>
+            <w:rFonts w:asciiTheme="minorHAnsi" w:eastAsiaTheme="minorEastAsia" w:hAnsiTheme="minorHAnsi" w:cstheme="minorBidi"/>
+            <w:i w:val="0"/>
+            <w:noProof/>
+            <w:sz w:val="22"/>
+            <w:szCs w:val="22"/>
             <w:lang w:val="fr-FR"/>
           </w:rPr>
           <w:tab/>
         </w:r>
         <w:r>
           <w:rPr>
+            <w:rStyle w:val="Lienhypertexte"/>
+            <w:noProof/>
+            <w:lang w:val="fr-FR"/>
+          </w:rPr>
+          <w:t>Mesure</w:t>
+        </w:r>
+        <w:r>
+          <w:rPr>
+            <w:noProof/>
             <w:webHidden/>
-            <w:lang w:val="fr-FR"/>
+          </w:rPr>
+          <w:tab/>
+        </w:r>
+        <w:r>
+          <w:rPr>
+            <w:noProof/>
+            <w:webHidden/>
           </w:rPr>
           <w:fldChar w:fldCharType="begin"/>
         </w:r>
         <w:r>
           <w:rPr>
+            <w:noProof/>
             <w:webHidden/>
-            <w:lang w:val="fr-FR"/>
           </w:rPr>
-          <w:instrText xml:space="preserve"> PAGEREF _Toc174515911 \h </w:instrText>
+          <w:instrText xml:space="preserve"> PAGEREF _Toc175154811 \h </w:instrText>
         </w:r>
         <w:r>
           <w:rPr>
+            <w:noProof/>
             <w:webHidden/>
-            <w:lang w:val="fr-FR"/>
           </w:rPr>
         </w:r>
         <w:r>
           <w:rPr>
+            <w:noProof/>
             <w:webHidden/>
-            <w:lang w:val="fr-FR"/>
           </w:rPr>
           <w:fldChar w:fldCharType="separate"/>
         </w:r>
         <w:r>
           <w:rPr>
+            <w:noProof/>
             <w:webHidden/>
-            <w:lang w:val="fr-FR"/>
           </w:rPr>
-          <w:t>7</w:t>
+          <w:t>8</w:t>
         </w:r>
         <w:r>
           <w:rPr>
+            <w:noProof/>
             <w:webHidden/>
+          </w:rPr>
+          <w:fldChar w:fldCharType="end"/>
+        </w:r>
+      </w:hyperlink>
+    </w:p>
+    <w:p>
+      <w:pPr>
+        <w:pStyle w:val="TM2"/>
+        <w:tabs>
+          <w:tab w:val="left" w:pos="960"/>
+          <w:tab w:val="right" w:leader="dot" w:pos="9622"/>
+        </w:tabs>
+        <w:rPr>
+          <w:rFonts w:asciiTheme="minorHAnsi" w:eastAsiaTheme="minorEastAsia" w:hAnsiTheme="minorHAnsi" w:cstheme="minorBidi"/>
+          <w:smallCaps w:val="0"/>
+          <w:noProof/>
+          <w:sz w:val="22"/>
+          <w:szCs w:val="22"/>
+          <w:lang w:val="fr-FR"/>
+        </w:rPr>
+      </w:pPr>
+      <w:hyperlink w:anchor="_Toc175154812" w:history="1">
+        <w:r>
+          <w:rPr>
+            <w:rStyle w:val="Lienhypertexte"/>
+            <w:noProof/>
             <w:lang w:val="fr-FR"/>
+          </w:rPr>
+          <w:t>4.4.</w:t>
+        </w:r>
+        <w:r>
+          <w:rPr>
+            <w:rFonts w:asciiTheme="minorHAnsi" w:eastAsiaTheme="minorEastAsia" w:hAnsiTheme="minorHAnsi" w:cstheme="minorBidi"/>
+            <w:smallCaps w:val="0"/>
+            <w:noProof/>
+            <w:sz w:val="22"/>
+            <w:szCs w:val="22"/>
+            <w:lang w:val="fr-FR"/>
+          </w:rPr>
+          <w:tab/>
+        </w:r>
+        <w:r>
+          <w:rPr>
+            <w:rStyle w:val="Lienhypertexte"/>
+            <w:noProof/>
+            <w:lang w:val="fr-FR"/>
+          </w:rPr>
+          <w:t>Fonction de transfert “shaper” analogique -&gt; spectre numérique</w:t>
+        </w:r>
+        <w:r>
+          <w:rPr>
+            <w:noProof/>
+            <w:webHidden/>
+          </w:rPr>
+          <w:tab/>
+        </w:r>
+        <w:r>
+          <w:rPr>
+            <w:noProof/>
+            <w:webHidden/>
+          </w:rPr>
+          <w:fldChar w:fldCharType="begin"/>
+        </w:r>
+        <w:r>
+          <w:rPr>
+            <w:noProof/>
+            <w:webHidden/>
+          </w:rPr>
+          <w:instrText xml:space="preserve"> PAGEREF _Toc175154812 \h </w:instrText>
+        </w:r>
+        <w:r>
+          <w:rPr>
+            <w:noProof/>
+            <w:webHidden/>
+          </w:rPr>
+        </w:r>
+        <w:r>
+          <w:rPr>
+            <w:noProof/>
+            <w:webHidden/>
+          </w:rPr>
+          <w:fldChar w:fldCharType="separate"/>
+        </w:r>
+        <w:r>
+          <w:rPr>
+            <w:noProof/>
+            <w:webHidden/>
+          </w:rPr>
+          <w:t>9</w:t>
+        </w:r>
+        <w:r>
+          <w:rPr>
+            <w:noProof/>
+            <w:webHidden/>
+          </w:rPr>
+          <w:fldChar w:fldCharType="end"/>
+        </w:r>
+      </w:hyperlink>
+    </w:p>
+    <w:p>
+      <w:pPr>
+        <w:pStyle w:val="TM1"/>
+        <w:tabs>
+          <w:tab w:val="left" w:pos="480"/>
+          <w:tab w:val="right" w:leader="dot" w:pos="9622"/>
+        </w:tabs>
+        <w:rPr>
+          <w:rFonts w:asciiTheme="minorHAnsi" w:eastAsiaTheme="minorEastAsia" w:hAnsiTheme="minorHAnsi" w:cstheme="minorBidi"/>
+          <w:b w:val="0"/>
+          <w:caps w:val="0"/>
+          <w:noProof/>
+          <w:sz w:val="22"/>
+          <w:szCs w:val="22"/>
+          <w:lang w:val="fr-FR"/>
+        </w:rPr>
+      </w:pPr>
+      <w:hyperlink w:anchor="_Toc175154813" w:history="1">
+        <w:r>
+          <w:rPr>
+            <w:rStyle w:val="Lienhypertexte"/>
+            <w:noProof/>
+            <w:lang w:val="fr-FR"/>
+          </w:rPr>
+          <w:t>5.</w:t>
+        </w:r>
+        <w:r>
+          <w:rPr>
+            <w:rFonts w:asciiTheme="minorHAnsi" w:eastAsiaTheme="minorEastAsia" w:hAnsiTheme="minorHAnsi" w:cstheme="minorBidi"/>
+            <w:b w:val="0"/>
+            <w:caps w:val="0"/>
+            <w:noProof/>
+            <w:sz w:val="22"/>
+            <w:szCs w:val="22"/>
+            <w:lang w:val="fr-FR"/>
+          </w:rPr>
+          <w:tab/>
+        </w:r>
+        <w:r>
+          <w:rPr>
+            <w:rStyle w:val="Lienhypertexte"/>
+            <w:noProof/>
+            <w:lang w:val="fr-FR"/>
+          </w:rPr>
+          <w:t>Simulation filtre RIF et résultat du pique du spectre</w:t>
+        </w:r>
+        <w:r>
+          <w:rPr>
+            <w:noProof/>
+            <w:webHidden/>
+          </w:rPr>
+          <w:tab/>
+        </w:r>
+        <w:r>
+          <w:rPr>
+            <w:noProof/>
+            <w:webHidden/>
+          </w:rPr>
+          <w:fldChar w:fldCharType="begin"/>
+        </w:r>
+        <w:r>
+          <w:rPr>
+            <w:noProof/>
+            <w:webHidden/>
+          </w:rPr>
+          <w:instrText xml:space="preserve"> PAGEREF _Toc175154813 \h </w:instrText>
+        </w:r>
+        <w:r>
+          <w:rPr>
+            <w:noProof/>
+            <w:webHidden/>
+          </w:rPr>
+        </w:r>
+        <w:r>
+          <w:rPr>
+            <w:noProof/>
+            <w:webHidden/>
+          </w:rPr>
+          <w:fldChar w:fldCharType="separate"/>
+        </w:r>
+        <w:r>
+          <w:rPr>
+            <w:noProof/>
+            <w:webHidden/>
+          </w:rPr>
+          <w:t>10</w:t>
+        </w:r>
+        <w:r>
+          <w:rPr>
+            <w:noProof/>
+            <w:webHidden/>
+          </w:rPr>
+          <w:fldChar w:fldCharType="end"/>
+        </w:r>
+      </w:hyperlink>
+    </w:p>
+    <w:p>
+      <w:pPr>
+        <w:pStyle w:val="TM2"/>
+        <w:tabs>
+          <w:tab w:val="left" w:pos="960"/>
+          <w:tab w:val="right" w:leader="dot" w:pos="9622"/>
+        </w:tabs>
+        <w:rPr>
+          <w:rFonts w:asciiTheme="minorHAnsi" w:eastAsiaTheme="minorEastAsia" w:hAnsiTheme="minorHAnsi" w:cstheme="minorBidi"/>
+          <w:smallCaps w:val="0"/>
+          <w:noProof/>
+          <w:sz w:val="22"/>
+          <w:szCs w:val="22"/>
+          <w:lang w:val="fr-FR"/>
+        </w:rPr>
+      </w:pPr>
+      <w:hyperlink w:anchor="_Toc175154814" w:history="1">
+        <w:r>
+          <w:rPr>
+            <w:rStyle w:val="Lienhypertexte"/>
+            <w:noProof/>
+            <w:lang w:val="fr-FR"/>
+          </w:rPr>
+          <w:t>5.1.</w:t>
+        </w:r>
+        <w:r>
+          <w:rPr>
+            <w:rFonts w:asciiTheme="minorHAnsi" w:eastAsiaTheme="minorEastAsia" w:hAnsiTheme="minorHAnsi" w:cstheme="minorBidi"/>
+            <w:smallCaps w:val="0"/>
+            <w:noProof/>
+            <w:sz w:val="22"/>
+            <w:szCs w:val="22"/>
+            <w:lang w:val="fr-FR"/>
+          </w:rPr>
+          <w:tab/>
+        </w:r>
+        <w:r>
+          <w:rPr>
+            <w:rStyle w:val="Lienhypertexte"/>
+            <w:noProof/>
+            <w:lang w:val="fr-FR"/>
+          </w:rPr>
+          <w:t>Simulation avec une tension entrée “shaper” 950 mV</w:t>
+        </w:r>
+        <w:r>
+          <w:rPr>
+            <w:noProof/>
+            <w:webHidden/>
+          </w:rPr>
+          <w:tab/>
+        </w:r>
+        <w:r>
+          <w:rPr>
+            <w:noProof/>
+            <w:webHidden/>
+          </w:rPr>
+          <w:fldChar w:fldCharType="begin"/>
+        </w:r>
+        <w:r>
+          <w:rPr>
+            <w:noProof/>
+            <w:webHidden/>
+          </w:rPr>
+          <w:instrText xml:space="preserve"> PAGEREF _Toc175154814 \h </w:instrText>
+        </w:r>
+        <w:r>
+          <w:rPr>
+            <w:noProof/>
+            <w:webHidden/>
+          </w:rPr>
+        </w:r>
+        <w:r>
+          <w:rPr>
+            <w:noProof/>
+            <w:webHidden/>
+          </w:rPr>
+          <w:fldChar w:fldCharType="separate"/>
+        </w:r>
+        <w:r>
+          <w:rPr>
+            <w:noProof/>
+            <w:webHidden/>
+          </w:rPr>
+          <w:t>10</w:t>
+        </w:r>
+        <w:r>
+          <w:rPr>
+            <w:noProof/>
+            <w:webHidden/>
+          </w:rPr>
+          <w:fldChar w:fldCharType="end"/>
+        </w:r>
+      </w:hyperlink>
+    </w:p>
+    <w:p>
+      <w:pPr>
+        <w:pStyle w:val="TM2"/>
+        <w:tabs>
+          <w:tab w:val="left" w:pos="960"/>
+          <w:tab w:val="right" w:leader="dot" w:pos="9622"/>
+        </w:tabs>
+        <w:rPr>
+          <w:rFonts w:asciiTheme="minorHAnsi" w:eastAsiaTheme="minorEastAsia" w:hAnsiTheme="minorHAnsi" w:cstheme="minorBidi"/>
+          <w:smallCaps w:val="0"/>
+          <w:noProof/>
+          <w:sz w:val="22"/>
+          <w:szCs w:val="22"/>
+          <w:lang w:val="fr-FR"/>
+        </w:rPr>
+      </w:pPr>
+      <w:hyperlink w:anchor="_Toc175154815" w:history="1">
+        <w:r>
+          <w:rPr>
+            <w:rStyle w:val="Lienhypertexte"/>
+            <w:noProof/>
+            <w:lang w:val="fr-FR"/>
+          </w:rPr>
+          <w:t>5.1.</w:t>
+        </w:r>
+        <w:r>
+          <w:rPr>
+            <w:rFonts w:asciiTheme="minorHAnsi" w:eastAsiaTheme="minorEastAsia" w:hAnsiTheme="minorHAnsi" w:cstheme="minorBidi"/>
+            <w:smallCaps w:val="0"/>
+            <w:noProof/>
+            <w:sz w:val="22"/>
+            <w:szCs w:val="22"/>
+            <w:lang w:val="fr-FR"/>
+          </w:rPr>
+          <w:tab/>
+        </w:r>
+        <w:r>
+          <w:rPr>
+            <w:rStyle w:val="Lienhypertexte"/>
+            <w:noProof/>
+            <w:lang w:val="fr-FR"/>
+          </w:rPr>
+          <w:t>Simulation avec une tension entrée “shaper” 850 mV</w:t>
+        </w:r>
+        <w:r>
+          <w:rPr>
+            <w:noProof/>
+            <w:webHidden/>
+          </w:rPr>
+          <w:tab/>
+        </w:r>
+        <w:r>
+          <w:rPr>
+            <w:noProof/>
+            <w:webHidden/>
+          </w:rPr>
+          <w:fldChar w:fldCharType="begin"/>
+        </w:r>
+        <w:r>
+          <w:rPr>
+            <w:noProof/>
+            <w:webHidden/>
+          </w:rPr>
+          <w:instrText xml:space="preserve"> PAGEREF _Toc175154815 \h </w:instrText>
+        </w:r>
+        <w:r>
+          <w:rPr>
+            <w:noProof/>
+            <w:webHidden/>
+          </w:rPr>
+        </w:r>
+        <w:r>
+          <w:rPr>
+            <w:noProof/>
+            <w:webHidden/>
+          </w:rPr>
+          <w:fldChar w:fldCharType="separate"/>
+        </w:r>
+        <w:r>
+          <w:rPr>
+            <w:noProof/>
+            <w:webHidden/>
+          </w:rPr>
+          <w:t>10</w:t>
+        </w:r>
+        <w:r>
+          <w:rPr>
+            <w:noProof/>
+            <w:webHidden/>
+          </w:rPr>
+          <w:fldChar w:fldCharType="end"/>
+        </w:r>
+      </w:hyperlink>
+    </w:p>
+    <w:p>
+      <w:pPr>
+        <w:pStyle w:val="TM2"/>
+        <w:tabs>
+          <w:tab w:val="left" w:pos="960"/>
+          <w:tab w:val="right" w:leader="dot" w:pos="9622"/>
+        </w:tabs>
+        <w:rPr>
+          <w:rFonts w:asciiTheme="minorHAnsi" w:eastAsiaTheme="minorEastAsia" w:hAnsiTheme="minorHAnsi" w:cstheme="minorBidi"/>
+          <w:smallCaps w:val="0"/>
+          <w:noProof/>
+          <w:sz w:val="22"/>
+          <w:szCs w:val="22"/>
+          <w:lang w:val="fr-FR"/>
+        </w:rPr>
+      </w:pPr>
+      <w:hyperlink w:anchor="_Toc175154816" w:history="1">
+        <w:r>
+          <w:rPr>
+            <w:rStyle w:val="Lienhypertexte"/>
+            <w:noProof/>
+            <w:lang w:val="fr-FR"/>
+          </w:rPr>
+          <w:t>5.1.</w:t>
+        </w:r>
+        <w:r>
+          <w:rPr>
+            <w:rFonts w:asciiTheme="minorHAnsi" w:eastAsiaTheme="minorEastAsia" w:hAnsiTheme="minorHAnsi" w:cstheme="minorBidi"/>
+            <w:smallCaps w:val="0"/>
+            <w:noProof/>
+            <w:sz w:val="22"/>
+            <w:szCs w:val="22"/>
+            <w:lang w:val="fr-FR"/>
+          </w:rPr>
+          <w:tab/>
+        </w:r>
+        <w:r>
+          <w:rPr>
+            <w:rStyle w:val="Lienhypertexte"/>
+            <w:noProof/>
+            <w:lang w:val="fr-FR"/>
+          </w:rPr>
+          <w:t>Simulation avec une tension entrée “shaper” 430 mV</w:t>
+        </w:r>
+        <w:r>
+          <w:rPr>
+            <w:noProof/>
+            <w:webHidden/>
+          </w:rPr>
+          <w:tab/>
+        </w:r>
+        <w:r>
+          <w:rPr>
+            <w:noProof/>
+            <w:webHidden/>
+          </w:rPr>
+          <w:fldChar w:fldCharType="begin"/>
+        </w:r>
+        <w:r>
+          <w:rPr>
+            <w:noProof/>
+            <w:webHidden/>
+          </w:rPr>
+          <w:instrText xml:space="preserve"> PAGEREF _Toc175154816 \h </w:instrText>
+        </w:r>
+        <w:r>
+          <w:rPr>
+            <w:noProof/>
+            <w:webHidden/>
+          </w:rPr>
+        </w:r>
+        <w:r>
+          <w:rPr>
+            <w:noProof/>
+            <w:webHidden/>
+          </w:rPr>
+          <w:fldChar w:fldCharType="separate"/>
+        </w:r>
+        <w:r>
+          <w:rPr>
+            <w:noProof/>
+            <w:webHidden/>
+          </w:rPr>
+          <w:t>11</w:t>
+        </w:r>
+        <w:r>
+          <w:rPr>
+            <w:noProof/>
+            <w:webHidden/>
+          </w:rPr>
+          <w:fldChar w:fldCharType="end"/>
+        </w:r>
+      </w:hyperlink>
+    </w:p>
+    <w:p>
+      <w:pPr>
+        <w:pStyle w:val="TM2"/>
+        <w:tabs>
+          <w:tab w:val="left" w:pos="960"/>
+          <w:tab w:val="right" w:leader="dot" w:pos="9622"/>
+        </w:tabs>
+        <w:rPr>
+          <w:rFonts w:asciiTheme="minorHAnsi" w:eastAsiaTheme="minorEastAsia" w:hAnsiTheme="minorHAnsi" w:cstheme="minorBidi"/>
+          <w:smallCaps w:val="0"/>
+          <w:noProof/>
+          <w:sz w:val="22"/>
+          <w:szCs w:val="22"/>
+          <w:lang w:val="fr-FR"/>
+        </w:rPr>
+      </w:pPr>
+      <w:hyperlink w:anchor="_Toc175154817" w:history="1">
+        <w:r>
+          <w:rPr>
+            <w:rStyle w:val="Lienhypertexte"/>
+            <w:noProof/>
+            <w:lang w:val="fr-FR"/>
+          </w:rPr>
+          <w:t>5.2.</w:t>
+        </w:r>
+        <w:r>
+          <w:rPr>
+            <w:rFonts w:asciiTheme="minorHAnsi" w:eastAsiaTheme="minorEastAsia" w:hAnsiTheme="minorHAnsi" w:cstheme="minorBidi"/>
+            <w:smallCaps w:val="0"/>
+            <w:noProof/>
+            <w:sz w:val="22"/>
+            <w:szCs w:val="22"/>
+            <w:lang w:val="fr-FR"/>
+          </w:rPr>
+          <w:tab/>
+        </w:r>
+        <w:r>
+          <w:rPr>
+            <w:rStyle w:val="Lienhypertexte"/>
+            <w:noProof/>
+            <w:lang w:val="fr-FR"/>
+          </w:rPr>
+          <w:t>Simulation avec une tension entrée “shaper” 350 mV</w:t>
+        </w:r>
+        <w:r>
+          <w:rPr>
+            <w:noProof/>
+            <w:webHidden/>
+          </w:rPr>
+          <w:tab/>
+        </w:r>
+        <w:r>
+          <w:rPr>
+            <w:noProof/>
+            <w:webHidden/>
+          </w:rPr>
+          <w:fldChar w:fldCharType="begin"/>
+        </w:r>
+        <w:r>
+          <w:rPr>
+            <w:noProof/>
+            <w:webHidden/>
+          </w:rPr>
+          <w:instrText xml:space="preserve"> PAGEREF _Toc175154817 \h </w:instrText>
+        </w:r>
+        <w:r>
+          <w:rPr>
+            <w:noProof/>
+            <w:webHidden/>
+          </w:rPr>
+        </w:r>
+        <w:r>
+          <w:rPr>
+            <w:noProof/>
+            <w:webHidden/>
+          </w:rPr>
+          <w:fldChar w:fldCharType="separate"/>
+        </w:r>
+        <w:r>
+          <w:rPr>
+            <w:noProof/>
+            <w:webHidden/>
+          </w:rPr>
+          <w:t>11</w:t>
+        </w:r>
+        <w:r>
+          <w:rPr>
+            <w:noProof/>
+            <w:webHidden/>
+          </w:rPr>
+          <w:fldChar w:fldCharType="end"/>
+        </w:r>
+      </w:hyperlink>
+    </w:p>
+    <w:p>
+      <w:pPr>
+        <w:pStyle w:val="TM2"/>
+        <w:tabs>
+          <w:tab w:val="left" w:pos="960"/>
+          <w:tab w:val="right" w:leader="dot" w:pos="9622"/>
+        </w:tabs>
+        <w:rPr>
+          <w:rFonts w:asciiTheme="minorHAnsi" w:eastAsiaTheme="minorEastAsia" w:hAnsiTheme="minorHAnsi" w:cstheme="minorBidi"/>
+          <w:smallCaps w:val="0"/>
+          <w:noProof/>
+          <w:sz w:val="22"/>
+          <w:szCs w:val="22"/>
+          <w:lang w:val="fr-FR"/>
+        </w:rPr>
+      </w:pPr>
+      <w:hyperlink w:anchor="_Toc175154818" w:history="1">
+        <w:r>
+          <w:rPr>
+            <w:rStyle w:val="Lienhypertexte"/>
+            <w:noProof/>
+            <w:lang w:val="fr-FR"/>
+          </w:rPr>
+          <w:t>5.1.</w:t>
+        </w:r>
+        <w:r>
+          <w:rPr>
+            <w:rFonts w:asciiTheme="minorHAnsi" w:eastAsiaTheme="minorEastAsia" w:hAnsiTheme="minorHAnsi" w:cstheme="minorBidi"/>
+            <w:smallCaps w:val="0"/>
+            <w:noProof/>
+            <w:sz w:val="22"/>
+            <w:szCs w:val="22"/>
+            <w:lang w:val="fr-FR"/>
+          </w:rPr>
+          <w:tab/>
+        </w:r>
+        <w:r>
+          <w:rPr>
+            <w:rStyle w:val="Lienhypertexte"/>
+            <w:noProof/>
+            <w:lang w:val="fr-FR"/>
+          </w:rPr>
+          <w:t>Simulation avec une tension entrée “shaper” 90 mV</w:t>
+        </w:r>
+        <w:r>
+          <w:rPr>
+            <w:noProof/>
+            <w:webHidden/>
+          </w:rPr>
+          <w:tab/>
+        </w:r>
+        <w:r>
+          <w:rPr>
+            <w:noProof/>
+            <w:webHidden/>
+          </w:rPr>
+          <w:fldChar w:fldCharType="begin"/>
+        </w:r>
+        <w:r>
+          <w:rPr>
+            <w:noProof/>
+            <w:webHidden/>
+          </w:rPr>
+          <w:instrText xml:space="preserve"> PAGEREF _Toc175154818 \h </w:instrText>
+        </w:r>
+        <w:r>
+          <w:rPr>
+            <w:noProof/>
+            <w:webHidden/>
+          </w:rPr>
+        </w:r>
+        <w:r>
+          <w:rPr>
+            <w:noProof/>
+            <w:webHidden/>
+          </w:rPr>
+          <w:fldChar w:fldCharType="separate"/>
+        </w:r>
+        <w:r>
+          <w:rPr>
+            <w:noProof/>
+            <w:webHidden/>
+          </w:rPr>
+          <w:t>12</w:t>
+        </w:r>
+        <w:r>
+          <w:rPr>
+            <w:noProof/>
+            <w:webHidden/>
           </w:rPr>
           <w:fldChar w:fldCharType="end"/>
         </w:r>
@@ -4251,6 +5123,8 @@
       <w:r>
         <w:br w:type="page"/>
       </w:r>
+      <w:bookmarkStart w:id="0" w:name="_GoBack"/>
+      <w:bookmarkEnd w:id="0"/>
     </w:p>
     <w:p>
       <w:pPr>
@@ -4259,7 +5133,7 @@
           <w:lang w:val="fr-FR"/>
         </w:rPr>
       </w:pPr>
-      <w:bookmarkStart w:id="0" w:name="_Toc174515902"/>
+      <w:bookmarkStart w:id="1" w:name="_Toc175154801"/>
       <w:r>
         <w:rPr>
           <w:lang w:val="fr-FR"/>
@@ -4273,7 +5147,7 @@
         </w:rPr>
         <w:t xml:space="preserve"> de l'EGSE</w:t>
       </w:r>
-      <w:bookmarkEnd w:id="0"/>
+      <w:bookmarkEnd w:id="1"/>
     </w:p>
     <w:p>
       <w:pPr>
@@ -4354,14 +5228,14 @@
           <w:lang w:val="fr-FR"/>
         </w:rPr>
       </w:pPr>
-      <w:bookmarkStart w:id="1" w:name="_Toc174515903"/>
+      <w:bookmarkStart w:id="2" w:name="_Toc175154802"/>
       <w:r>
         <w:rPr>
           <w:lang w:val="fr-FR"/>
         </w:rPr>
         <w:t>Un schéma bloc de l'EGSE</w:t>
       </w:r>
-      <w:bookmarkEnd w:id="1"/>
+      <w:bookmarkEnd w:id="2"/>
     </w:p>
     <w:p>
       <w:pPr>
@@ -4470,14 +5344,14 @@
           <w:lang w:val="fr-FR"/>
         </w:rPr>
       </w:pPr>
-      <w:bookmarkStart w:id="2" w:name="_Toc174515904"/>
+      <w:bookmarkStart w:id="3" w:name="_Toc175154803"/>
       <w:r>
         <w:rPr>
           <w:lang w:val="fr-FR"/>
         </w:rPr>
         <w:t>fonctionnalite de l’egse</w:t>
       </w:r>
-      <w:bookmarkEnd w:id="2"/>
+      <w:bookmarkEnd w:id="3"/>
     </w:p>
     <w:p>
       <w:r>
@@ -4506,7 +5380,7 @@
           <w:lang w:val="fr-FR"/>
         </w:rPr>
       </w:pPr>
-      <w:bookmarkStart w:id="3" w:name="_Toc174515905"/>
+      <w:bookmarkStart w:id="4" w:name="_Toc175154804"/>
       <w:r>
         <w:rPr>
           <w:lang w:val="fr-FR"/>
@@ -4519,7 +5393,7 @@
         </w:rPr>
         <w:t>njection</w:t>
       </w:r>
-      <w:bookmarkEnd w:id="3"/>
+      <w:bookmarkEnd w:id="4"/>
     </w:p>
     <w:p>
       <w:r>
@@ -4575,7 +5449,7 @@
             <v:path o:extrusionok="f" gradientshapeok="t" o:connecttype="rect"/>
             <o:lock v:ext="edit" aspectratio="t"/>
           </v:shapetype>
-          <v:shape id="_x0000_i1025" type="#_x0000_t75" style="width:452.3pt;height:232.35pt">
+          <v:shape id="_x0000_i1025" type="#_x0000_t75" style="width:452.25pt;height:232.5pt">
             <v:imagedata r:id="rId10" o:title="Capture"/>
           </v:shape>
         </w:pict>
@@ -4588,7 +5462,7 @@
           <w:lang w:val="fr-FR"/>
         </w:rPr>
       </w:pPr>
-      <w:bookmarkStart w:id="4" w:name="_Toc174515906"/>
+      <w:bookmarkStart w:id="5" w:name="_Toc175154805"/>
       <w:r>
         <w:rPr>
           <w:lang w:val="fr-FR"/>
@@ -4601,11 +5475,22 @@
         </w:rPr>
         <w:t>s</w:t>
       </w:r>
-      <w:bookmarkEnd w:id="4"/>
+      <w:bookmarkEnd w:id="5"/>
     </w:p>
     <w:p>
       <w:r>
-        <w:t xml:space="preserve">Voici une observation IHM pour un filtre et entrée de signal identique, mais avec un gain de un pour le filtre zéro et gain de deux pour le filtre un. </w:t>
+        <w:t>Voici une observation IHM pour un filtre et entrée de signal identique, mais avec un gain de un pour le filtre zéro et gain de deux pour le filtre un.</w:t>
+      </w:r>
+      <w:r>
+        <w:t xml:space="preserve"> </w:t>
+      </w:r>
+    </w:p>
+    <w:p>
+      <w:r>
+        <w:t xml:space="preserve">  </w:t>
+      </w:r>
+      <w:r>
+        <w:t xml:space="preserve"> </w:t>
       </w:r>
     </w:p>
     <w:p>
@@ -4660,14 +5545,14 @@
           <w:lang w:val="fr-FR"/>
         </w:rPr>
       </w:pPr>
-      <w:bookmarkStart w:id="5" w:name="_Toc174515907"/>
+      <w:bookmarkStart w:id="6" w:name="_Toc175154806"/>
       <w:r>
         <w:rPr>
           <w:lang w:val="fr-FR"/>
         </w:rPr>
         <w:t>Configuration des filtres</w:t>
       </w:r>
-      <w:bookmarkEnd w:id="5"/>
+      <w:bookmarkEnd w:id="6"/>
     </w:p>
     <w:p/>
     <w:p>
@@ -4675,10 +5560,41 @@
         <w:t>Une autre observation IHM pour une configuration</w:t>
       </w:r>
       <w:r>
-        <w:t xml:space="preserve"> filtre zéro passe-bande large. Et une configuration </w:t>
+        <w:t xml:space="preserve"> « </w:t>
+      </w:r>
+      <w:proofErr w:type="spellStart"/>
+      <w:r>
+        <w:t>filter</w:t>
+      </w:r>
+      <w:proofErr w:type="spellEnd"/>
+      <w:r>
+        <w:t xml:space="preserve"> 0 »</w:t>
       </w:r>
       <w:r>
-        <w:t>un filtre à</w:t>
+        <w:t>, filtre</w:t>
+      </w:r>
+      <w:r>
+        <w:t xml:space="preserve"> passe-bande large. Et une configuration </w:t>
+      </w:r>
+      <w:r>
+        <w:t>« </w:t>
+      </w:r>
+      <w:proofErr w:type="spellStart"/>
+      <w:r>
+        <w:t>filter</w:t>
+      </w:r>
+      <w:proofErr w:type="spellEnd"/>
+      <w:r>
+        <w:t xml:space="preserve"> 1 »</w:t>
+      </w:r>
+      <w:r>
+        <w:t xml:space="preserve">, filtre </w:t>
+      </w:r>
+      <w:r>
+        <w:t>passe-bande</w:t>
+      </w:r>
+      <w:r>
+        <w:t xml:space="preserve"> à</w:t>
       </w:r>
       <w:r>
         <w:t xml:space="preserve"> haute fréquence.</w:t>
@@ -4732,20 +5648,62 @@
       </w:r>
     </w:p>
     <w:p>
+      <w:r>
+        <w:t>Toutes les fonctions de transfert et graphe temporelle de la partie 4</w:t>
+      </w:r>
+      <w:r>
+        <w:t xml:space="preserve"> qui suit</w:t>
+      </w:r>
+      <w:r>
+        <w:t xml:space="preserve"> </w:t>
+      </w:r>
+      <w:r>
+        <w:t xml:space="preserve">son issue d’une configuration </w:t>
+      </w:r>
+      <w:r>
+        <w:t>filtre passe-bande large</w:t>
+      </w:r>
+      <w:r>
+        <w:t xml:space="preserve"> avec un gain de deux afin d’exploiter au mieux</w:t>
+      </w:r>
+      <w:r>
+        <w:t xml:space="preserve"> la dynamique des canaux codés sur</w:t>
+      </w:r>
+      <w:r>
+        <w:t xml:space="preserve"> 10</w:t>
+      </w:r>
+      <w:r>
+        <w:t xml:space="preserve"> </w:t>
+      </w:r>
+      <w:r>
+        <w:t>bits</w:t>
+      </w:r>
+      <w:r>
+        <w:t xml:space="preserve"> soit 2^10 = 1024</w:t>
+      </w:r>
+      <w:r>
+        <w:t xml:space="preserve">.     </w:t>
+      </w:r>
+      <w:r>
+        <w:t xml:space="preserve">   </w:t>
+      </w:r>
+    </w:p>
+    <w:p/>
+    <w:p>
       <w:pPr>
         <w:pStyle w:val="Titre1"/>
         <w:rPr>
           <w:lang w:val="fr-FR"/>
         </w:rPr>
       </w:pPr>
-      <w:bookmarkStart w:id="6" w:name="_Toc174515908"/>
+      <w:bookmarkStart w:id="7" w:name="_Toc175154807"/>
       <w:r>
         <w:rPr>
           <w:lang w:val="fr-FR"/>
         </w:rPr>
         <w:t>Les fonctions de transfer</w:t>
       </w:r>
-      <w:bookmarkEnd w:id="6"/>
+      <w:bookmarkEnd w:id="7"/>
     </w:p>
     <w:p>
       <w:pPr>
@@ -4754,6 +5712,7 @@
           <w:lang w:val="fr-FR"/>
         </w:rPr>
       </w:pPr>
+      <w:bookmarkStart w:id="8" w:name="_Toc175154808"/>
       <w:r>
         <w:rPr>
           <w:lang w:val="fr-FR"/>
@@ -4772,8 +5731,21 @@
         <w:rPr>
           <w:lang w:val="fr-FR"/>
         </w:rPr>
-        <w:t>” et CAN</w:t>
+        <w:t>”</w:t>
       </w:r>
+      <w:r>
+        <w:rPr>
+          <w:lang w:val="fr-FR"/>
+        </w:rPr>
+        <w:t xml:space="preserve"> analogique</w:t>
+      </w:r>
+      <w:r>
+        <w:rPr>
+          <w:lang w:val="fr-FR"/>
+        </w:rPr>
+        <w:t xml:space="preserve"> et CAN</w:t>
+      </w:r>
+      <w:bookmarkEnd w:id="8"/>
     </w:p>
     <w:p>
       <w:r>
@@ -4783,7 +5755,10 @@
         <w:t xml:space="preserve"> à l’amplificateur de charge</w:t>
       </w:r>
       <w:r>
-        <w:t xml:space="preserve"> et permet de tracer plusieurs pulse après numérisation.</w:t>
+        <w:t xml:space="preserve"> et permet de tracer plu</w:t>
+      </w:r>
+      <w:r>
+        <w:t>sieurs pulse après numérisation, signal qui est appliqué à l’entrée du filtre numérique.</w:t>
       </w:r>
       <w:r>
         <w:t xml:space="preserve"> </w:t>
@@ -4796,10 +5771,10 @@
     <w:p>
       <w:r>
         <w:drawing>
-          <wp:inline distT="0" distB="0" distL="0" distR="0" wp14:anchorId="74F11FFA" wp14:editId="0E4B8AF4">
-            <wp:extent cx="6116320" cy="3741420"/>
-            <wp:effectExtent l="0" t="0" r="17780" b="11430"/>
-            <wp:docPr id="10" name="Graphique 10"/>
+          <wp:inline distT="0" distB="0" distL="0" distR="0" wp14:anchorId="3E748B46" wp14:editId="043EAD01">
+            <wp:extent cx="6116320" cy="3457575"/>
+            <wp:effectExtent l="0" t="0" r="17780" b="9525"/>
+            <wp:docPr id="9" name="Graphique 9"/>
             <wp:cNvGraphicFramePr/>
             <a:graphic xmlns:a="http://schemas.openxmlformats.org/drawingml/2006/main">
               <a:graphicData uri="http://schemas.openxmlformats.org/drawingml/2006/chart">
@@ -4818,7 +5793,7 @@
           <w:lang w:val="fr-FR"/>
         </w:rPr>
       </w:pPr>
-      <w:bookmarkStart w:id="7" w:name="_Toc174515909"/>
+      <w:bookmarkStart w:id="9" w:name="_Toc175154809"/>
       <w:r>
         <w:rPr>
           <w:lang w:val="fr-FR"/>
@@ -4843,7 +5818,7 @@
         </w:rPr>
         <w:t xml:space="preserve"> de la lecture du CAN</w:t>
       </w:r>
-      <w:bookmarkEnd w:id="7"/>
+      <w:bookmarkEnd w:id="9"/>
     </w:p>
     <w:p>
       <w:r>
@@ -4854,6 +5829,9 @@
       </w:r>
       <w:r>
         <w:t xml:space="preserve"> en ce qui concerne les mesures on peut observer une assez bonne linéarité elles suivent la loi</w:t>
+      </w:r>
+      <w:r>
+        <w:t>.</w:t>
       </w:r>
     </w:p>
     <w:p/>
@@ -4933,7 +5911,7 @@
       <w:r>
         <w:lastRenderedPageBreak/>
         <w:drawing>
-          <wp:inline distT="0" distB="0" distL="0" distR="0" wp14:anchorId="0D0343BE" wp14:editId="0AA96A60">
+          <wp:inline distT="0" distB="0" distL="0" distR="0" wp14:anchorId="0D0343BE" wp14:editId="059EBB12">
             <wp:extent cx="6428850" cy="2810518"/>
             <wp:effectExtent l="0" t="0" r="10160" b="8890"/>
             <wp:docPr id="6" name="Graphique 6"/>
@@ -4969,20 +5947,14 @@
           <w:lang w:val="fr-FR"/>
         </w:rPr>
       </w:pPr>
-      <w:bookmarkStart w:id="8" w:name="_Toc174515910"/>
+      <w:bookmarkStart w:id="10" w:name="_Toc175154810"/>
       <w:r>
         <w:rPr>
           <w:lang w:val="fr-FR"/>
         </w:rPr>
-        <w:t xml:space="preserve">Fonction de transfert du filtre à </w:t>
+        <w:t>Fonction de transfert du filtre à réponse impulsionnelle finie</w:t>
       </w:r>
-      <w:r>
-        <w:rPr>
-          <w:lang w:val="fr-FR"/>
-        </w:rPr>
-        <w:t>réponse impulsionnelle finie</w:t>
-      </w:r>
-      <w:bookmarkEnd w:id="8"/>
+      <w:bookmarkEnd w:id="10"/>
       <w:r>
         <w:rPr>
           <w:lang w:val="fr-FR"/>
@@ -4997,44 +5969,27 @@
           <w:lang w:val="fr-FR"/>
         </w:rPr>
       </w:pPr>
-      <w:r>
-        <w:rPr>
-          <w:lang w:val="fr-FR"/>
-        </w:rPr>
-        <w:t>Simulation</w:t>
-      </w:r>
-    </w:p>
-    <w:p/>
-    <w:p>
-      <w:pPr>
-        <w:pStyle w:val="Titre3"/>
-        <w:rPr>
-          <w:lang w:val="fr-FR"/>
-        </w:rPr>
-      </w:pPr>
+      <w:bookmarkStart w:id="11" w:name="_Toc175154811"/>
       <w:r>
         <w:rPr>
           <w:lang w:val="fr-FR"/>
         </w:rPr>
         <w:t>Mesure</w:t>
       </w:r>
+      <w:bookmarkEnd w:id="11"/>
     </w:p>
     <w:p/>
     <w:p>
       <w:pPr>
         <w:jc w:val="center"/>
       </w:pPr>
-      <w:bookmarkStart w:id="9" w:name="_GoBack"/>
       <w:r>
-        <w:rPr>
-          <w:noProof/>
-        </w:rPr>
         <w:lastRenderedPageBreak/>
         <w:drawing>
-          <wp:inline distT="0" distB="0" distL="0" distR="0" wp14:anchorId="3F2B35A2" wp14:editId="6D4C808A">
-            <wp:extent cx="5637865" cy="4291509"/>
-            <wp:effectExtent l="0" t="0" r="1270" b="13970"/>
-            <wp:docPr id="13" name="Graphique 13"/>
+          <wp:inline distT="0" distB="0" distL="0" distR="0" wp14:anchorId="48C450DA" wp14:editId="5DFFA2A6">
+            <wp:extent cx="6116320" cy="4528185"/>
+            <wp:effectExtent l="0" t="0" r="17780" b="5715"/>
+            <wp:docPr id="11" name="Graphique 11"/>
             <wp:cNvGraphicFramePr/>
             <a:graphic xmlns:a="http://schemas.openxmlformats.org/drawingml/2006/main">
               <a:graphicData uri="http://schemas.openxmlformats.org/drawingml/2006/chart">
@@ -5044,7 +5999,16 @@
           </wp:inline>
         </w:drawing>
       </w:r>
-      <w:bookmarkEnd w:id="9"/>
+    </w:p>
+    <w:p>
+      <w:pPr>
+        <w:jc w:val="left"/>
+      </w:pPr>
+    </w:p>
+    <w:p>
+      <w:r>
+        <w:t xml:space="preserve">La droite ci-dessous montre la linéarité du filtre numérique, sortie en fonction de l'entrée pour les valeurs maximums des pulses.  </w:t>
+      </w:r>
     </w:p>
     <w:p/>
     <w:p>
@@ -5053,7 +6017,7 @@
       </w:pPr>
       <w:r>
         <w:drawing>
-          <wp:inline distT="0" distB="0" distL="0" distR="0" wp14:anchorId="00ED73B3" wp14:editId="1B2EB1A9">
+          <wp:inline distT="0" distB="0" distL="0" distR="0" wp14:anchorId="00ED73B3" wp14:editId="330F9AA7">
             <wp:extent cx="6116320" cy="2440940"/>
             <wp:effectExtent l="0" t="0" r="17780" b="16510"/>
             <wp:docPr id="7" name="Graphique 7"/>
@@ -5075,7 +6039,7 @@
           <w:lang w:val="fr-FR"/>
         </w:rPr>
       </w:pPr>
-      <w:bookmarkStart w:id="10" w:name="_Toc174515911"/>
+      <w:bookmarkStart w:id="12" w:name="_Toc175154812"/>
       <w:r>
         <w:rPr>
           <w:lang w:val="fr-FR"/>
@@ -5106,9 +6070,27 @@
         <w:rPr>
           <w:lang w:val="fr-FR"/>
         </w:rPr>
-        <w:t xml:space="preserve"> -&gt; spectre”</w:t>
+        <w:t>”</w:t>
       </w:r>
-      <w:bookmarkEnd w:id="10"/>
+      <w:r>
+        <w:rPr>
+          <w:lang w:val="fr-FR"/>
+        </w:rPr>
+        <w:t xml:space="preserve"> analogique</w:t>
+      </w:r>
+      <w:r>
+        <w:rPr>
+          <w:lang w:val="fr-FR"/>
+        </w:rPr>
+        <w:t xml:space="preserve"> -&gt; spectre</w:t>
+      </w:r>
+      <w:r>
+        <w:rPr>
+          <w:lang w:val="fr-FR"/>
+        </w:rPr>
+        <w:t xml:space="preserve"> numérique</w:t>
+      </w:r>
+      <w:bookmarkEnd w:id="12"/>
     </w:p>
     <w:p/>
     <w:p>
@@ -5118,7 +6100,7 @@
       <w:r>
         <w:lastRenderedPageBreak/>
         <w:drawing>
-          <wp:inline distT="0" distB="0" distL="0" distR="0" wp14:anchorId="469A5031" wp14:editId="2DED46EA">
+          <wp:inline distT="0" distB="0" distL="0" distR="0" wp14:anchorId="469A5031" wp14:editId="78ACD9D9">
             <wp:extent cx="5643475" cy="4110452"/>
             <wp:effectExtent l="0" t="0" r="14605" b="4445"/>
             <wp:docPr id="8" name="Graphique 8"/>
@@ -5133,9 +6115,500 @@
       </w:r>
     </w:p>
     <w:p/>
+    <w:p>
+      <w:pPr>
+        <w:pStyle w:val="Titre1"/>
+        <w:rPr>
+          <w:lang w:val="fr-FR"/>
+        </w:rPr>
+      </w:pPr>
+      <w:bookmarkStart w:id="13" w:name="_Toc175154813"/>
+      <w:r>
+        <w:rPr>
+          <w:lang w:val="fr-FR"/>
+        </w:rPr>
+        <w:t xml:space="preserve">Simulation filtre </w:t>
+      </w:r>
+      <w:r>
+        <w:rPr>
+          <w:lang w:val="fr-FR"/>
+        </w:rPr>
+        <w:t>RIF</w:t>
+      </w:r>
+      <w:r>
+        <w:rPr>
+          <w:lang w:val="fr-FR"/>
+        </w:rPr>
+        <w:t xml:space="preserve"> et résultat du pique du spectre</w:t>
+      </w:r>
+      <w:bookmarkEnd w:id="13"/>
+    </w:p>
+    <w:p>
+      <w:r>
+        <w:t>Cette partie démontre la cohérence des résultats temporelle et spectrale entre les simulations comportementale FPGA et les mesures.</w:t>
+      </w:r>
+    </w:p>
+    <w:p>
+      <w:pPr>
+        <w:pStyle w:val="Titre2"/>
+        <w:rPr>
+          <w:lang w:val="fr-FR"/>
+        </w:rPr>
+      </w:pPr>
+      <w:bookmarkStart w:id="14" w:name="_Toc175154814"/>
+      <w:r>
+        <w:rPr>
+          <w:lang w:val="fr-FR"/>
+        </w:rPr>
+        <w:t>S</w:t>
+      </w:r>
+      <w:r>
+        <w:rPr>
+          <w:lang w:val="fr-FR"/>
+        </w:rPr>
+        <w:t xml:space="preserve">imulation avec une tension </w:t>
+      </w:r>
+      <w:r>
+        <w:rPr>
+          <w:lang w:val="fr-FR"/>
+        </w:rPr>
+        <w:t>entrée “</w:t>
+      </w:r>
+      <w:proofErr w:type="spellStart"/>
+      <w:r>
+        <w:rPr>
+          <w:lang w:val="fr-FR"/>
+        </w:rPr>
+        <w:t>shaper</w:t>
+      </w:r>
+      <w:proofErr w:type="spellEnd"/>
+      <w:r>
+        <w:rPr>
+          <w:lang w:val="fr-FR"/>
+        </w:rPr>
+        <w:t>” 950</w:t>
+      </w:r>
+      <w:r>
+        <w:rPr>
+          <w:lang w:val="fr-FR"/>
+        </w:rPr>
+        <w:t xml:space="preserve"> </w:t>
+      </w:r>
+      <w:r>
+        <w:rPr>
+          <w:lang w:val="fr-FR"/>
+        </w:rPr>
+        <w:t>mV</w:t>
+      </w:r>
+      <w:bookmarkEnd w:id="14"/>
+      <w:r>
+        <w:rPr>
+          <w:lang w:val="fr-FR"/>
+        </w:rPr>
+        <w:t xml:space="preserve">    </w:t>
+      </w:r>
+    </w:p>
+    <w:p>
+      <w:pPr>
+        <w:jc w:val="center"/>
+      </w:pPr>
+      <w:r>
+        <w:drawing>
+          <wp:inline distT="0" distB="0" distL="0" distR="0" wp14:anchorId="4022E24B" wp14:editId="53BBD004">
+            <wp:extent cx="6116320" cy="2717800"/>
+            <wp:effectExtent l="0" t="0" r="0" b="6350"/>
+            <wp:docPr id="13" name="Image 13"/>
+            <wp:cNvGraphicFramePr>
+              <a:graphicFrameLocks xmlns:a="http://schemas.openxmlformats.org/drawingml/2006/main" noChangeAspect="1"/>
+            </wp:cNvGraphicFramePr>
+            <a:graphic xmlns:a="http://schemas.openxmlformats.org/drawingml/2006/main">
+              <a:graphicData uri="http://schemas.openxmlformats.org/drawingml/2006/picture">
+                <pic:pic xmlns:pic="http://schemas.openxmlformats.org/drawingml/2006/picture">
+                  <pic:nvPicPr>
+                    <pic:cNvPr id="1" name=""/>
+                    <pic:cNvPicPr/>
+                  </pic:nvPicPr>
+                  <pic:blipFill>
+                    <a:blip r:embed="rId18"/>
+                    <a:stretch>
+                      <a:fillRect/>
+                    </a:stretch>
+                  </pic:blipFill>
+                  <pic:spPr>
+                    <a:xfrm>
+                      <a:off x="0" y="0"/>
+                      <a:ext cx="6116320" cy="2717800"/>
+                    </a:xfrm>
+                    <a:prstGeom prst="rect">
+                      <a:avLst/>
+                    </a:prstGeom>
+                  </pic:spPr>
+                </pic:pic>
+              </a:graphicData>
+            </a:graphic>
+          </wp:inline>
+        </w:drawing>
+      </w:r>
+    </w:p>
+    <w:p>
+      <w:pPr>
+        <w:pStyle w:val="Titre2"/>
+        <w:numPr>
+          <w:ilvl w:val="1"/>
+          <w:numId w:val="22"/>
+        </w:numPr>
+        <w:rPr>
+          <w:lang w:val="fr-FR"/>
+        </w:rPr>
+      </w:pPr>
+      <w:bookmarkStart w:id="15" w:name="_Toc175154815"/>
+      <w:r>
+        <w:rPr>
+          <w:lang w:val="fr-FR"/>
+        </w:rPr>
+        <w:t>Simulation avec une tension entrée “</w:t>
+      </w:r>
+      <w:proofErr w:type="spellStart"/>
+      <w:r>
+        <w:rPr>
+          <w:lang w:val="fr-FR"/>
+        </w:rPr>
+        <w:t>shaper</w:t>
+      </w:r>
+      <w:proofErr w:type="spellEnd"/>
+      <w:r>
+        <w:rPr>
+          <w:lang w:val="fr-FR"/>
+        </w:rPr>
+        <w:t>”</w:t>
+      </w:r>
+      <w:r>
+        <w:rPr>
+          <w:lang w:val="fr-FR"/>
+        </w:rPr>
+        <w:t xml:space="preserve"> 8</w:t>
+      </w:r>
+      <w:r>
+        <w:rPr>
+          <w:lang w:val="fr-FR"/>
+        </w:rPr>
+        <w:t>50 mV</w:t>
+      </w:r>
+      <w:bookmarkEnd w:id="15"/>
+    </w:p>
+    <w:p>
+      <w:r>
+        <w:rPr>
+          <w:noProof/>
+        </w:rPr>
+        <w:lastRenderedPageBreak/>
+        <w:drawing>
+          <wp:inline distT="0" distB="0" distL="0" distR="0" wp14:anchorId="27959E2A" wp14:editId="307ED1B5">
+            <wp:extent cx="6116320" cy="2552065"/>
+            <wp:effectExtent l="0" t="0" r="0" b="635"/>
+            <wp:docPr id="15" name="Image 15"/>
+            <wp:cNvGraphicFramePr>
+              <a:graphicFrameLocks xmlns:a="http://schemas.openxmlformats.org/drawingml/2006/main" noChangeAspect="1"/>
+            </wp:cNvGraphicFramePr>
+            <a:graphic xmlns:a="http://schemas.openxmlformats.org/drawingml/2006/main">
+              <a:graphicData uri="http://schemas.openxmlformats.org/drawingml/2006/picture">
+                <pic:pic xmlns:pic="http://schemas.openxmlformats.org/drawingml/2006/picture">
+                  <pic:nvPicPr>
+                    <pic:cNvPr id="1" name=""/>
+                    <pic:cNvPicPr/>
+                  </pic:nvPicPr>
+                  <pic:blipFill>
+                    <a:blip r:embed="rId19"/>
+                    <a:stretch>
+                      <a:fillRect/>
+                    </a:stretch>
+                  </pic:blipFill>
+                  <pic:spPr>
+                    <a:xfrm>
+                      <a:off x="0" y="0"/>
+                      <a:ext cx="6116320" cy="2552065"/>
+                    </a:xfrm>
+                    <a:prstGeom prst="rect">
+                      <a:avLst/>
+                    </a:prstGeom>
+                  </pic:spPr>
+                </pic:pic>
+              </a:graphicData>
+            </a:graphic>
+          </wp:inline>
+        </w:drawing>
+      </w:r>
+    </w:p>
+    <w:p>
+      <w:pPr>
+        <w:pStyle w:val="Titre2"/>
+        <w:numPr>
+          <w:ilvl w:val="1"/>
+          <w:numId w:val="23"/>
+        </w:numPr>
+        <w:rPr>
+          <w:lang w:val="fr-FR"/>
+        </w:rPr>
+      </w:pPr>
+      <w:bookmarkStart w:id="16" w:name="_Toc175154816"/>
+      <w:r>
+        <w:rPr>
+          <w:lang w:val="fr-FR"/>
+        </w:rPr>
+        <w:t>Simulation avec une tension entrée “</w:t>
+      </w:r>
+      <w:proofErr w:type="spellStart"/>
+      <w:r>
+        <w:rPr>
+          <w:lang w:val="fr-FR"/>
+        </w:rPr>
+        <w:t>shaper</w:t>
+      </w:r>
+      <w:proofErr w:type="spellEnd"/>
+      <w:r>
+        <w:rPr>
+          <w:lang w:val="fr-FR"/>
+        </w:rPr>
+        <w:t>”</w:t>
+      </w:r>
+      <w:r>
+        <w:rPr>
+          <w:lang w:val="fr-FR"/>
+        </w:rPr>
+        <w:t xml:space="preserve"> 430</w:t>
+      </w:r>
+      <w:r>
+        <w:rPr>
+          <w:lang w:val="fr-FR"/>
+        </w:rPr>
+        <w:t xml:space="preserve"> mV</w:t>
+      </w:r>
+      <w:bookmarkEnd w:id="16"/>
+    </w:p>
+    <w:p>
+      <w:r>
+        <w:rPr>
+          <w:noProof/>
+        </w:rPr>
+        <w:drawing>
+          <wp:inline distT="0" distB="0" distL="0" distR="0" wp14:anchorId="7A658A88" wp14:editId="5043C1AD">
+            <wp:extent cx="6116320" cy="2670175"/>
+            <wp:effectExtent l="0" t="0" r="0" b="0"/>
+            <wp:docPr id="16" name="Image 16"/>
+            <wp:cNvGraphicFramePr>
+              <a:graphicFrameLocks xmlns:a="http://schemas.openxmlformats.org/drawingml/2006/main" noChangeAspect="1"/>
+            </wp:cNvGraphicFramePr>
+            <a:graphic xmlns:a="http://schemas.openxmlformats.org/drawingml/2006/main">
+              <a:graphicData uri="http://schemas.openxmlformats.org/drawingml/2006/picture">
+                <pic:pic xmlns:pic="http://schemas.openxmlformats.org/drawingml/2006/picture">
+                  <pic:nvPicPr>
+                    <pic:cNvPr id="1" name=""/>
+                    <pic:cNvPicPr/>
+                  </pic:nvPicPr>
+                  <pic:blipFill>
+                    <a:blip r:embed="rId20"/>
+                    <a:stretch>
+                      <a:fillRect/>
+                    </a:stretch>
+                  </pic:blipFill>
+                  <pic:spPr>
+                    <a:xfrm>
+                      <a:off x="0" y="0"/>
+                      <a:ext cx="6116320" cy="2670175"/>
+                    </a:xfrm>
+                    <a:prstGeom prst="rect">
+                      <a:avLst/>
+                    </a:prstGeom>
+                  </pic:spPr>
+                </pic:pic>
+              </a:graphicData>
+            </a:graphic>
+          </wp:inline>
+        </w:drawing>
+      </w:r>
+    </w:p>
+    <w:p>
+      <w:pPr>
+        <w:pStyle w:val="Titre2"/>
+        <w:rPr>
+          <w:lang w:val="fr-FR"/>
+        </w:rPr>
+      </w:pPr>
+      <w:bookmarkStart w:id="17" w:name="_Toc175154817"/>
+      <w:r>
+        <w:rPr>
+          <w:lang w:val="fr-FR"/>
+        </w:rPr>
+        <w:t>Simulation avec une tension entrée “</w:t>
+      </w:r>
+      <w:proofErr w:type="spellStart"/>
+      <w:r>
+        <w:rPr>
+          <w:lang w:val="fr-FR"/>
+        </w:rPr>
+        <w:t>shaper</w:t>
+      </w:r>
+      <w:proofErr w:type="spellEnd"/>
+      <w:r>
+        <w:rPr>
+          <w:lang w:val="fr-FR"/>
+        </w:rPr>
+        <w:t>”</w:t>
+      </w:r>
+      <w:r>
+        <w:rPr>
+          <w:lang w:val="fr-FR"/>
+        </w:rPr>
+        <w:t xml:space="preserve"> 350</w:t>
+      </w:r>
+      <w:r>
+        <w:rPr>
+          <w:lang w:val="fr-FR"/>
+        </w:rPr>
+        <w:t xml:space="preserve"> </w:t>
+      </w:r>
+      <w:r>
+        <w:rPr>
+          <w:lang w:val="fr-FR"/>
+        </w:rPr>
+        <w:t>mV</w:t>
+      </w:r>
+      <w:bookmarkEnd w:id="17"/>
+    </w:p>
+    <w:p>
+      <w:r>
+        <w:rPr>
+          <w:noProof/>
+        </w:rPr>
+        <w:drawing>
+          <wp:inline distT="0" distB="0" distL="0" distR="0" wp14:anchorId="0DD6CE38" wp14:editId="27B67DB8">
+            <wp:extent cx="6116320" cy="2617470"/>
+            <wp:effectExtent l="0" t="0" r="0" b="0"/>
+            <wp:docPr id="14" name="Image 14"/>
+            <wp:cNvGraphicFramePr>
+              <a:graphicFrameLocks xmlns:a="http://schemas.openxmlformats.org/drawingml/2006/main" noChangeAspect="1"/>
+            </wp:cNvGraphicFramePr>
+            <a:graphic xmlns:a="http://schemas.openxmlformats.org/drawingml/2006/main">
+              <a:graphicData uri="http://schemas.openxmlformats.org/drawingml/2006/picture">
+                <pic:pic xmlns:pic="http://schemas.openxmlformats.org/drawingml/2006/picture">
+                  <pic:nvPicPr>
+                    <pic:cNvPr id="1" name=""/>
+                    <pic:cNvPicPr/>
+                  </pic:nvPicPr>
+                  <pic:blipFill>
+                    <a:blip r:embed="rId21"/>
+                    <a:stretch>
+                      <a:fillRect/>
+                    </a:stretch>
+                  </pic:blipFill>
+                  <pic:spPr>
+                    <a:xfrm>
+                      <a:off x="0" y="0"/>
+                      <a:ext cx="6116320" cy="2617470"/>
+                    </a:xfrm>
+                    <a:prstGeom prst="rect">
+                      <a:avLst/>
+                    </a:prstGeom>
+                  </pic:spPr>
+                </pic:pic>
+              </a:graphicData>
+            </a:graphic>
+          </wp:inline>
+        </w:drawing>
+      </w:r>
+    </w:p>
     <w:p/>
+    <w:p>
+      <w:pPr>
+        <w:pStyle w:val="Titre2"/>
+        <w:numPr>
+          <w:ilvl w:val="1"/>
+          <w:numId w:val="24"/>
+        </w:numPr>
+        <w:rPr>
+          <w:lang w:val="fr-FR"/>
+        </w:rPr>
+      </w:pPr>
+      <w:bookmarkStart w:id="18" w:name="_Toc175154818"/>
+      <w:r>
+        <w:rPr>
+          <w:lang w:val="fr-FR"/>
+        </w:rPr>
+        <w:t>Simulation avec une tension entrée “</w:t>
+      </w:r>
+      <w:proofErr w:type="spellStart"/>
+      <w:r>
+        <w:rPr>
+          <w:lang w:val="fr-FR"/>
+        </w:rPr>
+        <w:t>shaper</w:t>
+      </w:r>
+      <w:proofErr w:type="spellEnd"/>
+      <w:r>
+        <w:rPr>
+          <w:lang w:val="fr-FR"/>
+        </w:rPr>
+        <w:t>”</w:t>
+      </w:r>
+      <w:r>
+        <w:rPr>
+          <w:lang w:val="fr-FR"/>
+        </w:rPr>
+        <w:t xml:space="preserve"> 90</w:t>
+      </w:r>
+      <w:r>
+        <w:rPr>
+          <w:lang w:val="fr-FR"/>
+        </w:rPr>
+        <w:t xml:space="preserve"> mV</w:t>
+      </w:r>
+      <w:bookmarkEnd w:id="18"/>
+    </w:p>
+    <w:p/>
+    <w:p>
+      <w:r>
+        <w:rPr>
+          <w:noProof/>
+        </w:rPr>
+        <w:drawing>
+          <wp:inline distT="0" distB="0" distL="0" distR="0" wp14:anchorId="569BB35A" wp14:editId="2A184248">
+            <wp:extent cx="6116320" cy="2435860"/>
+            <wp:effectExtent l="0" t="0" r="0" b="2540"/>
+            <wp:docPr id="17" name="Image 17"/>
+            <wp:cNvGraphicFramePr>
+              <a:graphicFrameLocks xmlns:a="http://schemas.openxmlformats.org/drawingml/2006/main" noChangeAspect="1"/>
+            </wp:cNvGraphicFramePr>
+            <a:graphic xmlns:a="http://schemas.openxmlformats.org/drawingml/2006/main">
+              <a:graphicData uri="http://schemas.openxmlformats.org/drawingml/2006/picture">
+                <pic:pic xmlns:pic="http://schemas.openxmlformats.org/drawingml/2006/picture">
+                  <pic:nvPicPr>
+                    <pic:cNvPr id="1" name=""/>
+                    <pic:cNvPicPr/>
+                  </pic:nvPicPr>
+                  <pic:blipFill>
+                    <a:blip r:embed="rId22"/>
+                    <a:stretch>
+                      <a:fillRect/>
+                    </a:stretch>
+                  </pic:blipFill>
+                  <pic:spPr>
+                    <a:xfrm>
+                      <a:off x="0" y="0"/>
+                      <a:ext cx="6116320" cy="2435860"/>
+                    </a:xfrm>
+                    <a:prstGeom prst="rect">
+                      <a:avLst/>
+                    </a:prstGeom>
+                  </pic:spPr>
+                </pic:pic>
+              </a:graphicData>
+            </a:graphic>
+          </wp:inline>
+        </w:drawing>
+      </w:r>
+    </w:p>
     <w:sectPr>
-      <w:headerReference w:type="default" r:id="rId18"/>
+      <w:headerReference w:type="default" r:id="rId23"/>
       <w:pgSz w:w="11900" w:h="16840"/>
       <w:pgMar w:top="2580" w:right="1134" w:bottom="1134" w:left="1134" w:header="624" w:footer="624" w:gutter="0"/>
       <w:pgNumType w:start="1"/>
@@ -5516,7 +6989,7 @@
               <w:szCs w:val="22"/>
               <w:lang w:val="en-US"/>
             </w:rPr>
-            <w:t>8</w:t>
+            <w:t>12</w:t>
           </w:r>
           <w:r>
             <w:rPr>
@@ -5562,7 +7035,7 @@
               <w:szCs w:val="22"/>
               <w:lang w:val="en-GB"/>
             </w:rPr>
-            <w:t>10</w:t>
+            <w:t>12</w:t>
           </w:r>
           <w:r>
             <w:rPr>
@@ -6471,6 +7944,96 @@
   <w:num w:numId="21">
     <w:abstractNumId w:val="3"/>
   </w:num>
+  <w:num w:numId="22">
+    <w:abstractNumId w:val="6"/>
+    <w:lvlOverride w:ilvl="0">
+      <w:startOverride w:val="1"/>
+    </w:lvlOverride>
+    <w:lvlOverride w:ilvl="1">
+      <w:startOverride w:val="1"/>
+    </w:lvlOverride>
+    <w:lvlOverride w:ilvl="2">
+      <w:startOverride w:val="1"/>
+    </w:lvlOverride>
+    <w:lvlOverride w:ilvl="3">
+      <w:startOverride w:val="1"/>
+    </w:lvlOverride>
+    <w:lvlOverride w:ilvl="4">
+      <w:startOverride w:val="1"/>
+    </w:lvlOverride>
+    <w:lvlOverride w:ilvl="5">
+      <w:startOverride w:val="1"/>
+    </w:lvlOverride>
+    <w:lvlOverride w:ilvl="6">
+      <w:startOverride w:val="1"/>
+    </w:lvlOverride>
+    <w:lvlOverride w:ilvl="7">
+      <w:startOverride w:val="1"/>
+    </w:lvlOverride>
+    <w:lvlOverride w:ilvl="8">
+      <w:startOverride w:val="1"/>
+    </w:lvlOverride>
+  </w:num>
+  <w:num w:numId="23">
+    <w:abstractNumId w:val="6"/>
+    <w:lvlOverride w:ilvl="0">
+      <w:startOverride w:val="1"/>
+    </w:lvlOverride>
+    <w:lvlOverride w:ilvl="1">
+      <w:startOverride w:val="1"/>
+    </w:lvlOverride>
+    <w:lvlOverride w:ilvl="2">
+      <w:startOverride w:val="1"/>
+    </w:lvlOverride>
+    <w:lvlOverride w:ilvl="3">
+      <w:startOverride w:val="1"/>
+    </w:lvlOverride>
+    <w:lvlOverride w:ilvl="4">
+      <w:startOverride w:val="1"/>
+    </w:lvlOverride>
+    <w:lvlOverride w:ilvl="5">
+      <w:startOverride w:val="1"/>
+    </w:lvlOverride>
+    <w:lvlOverride w:ilvl="6">
+      <w:startOverride w:val="1"/>
+    </w:lvlOverride>
+    <w:lvlOverride w:ilvl="7">
+      <w:startOverride w:val="1"/>
+    </w:lvlOverride>
+    <w:lvlOverride w:ilvl="8">
+      <w:startOverride w:val="1"/>
+    </w:lvlOverride>
+  </w:num>
+  <w:num w:numId="24">
+    <w:abstractNumId w:val="6"/>
+    <w:lvlOverride w:ilvl="0">
+      <w:startOverride w:val="1"/>
+    </w:lvlOverride>
+    <w:lvlOverride w:ilvl="1">
+      <w:startOverride w:val="1"/>
+    </w:lvlOverride>
+    <w:lvlOverride w:ilvl="2">
+      <w:startOverride w:val="1"/>
+    </w:lvlOverride>
+    <w:lvlOverride w:ilvl="3">
+      <w:startOverride w:val="1"/>
+    </w:lvlOverride>
+    <w:lvlOverride w:ilvl="4">
+      <w:startOverride w:val="1"/>
+    </w:lvlOverride>
+    <w:lvlOverride w:ilvl="5">
+      <w:startOverride w:val="1"/>
+    </w:lvlOverride>
+    <w:lvlOverride w:ilvl="6">
+      <w:startOverride w:val="1"/>
+    </w:lvlOverride>
+    <w:lvlOverride w:ilvl="7">
+      <w:startOverride w:val="1"/>
+    </w:lvlOverride>
+    <w:lvlOverride w:ilvl="8">
+      <w:startOverride w:val="1"/>
+    </w:lvlOverride>
+  </w:num>
 </w:numbering>
 </file>
 
@@ -6498,6 +8061,7 @@
     <w:lsdException w:name="heading 9" w:qFormat="1"/>
     <w:lsdException w:name="toc 1" w:uiPriority="39"/>
     <w:lsdException w:name="toc 2" w:uiPriority="39"/>
+    <w:lsdException w:name="toc 3" w:uiPriority="39"/>
     <w:lsdException w:name="caption" w:semiHidden="1" w:unhideWhenUsed="1" w:qFormat="1"/>
     <w:lsdException w:name="Title" w:qFormat="1"/>
     <w:lsdException w:name="Subtitle" w:qFormat="1"/>
@@ -7033,7 +8597,7 @@
     <w:basedOn w:val="Normal"/>
     <w:next w:val="Normal"/>
     <w:autoRedefine/>
-    <w:semiHidden/>
+    <w:uiPriority w:val="39"/>
     <w:pPr>
       <w:ind w:left="480"/>
       <w:jc w:val="left"/>
@@ -7502,7 +9066,7 @@
             </a:r>
             <a:r>
               <a:rPr lang="fr-FR" baseline="0"/>
-              <a:t> du filtre numérique en fonction de la tension d'entrée du shaper</a:t>
+              <a:t> du filtre numérique en fonction du temps pour plusieurs niveau "shaper"</a:t>
             </a:r>
             <a:endParaRPr lang="fr-FR"/>
           </a:p>
@@ -9969,11 +11533,11 @@
           <c:showPercent val="0"/>
           <c:showBubbleSize val="0"/>
         </c:dLbls>
-        <c:axId val="304991384"/>
-        <c:axId val="304991776"/>
+        <c:axId val="328864344"/>
+        <c:axId val="328859248"/>
       </c:scatterChart>
       <c:valAx>
-        <c:axId val="304991384"/>
+        <c:axId val="328864344"/>
         <c:scaling>
           <c:orientation val="minMax"/>
         </c:scaling>
@@ -10014,7 +11578,7 @@
                 </a:pPr>
                 <a:r>
                   <a:rPr lang="fr-FR"/>
-                  <a:t>temps</a:t>
+                  <a:t>Temps</a:t>
                 </a:r>
               </a:p>
             </c:rich>
@@ -10085,12 +11649,12 @@
             <a:endParaRPr lang="fr-FR"/>
           </a:p>
         </c:txPr>
-        <c:crossAx val="304991776"/>
+        <c:crossAx val="328859248"/>
         <c:crosses val="autoZero"/>
         <c:crossBetween val="midCat"/>
       </c:valAx>
       <c:valAx>
-        <c:axId val="304991776"/>
+        <c:axId val="328859248"/>
         <c:scaling>
           <c:orientation val="minMax"/>
         </c:scaling>
@@ -10133,6 +11697,11 @@
                   <a:rPr lang="fr-FR"/>
                   <a:t>ADU</a:t>
                 </a:r>
+                <a:r>
+                  <a:rPr lang="fr-FR" baseline="0"/>
+                  <a:t> aprés numérisation entrée du filtre</a:t>
+                </a:r>
+                <a:endParaRPr lang="fr-FR"/>
               </a:p>
             </c:rich>
           </c:tx>
@@ -10202,7 +11771,7 @@
             <a:endParaRPr lang="fr-FR"/>
           </a:p>
         </c:txPr>
-        <c:crossAx val="304991384"/>
+        <c:crossAx val="328864344"/>
         <c:crosses val="autoZero"/>
         <c:crossBetween val="midCat"/>
       </c:valAx>
@@ -10315,7 +11884,7 @@
             </a:pPr>
             <a:r>
               <a:rPr lang="en-US"/>
-              <a:t>Numérisation en fonction de la tension d'entrée</a:t>
+              <a:t>Numérisation en fonction de la tension d'entrée max du CAN (pulse en volts) </a:t>
             </a:r>
           </a:p>
         </c:rich>
@@ -10535,11 +12104,11 @@
           <c:showPercent val="0"/>
           <c:showBubbleSize val="0"/>
         </c:dLbls>
-        <c:axId val="418443568"/>
-        <c:axId val="418442000"/>
+        <c:axId val="328861208"/>
+        <c:axId val="328863168"/>
       </c:scatterChart>
       <c:valAx>
-        <c:axId val="418443568"/>
+        <c:axId val="328861208"/>
         <c:scaling>
           <c:orientation val="minMax"/>
         </c:scaling>
@@ -10659,12 +12228,12 @@
             <a:endParaRPr lang="fr-FR"/>
           </a:p>
         </c:txPr>
-        <c:crossAx val="418442000"/>
+        <c:crossAx val="328863168"/>
         <c:crosses val="autoZero"/>
         <c:crossBetween val="midCat"/>
       </c:valAx>
       <c:valAx>
-        <c:axId val="418442000"/>
+        <c:axId val="328863168"/>
         <c:scaling>
           <c:orientation val="minMax"/>
         </c:scaling>
@@ -10776,7 +12345,7 @@
             <a:endParaRPr lang="fr-FR"/>
           </a:p>
         </c:txPr>
-        <c:crossAx val="418443568"/>
+        <c:crossAx val="328861208"/>
         <c:crosses val="autoZero"/>
         <c:crossBetween val="midCat"/>
       </c:valAx>
@@ -10874,13 +12443,27 @@
           <a:bodyPr rot="0" spcFirstLastPara="1" vertOverflow="ellipsis" vert="horz" wrap="square" anchor="ctr" anchorCtr="1"/>
           <a:lstStyle/>
           <a:p>
-            <a:pPr>
+            <a:pPr marL="0" marR="0" indent="0" algn="ctr" defTabSz="914400" rtl="0" eaLnBrk="1" fontAlgn="auto" latinLnBrk="0" hangingPunct="1">
+              <a:lnSpc>
+                <a:spcPct val="100000"/>
+              </a:lnSpc>
+              <a:spcBef>
+                <a:spcPts val="0"/>
+              </a:spcBef>
+              <a:spcAft>
+                <a:spcPts val="0"/>
+              </a:spcAft>
+              <a:buClrTx/>
+              <a:buSzTx/>
+              <a:buFontTx/>
+              <a:buNone/>
+              <a:tabLst/>
               <a:defRPr sz="1400" b="0" i="0" u="none" strike="noStrike" kern="1200" spc="0" baseline="0">
                 <a:solidFill>
-                  <a:schemeClr val="tx1">
+                  <a:sysClr val="windowText" lastClr="000000">
                     <a:lumMod val="65000"/>
                     <a:lumOff val="35000"/>
-                  </a:schemeClr>
+                  </a:sysClr>
                 </a:solidFill>
                 <a:latin typeface="+mn-lt"/>
                 <a:ea typeface="+mn-ea"/>
@@ -10888,17 +12471,52 @@
               </a:defRPr>
             </a:pPr>
             <a:r>
-              <a:rPr lang="fr-FR"/>
-              <a:t>Sortie du filtre en fonction</a:t>
+              <a:rPr lang="fr-FR" sz="1800" b="0" i="0" baseline="0">
+                <a:effectLst/>
+              </a:rPr>
+              <a:t>Sortie du filtre numérique en fonction du temps pour plusieurs niveau "shaper"</a:t>
             </a:r>
-            <a:r>
-              <a:rPr lang="fr-FR" baseline="0"/>
-              <a:t> de l'entrée du shaper</a:t>
-            </a:r>
+            <a:endParaRPr lang="fr-FR">
+              <a:effectLst/>
+            </a:endParaRPr>
+          </a:p>
+          <a:p>
+            <a:pPr marL="0" marR="0" indent="0" algn="ctr" defTabSz="914400" rtl="0" eaLnBrk="1" fontAlgn="auto" latinLnBrk="0" hangingPunct="1">
+              <a:lnSpc>
+                <a:spcPct val="100000"/>
+              </a:lnSpc>
+              <a:spcBef>
+                <a:spcPts val="0"/>
+              </a:spcBef>
+              <a:spcAft>
+                <a:spcPts val="0"/>
+              </a:spcAft>
+              <a:buClrTx/>
+              <a:buSzTx/>
+              <a:buFontTx/>
+              <a:buNone/>
+              <a:tabLst/>
+              <a:defRPr>
+                <a:solidFill>
+                  <a:sysClr val="windowText" lastClr="000000">
+                    <a:lumMod val="65000"/>
+                    <a:lumOff val="35000"/>
+                  </a:sysClr>
+                </a:solidFill>
+              </a:defRPr>
+            </a:pPr>
             <a:endParaRPr lang="fr-FR"/>
           </a:p>
         </c:rich>
       </c:tx>
+      <c:layout>
+        <c:manualLayout>
+          <c:xMode val="edge"/>
+          <c:yMode val="edge"/>
+          <c:x val="0.16384274640088597"/>
+          <c:y val="1.4958863126402393E-2"/>
+        </c:manualLayout>
+      </c:layout>
       <c:overlay val="0"/>
       <c:spPr>
         <a:noFill/>
@@ -10911,13 +12529,27 @@
         <a:bodyPr rot="0" spcFirstLastPara="1" vertOverflow="ellipsis" vert="horz" wrap="square" anchor="ctr" anchorCtr="1"/>
         <a:lstStyle/>
         <a:p>
-          <a:pPr>
+          <a:pPr marL="0" marR="0" indent="0" algn="ctr" defTabSz="914400" rtl="0" eaLnBrk="1" fontAlgn="auto" latinLnBrk="0" hangingPunct="1">
+            <a:lnSpc>
+              <a:spcPct val="100000"/>
+            </a:lnSpc>
+            <a:spcBef>
+              <a:spcPts val="0"/>
+            </a:spcBef>
+            <a:spcAft>
+              <a:spcPts val="0"/>
+            </a:spcAft>
+            <a:buClrTx/>
+            <a:buSzTx/>
+            <a:buFontTx/>
+            <a:buNone/>
+            <a:tabLst/>
             <a:defRPr sz="1400" b="0" i="0" u="none" strike="noStrike" kern="1200" spc="0" baseline="0">
               <a:solidFill>
-                <a:schemeClr val="tx1">
+                <a:sysClr val="windowText" lastClr="000000">
                   <a:lumMod val="65000"/>
                   <a:lumOff val="35000"/>
-                </a:schemeClr>
+                </a:sysClr>
               </a:solidFill>
               <a:latin typeface="+mn-lt"/>
               <a:ea typeface="+mn-ea"/>
@@ -13366,11 +14998,11 @@
           <c:showPercent val="0"/>
           <c:showBubbleSize val="0"/>
         </c:dLbls>
-        <c:axId val="418444744"/>
-        <c:axId val="418445528"/>
+        <c:axId val="328859640"/>
+        <c:axId val="328856112"/>
       </c:scatterChart>
       <c:valAx>
-        <c:axId val="418444744"/>
+        <c:axId val="328859640"/>
         <c:scaling>
           <c:orientation val="minMax"/>
         </c:scaling>
@@ -13481,12 +15113,12 @@
             <a:endParaRPr lang="fr-FR"/>
           </a:p>
         </c:txPr>
-        <c:crossAx val="418445528"/>
+        <c:crossAx val="328856112"/>
         <c:crosses val="autoZero"/>
         <c:crossBetween val="midCat"/>
       </c:valAx>
       <c:valAx>
-        <c:axId val="418445528"/>
+        <c:axId val="328856112"/>
         <c:scaling>
           <c:orientation val="minMax"/>
         </c:scaling>
@@ -13598,7 +15230,7 @@
             <a:endParaRPr lang="fr-FR"/>
           </a:p>
         </c:txPr>
-        <c:crossAx val="418444744"/>
+        <c:crossAx val="328859640"/>
         <c:crosses val="autoZero"/>
         <c:crossBetween val="midCat"/>
       </c:valAx>
@@ -13781,6 +15413,64 @@
               <a:effectLst/>
             </c:spPr>
           </c:marker>
+          <c:dLbls>
+            <c:spPr>
+              <a:noFill/>
+              <a:ln>
+                <a:noFill/>
+              </a:ln>
+              <a:effectLst/>
+            </c:spPr>
+            <c:txPr>
+              <a:bodyPr rot="0" spcFirstLastPara="1" vertOverflow="ellipsis" vert="horz" wrap="square" lIns="38100" tIns="19050" rIns="38100" bIns="19050" anchor="ctr" anchorCtr="1">
+                <a:spAutoFit/>
+              </a:bodyPr>
+              <a:lstStyle/>
+              <a:p>
+                <a:pPr>
+                  <a:defRPr sz="900" b="0" i="0" u="none" strike="noStrike" kern="1200" baseline="0">
+                    <a:solidFill>
+                      <a:schemeClr val="tx1">
+                        <a:lumMod val="75000"/>
+                        <a:lumOff val="25000"/>
+                      </a:schemeClr>
+                    </a:solidFill>
+                    <a:latin typeface="+mn-lt"/>
+                    <a:ea typeface="+mn-ea"/>
+                    <a:cs typeface="+mn-cs"/>
+                  </a:defRPr>
+                </a:pPr>
+                <a:endParaRPr lang="fr-FR"/>
+              </a:p>
+            </c:txPr>
+            <c:dLblPos val="t"/>
+            <c:showLegendKey val="0"/>
+            <c:showVal val="1"/>
+            <c:showCatName val="1"/>
+            <c:showSerName val="0"/>
+            <c:showPercent val="0"/>
+            <c:showBubbleSize val="0"/>
+            <c:showLeaderLines val="0"/>
+            <c:extLst>
+              <c:ext xmlns:c15="http://schemas.microsoft.com/office/drawing/2012/chart" uri="{CE6537A1-D6FC-4f65-9D91-7224C49458BB}">
+                <c15:showLeaderLines val="1"/>
+                <c15:leaderLines>
+                  <c:spPr>
+                    <a:ln w="9525" cap="flat" cmpd="sng" algn="ctr">
+                      <a:solidFill>
+                        <a:schemeClr val="tx1">
+                          <a:lumMod val="35000"/>
+                          <a:lumOff val="65000"/>
+                        </a:schemeClr>
+                      </a:solidFill>
+                      <a:round/>
+                    </a:ln>
+                    <a:effectLst/>
+                  </c:spPr>
+                </c15:leaderLines>
+              </c:ext>
+            </c:extLst>
+          </c:dLbls>
           <c:xVal>
             <c:numRef>
               <c:f>'@1MSps numérisation'!$D$3:$D$8</c:f>
@@ -13845,11 +15535,11 @@
           <c:showPercent val="0"/>
           <c:showBubbleSize val="0"/>
         </c:dLbls>
-        <c:axId val="418442392"/>
-        <c:axId val="418442784"/>
+        <c:axId val="328858856"/>
+        <c:axId val="328860424"/>
       </c:scatterChart>
       <c:valAx>
-        <c:axId val="418442392"/>
+        <c:axId val="328858856"/>
         <c:scaling>
           <c:orientation val="minMax"/>
         </c:scaling>
@@ -13961,12 +15651,12 @@
             <a:endParaRPr lang="fr-FR"/>
           </a:p>
         </c:txPr>
-        <c:crossAx val="418442784"/>
+        <c:crossAx val="328860424"/>
         <c:crosses val="autoZero"/>
         <c:crossBetween val="midCat"/>
       </c:valAx>
       <c:valAx>
-        <c:axId val="418442784"/>
+        <c:axId val="328860424"/>
         <c:scaling>
           <c:orientation val="minMax"/>
         </c:scaling>
@@ -14078,7 +15768,7 @@
             <a:endParaRPr lang="fr-FR"/>
           </a:p>
         </c:txPr>
-        <c:crossAx val="418442392"/>
+        <c:crossAx val="328858856"/>
         <c:crosses val="autoZero"/>
         <c:crossBetween val="midCat"/>
       </c:valAx>
@@ -14232,6 +15922,64 @@
               <a:effectLst/>
             </c:spPr>
           </c:marker>
+          <c:dLbls>
+            <c:spPr>
+              <a:noFill/>
+              <a:ln>
+                <a:noFill/>
+              </a:ln>
+              <a:effectLst/>
+            </c:spPr>
+            <c:txPr>
+              <a:bodyPr rot="0" spcFirstLastPara="1" vertOverflow="ellipsis" vert="horz" wrap="square" lIns="38100" tIns="19050" rIns="38100" bIns="19050" anchor="ctr" anchorCtr="1">
+                <a:spAutoFit/>
+              </a:bodyPr>
+              <a:lstStyle/>
+              <a:p>
+                <a:pPr>
+                  <a:defRPr sz="900" b="0" i="0" u="none" strike="noStrike" kern="1200" baseline="0">
+                    <a:solidFill>
+                      <a:schemeClr val="tx1">
+                        <a:lumMod val="75000"/>
+                        <a:lumOff val="25000"/>
+                      </a:schemeClr>
+                    </a:solidFill>
+                    <a:latin typeface="+mn-lt"/>
+                    <a:ea typeface="+mn-ea"/>
+                    <a:cs typeface="+mn-cs"/>
+                  </a:defRPr>
+                </a:pPr>
+                <a:endParaRPr lang="fr-FR"/>
+              </a:p>
+            </c:txPr>
+            <c:dLblPos val="t"/>
+            <c:showLegendKey val="0"/>
+            <c:showVal val="1"/>
+            <c:showCatName val="1"/>
+            <c:showSerName val="0"/>
+            <c:showPercent val="0"/>
+            <c:showBubbleSize val="0"/>
+            <c:showLeaderLines val="0"/>
+            <c:extLst>
+              <c:ext xmlns:c15="http://schemas.microsoft.com/office/drawing/2012/chart" uri="{CE6537A1-D6FC-4f65-9D91-7224C49458BB}">
+                <c15:showLeaderLines val="1"/>
+                <c15:leaderLines>
+                  <c:spPr>
+                    <a:ln w="9525" cap="flat" cmpd="sng" algn="ctr">
+                      <a:solidFill>
+                        <a:schemeClr val="tx1">
+                          <a:lumMod val="35000"/>
+                          <a:lumOff val="65000"/>
+                        </a:schemeClr>
+                      </a:solidFill>
+                      <a:round/>
+                    </a:ln>
+                    <a:effectLst/>
+                  </c:spPr>
+                </c15:leaderLines>
+              </c:ext>
+            </c:extLst>
+          </c:dLbls>
           <c:xVal>
             <c:numRef>
               <c:f>'@1MSps'!$A$42:$A$55</c:f>
@@ -14344,11 +16092,11 @@
           <c:showPercent val="0"/>
           <c:showBubbleSize val="0"/>
         </c:dLbls>
-        <c:axId val="410176240"/>
-        <c:axId val="410174672"/>
+        <c:axId val="328865128"/>
+        <c:axId val="328866304"/>
       </c:scatterChart>
       <c:valAx>
-        <c:axId val="410176240"/>
+        <c:axId val="328865128"/>
         <c:scaling>
           <c:orientation val="minMax"/>
         </c:scaling>
@@ -14460,12 +16208,12 @@
             <a:endParaRPr lang="fr-FR"/>
           </a:p>
         </c:txPr>
-        <c:crossAx val="410174672"/>
+        <c:crossAx val="328866304"/>
         <c:crosses val="autoZero"/>
         <c:crossBetween val="midCat"/>
       </c:valAx>
       <c:valAx>
-        <c:axId val="410174672"/>
+        <c:axId val="328866304"/>
         <c:scaling>
           <c:orientation val="minMax"/>
         </c:scaling>
@@ -14577,7 +16325,7 @@
             <a:endParaRPr lang="fr-FR"/>
           </a:p>
         </c:txPr>
-        <c:crossAx val="410176240"/>
+        <c:crossAx val="328865128"/>
         <c:crosses val="autoZero"/>
         <c:crossBetween val="midCat"/>
       </c:valAx>
@@ -17670,7 +19418,7 @@
 </file>
 
 <file path=customXml/itemProps1.xml><?xml version="1.0" encoding="utf-8"?>
-<ds:datastoreItem xmlns:ds="http://schemas.openxmlformats.org/officeDocument/2006/customXml" ds:itemID="{E9A2BAC1-1F66-4E2D-95C1-3C87F1BFA15E}">
+<ds:datastoreItem xmlns:ds="http://schemas.openxmlformats.org/officeDocument/2006/customXml" ds:itemID="{C8ACFD39-B9E0-4B1F-9943-554FC8820F9A}">
   <ds:schemaRefs>
     <ds:schemaRef ds:uri="http://schemas.openxmlformats.org/officeDocument/2006/bibliography"/>
   </ds:schemaRefs>

</xml_diff>

<commit_message>
+mise a jour doc courbe simu vs mesure
</commit_message>
<xml_diff>
--- a/doc/Architecture_resultat_EGSE.docx
+++ b/doc/Architecture_resultat_EGSE.docx
@@ -2676,24 +2676,11 @@
             <w:r>
               <w:t xml:space="preserve">DR </w:t>
             </w:r>
-            <w:r>
-              <w:fldChar w:fldCharType="begin"/>
-            </w:r>
-            <w:r>
-              <w:instrText xml:space="preserve"> SEQ DR \* ARABIC </w:instrText>
-            </w:r>
-            <w:r>
-              <w:fldChar w:fldCharType="separate"/>
-            </w:r>
-            <w:r>
-              <w:rPr>
-                <w:noProof/>
-              </w:rPr>
-              <w:t>1</w:t>
-            </w:r>
-            <w:r>
-              <w:fldChar w:fldCharType="end"/>
-            </w:r>
+            <w:fldSimple w:instr=" SEQ DR \* ARABIC ">
+              <w:r>
+                <w:t>1</w:t>
+              </w:r>
+            </w:fldSimple>
           </w:p>
         </w:tc>
         <w:tc>
@@ -2757,24 +2744,11 @@
             <w:r>
               <w:t xml:space="preserve">DR </w:t>
             </w:r>
-            <w:r>
-              <w:fldChar w:fldCharType="begin"/>
-            </w:r>
-            <w:r>
-              <w:instrText xml:space="preserve"> SEQ DR \* ARABIC </w:instrText>
-            </w:r>
-            <w:r>
-              <w:fldChar w:fldCharType="separate"/>
-            </w:r>
-            <w:r>
-              <w:rPr>
-                <w:noProof/>
-              </w:rPr>
-              <w:t>2</w:t>
-            </w:r>
-            <w:r>
-              <w:fldChar w:fldCharType="end"/>
-            </w:r>
+            <w:fldSimple w:instr=" SEQ DR \* ARABIC ">
+              <w:r>
+                <w:t>2</w:t>
+              </w:r>
+            </w:fldSimple>
           </w:p>
         </w:tc>
         <w:tc>
@@ -2838,24 +2812,11 @@
             <w:r>
               <w:t xml:space="preserve">DR </w:t>
             </w:r>
-            <w:r>
-              <w:fldChar w:fldCharType="begin"/>
-            </w:r>
-            <w:r>
-              <w:instrText xml:space="preserve"> SEQ DR \* ARABIC </w:instrText>
-            </w:r>
-            <w:r>
-              <w:fldChar w:fldCharType="separate"/>
-            </w:r>
-            <w:r>
-              <w:rPr>
-                <w:noProof/>
-              </w:rPr>
-              <w:t>3</w:t>
-            </w:r>
-            <w:r>
-              <w:fldChar w:fldCharType="end"/>
-            </w:r>
+            <w:fldSimple w:instr=" SEQ DR \* ARABIC ">
+              <w:r>
+                <w:t>3</w:t>
+              </w:r>
+            </w:fldSimple>
           </w:p>
         </w:tc>
         <w:tc>
@@ -3102,24 +3063,11 @@
             <w:r>
               <w:t xml:space="preserve">DA </w:t>
             </w:r>
-            <w:r>
-              <w:fldChar w:fldCharType="begin"/>
-            </w:r>
-            <w:r>
-              <w:instrText xml:space="preserve"> SEQ AD \* ARABIC </w:instrText>
-            </w:r>
-            <w:r>
-              <w:fldChar w:fldCharType="separate"/>
-            </w:r>
-            <w:r>
-              <w:rPr>
-                <w:noProof/>
-              </w:rPr>
-              <w:t>1</w:t>
-            </w:r>
-            <w:r>
-              <w:fldChar w:fldCharType="end"/>
-            </w:r>
+            <w:fldSimple w:instr=" SEQ AD \* ARABIC ">
+              <w:r>
+                <w:t>1</w:t>
+              </w:r>
+            </w:fldSimple>
           </w:p>
         </w:tc>
         <w:tc>
@@ -3184,24 +3132,11 @@
             <w:r>
               <w:t xml:space="preserve">DA </w:t>
             </w:r>
-            <w:r>
-              <w:fldChar w:fldCharType="begin"/>
-            </w:r>
-            <w:r>
-              <w:instrText xml:space="preserve"> SEQ AD \* ARABIC </w:instrText>
-            </w:r>
-            <w:r>
-              <w:fldChar w:fldCharType="separate"/>
-            </w:r>
-            <w:r>
-              <w:rPr>
-                <w:noProof/>
-              </w:rPr>
-              <w:t>2</w:t>
-            </w:r>
-            <w:r>
-              <w:fldChar w:fldCharType="end"/>
-            </w:r>
+            <w:fldSimple w:instr=" SEQ AD \* ARABIC ">
+              <w:r>
+                <w:t>2</w:t>
+              </w:r>
+            </w:fldSimple>
           </w:p>
         </w:tc>
         <w:tc>
@@ -3266,24 +3201,11 @@
             <w:r>
               <w:t xml:space="preserve">DA </w:t>
             </w:r>
-            <w:r>
-              <w:fldChar w:fldCharType="begin"/>
-            </w:r>
-            <w:r>
-              <w:instrText xml:space="preserve"> SEQ AD \* ARABIC </w:instrText>
-            </w:r>
-            <w:r>
-              <w:fldChar w:fldCharType="separate"/>
-            </w:r>
-            <w:r>
-              <w:rPr>
-                <w:noProof/>
-              </w:rPr>
-              <w:t>3</w:t>
-            </w:r>
-            <w:r>
-              <w:fldChar w:fldCharType="end"/>
-            </w:r>
+            <w:fldSimple w:instr=" SEQ AD \* ARABIC ">
+              <w:r>
+                <w:t>3</w:t>
+              </w:r>
+            </w:fldSimple>
           </w:p>
         </w:tc>
         <w:tc>
@@ -3423,7 +3345,7 @@
         </w:rPr>
         <w:fldChar w:fldCharType="separate"/>
       </w:r>
-      <w:hyperlink w:anchor="_Toc175154801" w:history="1">
+      <w:hyperlink w:anchor="_Toc175216544" w:history="1">
         <w:r>
           <w:rPr>
             <w:rStyle w:val="Lienhypertexte"/>
@@ -3471,7 +3393,7 @@
             <w:noProof/>
             <w:webHidden/>
           </w:rPr>
-          <w:instrText xml:space="preserve"> PAGEREF _Toc175154801 \h </w:instrText>
+          <w:instrText xml:space="preserve"> PAGEREF _Toc175216544 \h </w:instrText>
         </w:r>
         <w:r>
           <w:rPr>
@@ -3519,7 +3441,7 @@
           <w:lang w:val="fr-FR"/>
         </w:rPr>
       </w:pPr>
-      <w:hyperlink w:anchor="_Toc175154802" w:history="1">
+      <w:hyperlink w:anchor="_Toc175216545" w:history="1">
         <w:r>
           <w:rPr>
             <w:rStyle w:val="Lienhypertexte"/>
@@ -3567,7 +3489,7 @@
             <w:noProof/>
             <w:webHidden/>
           </w:rPr>
-          <w:instrText xml:space="preserve"> PAGEREF _Toc175154802 \h </w:instrText>
+          <w:instrText xml:space="preserve"> PAGEREF _Toc175216545 \h </w:instrText>
         </w:r>
         <w:r>
           <w:rPr>
@@ -3615,7 +3537,7 @@
           <w:lang w:val="fr-FR"/>
         </w:rPr>
       </w:pPr>
-      <w:hyperlink w:anchor="_Toc175154803" w:history="1">
+      <w:hyperlink w:anchor="_Toc175216546" w:history="1">
         <w:r>
           <w:rPr>
             <w:rStyle w:val="Lienhypertexte"/>
@@ -3663,7 +3585,7 @@
             <w:noProof/>
             <w:webHidden/>
           </w:rPr>
-          <w:instrText xml:space="preserve"> PAGEREF _Toc175154803 \h </w:instrText>
+          <w:instrText xml:space="preserve"> PAGEREF _Toc175216546 \h </w:instrText>
         </w:r>
         <w:r>
           <w:rPr>
@@ -3710,7 +3632,7 @@
           <w:lang w:val="fr-FR"/>
         </w:rPr>
       </w:pPr>
-      <w:hyperlink w:anchor="_Toc175154804" w:history="1">
+      <w:hyperlink w:anchor="_Toc175216547" w:history="1">
         <w:r>
           <w:rPr>
             <w:rStyle w:val="Lienhypertexte"/>
@@ -3757,7 +3679,7 @@
             <w:noProof/>
             <w:webHidden/>
           </w:rPr>
-          <w:instrText xml:space="preserve"> PAGEREF _Toc175154804 \h </w:instrText>
+          <w:instrText xml:space="preserve"> PAGEREF _Toc175216547 \h </w:instrText>
         </w:r>
         <w:r>
           <w:rPr>
@@ -3804,7 +3726,7 @@
           <w:lang w:val="fr-FR"/>
         </w:rPr>
       </w:pPr>
-      <w:hyperlink w:anchor="_Toc175154805" w:history="1">
+      <w:hyperlink w:anchor="_Toc175216548" w:history="1">
         <w:r>
           <w:rPr>
             <w:rStyle w:val="Lienhypertexte"/>
@@ -3851,7 +3773,7 @@
             <w:noProof/>
             <w:webHidden/>
           </w:rPr>
-          <w:instrText xml:space="preserve"> PAGEREF _Toc175154805 \h </w:instrText>
+          <w:instrText xml:space="preserve"> PAGEREF _Toc175216548 \h </w:instrText>
         </w:r>
         <w:r>
           <w:rPr>
@@ -3898,7 +3820,7 @@
           <w:lang w:val="fr-FR"/>
         </w:rPr>
       </w:pPr>
-      <w:hyperlink w:anchor="_Toc175154806" w:history="1">
+      <w:hyperlink w:anchor="_Toc175216549" w:history="1">
         <w:r>
           <w:rPr>
             <w:rStyle w:val="Lienhypertexte"/>
@@ -3945,7 +3867,7 @@
             <w:noProof/>
             <w:webHidden/>
           </w:rPr>
-          <w:instrText xml:space="preserve"> PAGEREF _Toc175154806 \h </w:instrText>
+          <w:instrText xml:space="preserve"> PAGEREF _Toc175216549 \h </w:instrText>
         </w:r>
         <w:r>
           <w:rPr>
@@ -3993,7 +3915,7 @@
           <w:lang w:val="fr-FR"/>
         </w:rPr>
       </w:pPr>
-      <w:hyperlink w:anchor="_Toc175154807" w:history="1">
+      <w:hyperlink w:anchor="_Toc175216550" w:history="1">
         <w:r>
           <w:rPr>
             <w:rStyle w:val="Lienhypertexte"/>
@@ -4041,7 +3963,7 @@
             <w:noProof/>
             <w:webHidden/>
           </w:rPr>
-          <w:instrText xml:space="preserve"> PAGEREF _Toc175154807 \h </w:instrText>
+          <w:instrText xml:space="preserve"> PAGEREF _Toc175216550 \h </w:instrText>
         </w:r>
         <w:r>
           <w:rPr>
@@ -4088,7 +4010,7 @@
           <w:lang w:val="fr-FR"/>
         </w:rPr>
       </w:pPr>
-      <w:hyperlink w:anchor="_Toc175154808" w:history="1">
+      <w:hyperlink w:anchor="_Toc175216551" w:history="1">
         <w:r>
           <w:rPr>
             <w:rStyle w:val="Lienhypertexte"/>
@@ -4135,7 +4057,7 @@
             <w:noProof/>
             <w:webHidden/>
           </w:rPr>
-          <w:instrText xml:space="preserve"> PAGEREF _Toc175154808 \h </w:instrText>
+          <w:instrText xml:space="preserve"> PAGEREF _Toc175216551 \h </w:instrText>
         </w:r>
         <w:r>
           <w:rPr>
@@ -4182,7 +4104,7 @@
           <w:lang w:val="fr-FR"/>
         </w:rPr>
       </w:pPr>
-      <w:hyperlink w:anchor="_Toc175154809" w:history="1">
+      <w:hyperlink w:anchor="_Toc175216552" w:history="1">
         <w:r>
           <w:rPr>
             <w:rStyle w:val="Lienhypertexte"/>
@@ -4229,7 +4151,7 @@
             <w:noProof/>
             <w:webHidden/>
           </w:rPr>
-          <w:instrText xml:space="preserve"> PAGEREF _Toc175154809 \h </w:instrText>
+          <w:instrText xml:space="preserve"> PAGEREF _Toc175216552 \h </w:instrText>
         </w:r>
         <w:r>
           <w:rPr>
@@ -4276,7 +4198,7 @@
           <w:lang w:val="fr-FR"/>
         </w:rPr>
       </w:pPr>
-      <w:hyperlink w:anchor="_Toc175154810" w:history="1">
+      <w:hyperlink w:anchor="_Toc175216553" w:history="1">
         <w:r>
           <w:rPr>
             <w:rStyle w:val="Lienhypertexte"/>
@@ -4323,7 +4245,7 @@
             <w:noProof/>
             <w:webHidden/>
           </w:rPr>
-          <w:instrText xml:space="preserve"> PAGEREF _Toc175154810 \h </w:instrText>
+          <w:instrText xml:space="preserve"> PAGEREF _Toc175216553 \h </w:instrText>
         </w:r>
         <w:r>
           <w:rPr>
@@ -4370,7 +4292,7 @@
           <w:lang w:val="fr-FR"/>
         </w:rPr>
       </w:pPr>
-      <w:hyperlink w:anchor="_Toc175154811" w:history="1">
+      <w:hyperlink w:anchor="_Toc175216554" w:history="1">
         <w:r>
           <w:rPr>
             <w:rStyle w:val="Lienhypertexte"/>
@@ -4417,7 +4339,7 @@
             <w:noProof/>
             <w:webHidden/>
           </w:rPr>
-          <w:instrText xml:space="preserve"> PAGEREF _Toc175154811 \h </w:instrText>
+          <w:instrText xml:space="preserve"> PAGEREF _Toc175216554 \h </w:instrText>
         </w:r>
         <w:r>
           <w:rPr>
@@ -4464,7 +4386,7 @@
           <w:lang w:val="fr-FR"/>
         </w:rPr>
       </w:pPr>
-      <w:hyperlink w:anchor="_Toc175154812" w:history="1">
+      <w:hyperlink w:anchor="_Toc175216555" w:history="1">
         <w:r>
           <w:rPr>
             <w:rStyle w:val="Lienhypertexte"/>
@@ -4511,7 +4433,7 @@
             <w:noProof/>
             <w:webHidden/>
           </w:rPr>
-          <w:instrText xml:space="preserve"> PAGEREF _Toc175154812 \h </w:instrText>
+          <w:instrText xml:space="preserve"> PAGEREF _Toc175216555 \h </w:instrText>
         </w:r>
         <w:r>
           <w:rPr>
@@ -4559,7 +4481,7 @@
           <w:lang w:val="fr-FR"/>
         </w:rPr>
       </w:pPr>
-      <w:hyperlink w:anchor="_Toc175154813" w:history="1">
+      <w:hyperlink w:anchor="_Toc175216556" w:history="1">
         <w:r>
           <w:rPr>
             <w:rStyle w:val="Lienhypertexte"/>
@@ -4586,7 +4508,7 @@
             <w:noProof/>
             <w:lang w:val="fr-FR"/>
           </w:rPr>
-          <w:t>Simulation filtre RIF et résultat du pique du spectre</w:t>
+          <w:t>Simulation du filtre RIF et résultat maximum du spectre</w:t>
         </w:r>
         <w:r>
           <w:rPr>
@@ -4607,7 +4529,7 @@
             <w:noProof/>
             <w:webHidden/>
           </w:rPr>
-          <w:instrText xml:space="preserve"> PAGEREF _Toc175154813 \h </w:instrText>
+          <w:instrText xml:space="preserve"> PAGEREF _Toc175216556 \h </w:instrText>
         </w:r>
         <w:r>
           <w:rPr>
@@ -4654,7 +4576,7 @@
           <w:lang w:val="fr-FR"/>
         </w:rPr>
       </w:pPr>
-      <w:hyperlink w:anchor="_Toc175154814" w:history="1">
+      <w:hyperlink w:anchor="_Toc175216557" w:history="1">
         <w:r>
           <w:rPr>
             <w:rStyle w:val="Lienhypertexte"/>
@@ -4680,7 +4602,7 @@
             <w:noProof/>
             <w:lang w:val="fr-FR"/>
           </w:rPr>
-          <w:t>Simulation avec une tension entrée “shaper” 950 mV</w:t>
+          <w:t>Simulation avec une tension entrée analogique “shaper” 950 millivolts</w:t>
         </w:r>
         <w:r>
           <w:rPr>
@@ -4701,7 +4623,7 @@
             <w:noProof/>
             <w:webHidden/>
           </w:rPr>
-          <w:instrText xml:space="preserve"> PAGEREF _Toc175154814 \h </w:instrText>
+          <w:instrText xml:space="preserve"> PAGEREF _Toc175216557 \h </w:instrText>
         </w:r>
         <w:r>
           <w:rPr>
@@ -4748,7 +4670,7 @@
           <w:lang w:val="fr-FR"/>
         </w:rPr>
       </w:pPr>
-      <w:hyperlink w:anchor="_Toc175154815" w:history="1">
+      <w:hyperlink w:anchor="_Toc175216558" w:history="1">
         <w:r>
           <w:rPr>
             <w:rStyle w:val="Lienhypertexte"/>
@@ -4774,7 +4696,7 @@
             <w:noProof/>
             <w:lang w:val="fr-FR"/>
           </w:rPr>
-          <w:t>Simulation avec une tension entrée “shaper” 850 mV</w:t>
+          <w:t>Simulation avec une tension entrée analogique “shaper” 850 millivolts</w:t>
         </w:r>
         <w:r>
           <w:rPr>
@@ -4795,7 +4717,7 @@
             <w:noProof/>
             <w:webHidden/>
           </w:rPr>
-          <w:instrText xml:space="preserve"> PAGEREF _Toc175154815 \h </w:instrText>
+          <w:instrText xml:space="preserve"> PAGEREF _Toc175216558 \h </w:instrText>
         </w:r>
         <w:r>
           <w:rPr>
@@ -4842,7 +4764,7 @@
           <w:lang w:val="fr-FR"/>
         </w:rPr>
       </w:pPr>
-      <w:hyperlink w:anchor="_Toc175154816" w:history="1">
+      <w:hyperlink w:anchor="_Toc175216559" w:history="1">
         <w:r>
           <w:rPr>
             <w:rStyle w:val="Lienhypertexte"/>
@@ -4868,7 +4790,7 @@
             <w:noProof/>
             <w:lang w:val="fr-FR"/>
           </w:rPr>
-          <w:t>Simulation avec une tension entrée “shaper” 430 mV</w:t>
+          <w:t>Simulation avec une tension entrée analogique “shaper” 650 millivolts</w:t>
         </w:r>
         <w:r>
           <w:rPr>
@@ -4889,7 +4811,7 @@
             <w:noProof/>
             <w:webHidden/>
           </w:rPr>
-          <w:instrText xml:space="preserve"> PAGEREF _Toc175154816 \h </w:instrText>
+          <w:instrText xml:space="preserve"> PAGEREF _Toc175216559 \h </w:instrText>
         </w:r>
         <w:r>
           <w:rPr>
@@ -4936,7 +4858,7 @@
           <w:lang w:val="fr-FR"/>
         </w:rPr>
       </w:pPr>
-      <w:hyperlink w:anchor="_Toc175154817" w:history="1">
+      <w:hyperlink w:anchor="_Toc175216560" w:history="1">
         <w:r>
           <w:rPr>
             <w:rStyle w:val="Lienhypertexte"/>
@@ -4962,7 +4884,7 @@
             <w:noProof/>
             <w:lang w:val="fr-FR"/>
           </w:rPr>
-          <w:t>Simulation avec une tension entrée “shaper” 350 mV</w:t>
+          <w:t>Simulation avec une tension entrée analogique “shaper” 430 millivolts</w:t>
         </w:r>
         <w:r>
           <w:rPr>
@@ -4983,7 +4905,7 @@
             <w:noProof/>
             <w:webHidden/>
           </w:rPr>
-          <w:instrText xml:space="preserve"> PAGEREF _Toc175154817 \h </w:instrText>
+          <w:instrText xml:space="preserve"> PAGEREF _Toc175216560 \h </w:instrText>
         </w:r>
         <w:r>
           <w:rPr>
@@ -5030,14 +4952,14 @@
           <w:lang w:val="fr-FR"/>
         </w:rPr>
       </w:pPr>
-      <w:hyperlink w:anchor="_Toc175154818" w:history="1">
+      <w:hyperlink w:anchor="_Toc175216561" w:history="1">
         <w:r>
           <w:rPr>
             <w:rStyle w:val="Lienhypertexte"/>
             <w:noProof/>
             <w:lang w:val="fr-FR"/>
           </w:rPr>
-          <w:t>5.1.</w:t>
+          <w:t>5.3.</w:t>
         </w:r>
         <w:r>
           <w:rPr>
@@ -5056,7 +4978,7 @@
             <w:noProof/>
             <w:lang w:val="fr-FR"/>
           </w:rPr>
-          <w:t>Simulation avec une tension entrée “shaper” 90 mV</w:t>
+          <w:t>Simulation avec une tension entrée analogique “shaper” 350 millivolts</w:t>
         </w:r>
         <w:r>
           <w:rPr>
@@ -5077,7 +4999,7 @@
             <w:noProof/>
             <w:webHidden/>
           </w:rPr>
-          <w:instrText xml:space="preserve"> PAGEREF _Toc175154818 \h </w:instrText>
+          <w:instrText xml:space="preserve"> PAGEREF _Toc175216561 \h </w:instrText>
         </w:r>
         <w:r>
           <w:rPr>
@@ -5110,6 +5032,194 @@
     </w:p>
     <w:p>
       <w:pPr>
+        <w:pStyle w:val="TM2"/>
+        <w:tabs>
+          <w:tab w:val="left" w:pos="960"/>
+          <w:tab w:val="right" w:leader="dot" w:pos="9622"/>
+        </w:tabs>
+        <w:rPr>
+          <w:rFonts w:asciiTheme="minorHAnsi" w:eastAsiaTheme="minorEastAsia" w:hAnsiTheme="minorHAnsi" w:cstheme="minorBidi"/>
+          <w:smallCaps w:val="0"/>
+          <w:noProof/>
+          <w:sz w:val="22"/>
+          <w:szCs w:val="22"/>
+          <w:lang w:val="fr-FR"/>
+        </w:rPr>
+      </w:pPr>
+      <w:hyperlink w:anchor="_Toc175216562" w:history="1">
+        <w:r>
+          <w:rPr>
+            <w:rStyle w:val="Lienhypertexte"/>
+            <w:noProof/>
+            <w:lang w:val="fr-FR"/>
+          </w:rPr>
+          <w:t>5.1.</w:t>
+        </w:r>
+        <w:r>
+          <w:rPr>
+            <w:rFonts w:asciiTheme="minorHAnsi" w:eastAsiaTheme="minorEastAsia" w:hAnsiTheme="minorHAnsi" w:cstheme="minorBidi"/>
+            <w:smallCaps w:val="0"/>
+            <w:noProof/>
+            <w:sz w:val="22"/>
+            <w:szCs w:val="22"/>
+            <w:lang w:val="fr-FR"/>
+          </w:rPr>
+          <w:tab/>
+        </w:r>
+        <w:r>
+          <w:rPr>
+            <w:rStyle w:val="Lienhypertexte"/>
+            <w:noProof/>
+            <w:lang w:val="fr-FR"/>
+          </w:rPr>
+          <w:t>Simulation avec une tension entrée analogique “shaper” 90 millivolts</w:t>
+        </w:r>
+        <w:r>
+          <w:rPr>
+            <w:noProof/>
+            <w:webHidden/>
+          </w:rPr>
+          <w:tab/>
+        </w:r>
+        <w:r>
+          <w:rPr>
+            <w:noProof/>
+            <w:webHidden/>
+          </w:rPr>
+          <w:fldChar w:fldCharType="begin"/>
+        </w:r>
+        <w:r>
+          <w:rPr>
+            <w:noProof/>
+            <w:webHidden/>
+          </w:rPr>
+          <w:instrText xml:space="preserve"> PAGEREF _Toc175216562 \h </w:instrText>
+        </w:r>
+        <w:r>
+          <w:rPr>
+            <w:noProof/>
+            <w:webHidden/>
+          </w:rPr>
+        </w:r>
+        <w:r>
+          <w:rPr>
+            <w:noProof/>
+            <w:webHidden/>
+          </w:rPr>
+          <w:fldChar w:fldCharType="separate"/>
+        </w:r>
+        <w:r>
+          <w:rPr>
+            <w:noProof/>
+            <w:webHidden/>
+          </w:rPr>
+          <w:t>12</w:t>
+        </w:r>
+        <w:r>
+          <w:rPr>
+            <w:noProof/>
+            <w:webHidden/>
+          </w:rPr>
+          <w:fldChar w:fldCharType="end"/>
+        </w:r>
+      </w:hyperlink>
+    </w:p>
+    <w:p>
+      <w:pPr>
+        <w:pStyle w:val="TM2"/>
+        <w:tabs>
+          <w:tab w:val="left" w:pos="960"/>
+          <w:tab w:val="right" w:leader="dot" w:pos="9622"/>
+        </w:tabs>
+        <w:rPr>
+          <w:rFonts w:asciiTheme="minorHAnsi" w:eastAsiaTheme="minorEastAsia" w:hAnsiTheme="minorHAnsi" w:cstheme="minorBidi"/>
+          <w:smallCaps w:val="0"/>
+          <w:noProof/>
+          <w:sz w:val="22"/>
+          <w:szCs w:val="22"/>
+          <w:lang w:val="fr-FR"/>
+        </w:rPr>
+      </w:pPr>
+      <w:hyperlink w:anchor="_Toc175216563" w:history="1">
+        <w:r>
+          <w:rPr>
+            <w:rStyle w:val="Lienhypertexte"/>
+            <w:noProof/>
+            <w:lang w:val="fr-FR"/>
+          </w:rPr>
+          <w:t>5.2.</w:t>
+        </w:r>
+        <w:r>
+          <w:rPr>
+            <w:rFonts w:asciiTheme="minorHAnsi" w:eastAsiaTheme="minorEastAsia" w:hAnsiTheme="minorHAnsi" w:cstheme="minorBidi"/>
+            <w:smallCaps w:val="0"/>
+            <w:noProof/>
+            <w:sz w:val="22"/>
+            <w:szCs w:val="22"/>
+            <w:lang w:val="fr-FR"/>
+          </w:rPr>
+          <w:tab/>
+        </w:r>
+        <w:r>
+          <w:rPr>
+            <w:rStyle w:val="Lienhypertexte"/>
+            <w:noProof/>
+            <w:lang w:val="fr-FR"/>
+          </w:rPr>
+          <w:t>Comparaison du spectre max mesuré et spectre max issu de la simulation</w:t>
+        </w:r>
+        <w:r>
+          <w:rPr>
+            <w:noProof/>
+            <w:webHidden/>
+          </w:rPr>
+          <w:tab/>
+        </w:r>
+        <w:r>
+          <w:rPr>
+            <w:noProof/>
+            <w:webHidden/>
+          </w:rPr>
+          <w:fldChar w:fldCharType="begin"/>
+        </w:r>
+        <w:r>
+          <w:rPr>
+            <w:noProof/>
+            <w:webHidden/>
+          </w:rPr>
+          <w:instrText xml:space="preserve"> PAGEREF _Toc175216563 \h </w:instrText>
+        </w:r>
+        <w:r>
+          <w:rPr>
+            <w:noProof/>
+            <w:webHidden/>
+          </w:rPr>
+        </w:r>
+        <w:r>
+          <w:rPr>
+            <w:noProof/>
+            <w:webHidden/>
+          </w:rPr>
+          <w:fldChar w:fldCharType="separate"/>
+        </w:r>
+        <w:r>
+          <w:rPr>
+            <w:noProof/>
+            <w:webHidden/>
+          </w:rPr>
+          <w:t>13</w:t>
+        </w:r>
+        <w:r>
+          <w:rPr>
+            <w:noProof/>
+            <w:webHidden/>
+          </w:rPr>
+          <w:fldChar w:fldCharType="end"/>
+        </w:r>
+      </w:hyperlink>
+    </w:p>
+    <w:p>
+      <w:pPr>
         <w:spacing w:line="240" w:lineRule="exact"/>
       </w:pPr>
       <w:r>
@@ -5123,8 +5233,6 @@
       <w:r>
         <w:br w:type="page"/>
       </w:r>
-      <w:bookmarkStart w:id="0" w:name="_GoBack"/>
-      <w:bookmarkEnd w:id="0"/>
     </w:p>
     <w:p>
       <w:pPr>
@@ -5133,7 +5241,7 @@
           <w:lang w:val="fr-FR"/>
         </w:rPr>
       </w:pPr>
-      <w:bookmarkStart w:id="1" w:name="_Toc175154801"/>
+      <w:bookmarkStart w:id="0" w:name="_Toc175216544"/>
       <w:r>
         <w:rPr>
           <w:lang w:val="fr-FR"/>
@@ -5147,7 +5255,7 @@
         </w:rPr>
         <w:t xml:space="preserve"> de l'EGSE</w:t>
       </w:r>
-      <w:bookmarkEnd w:id="1"/>
+      <w:bookmarkEnd w:id="0"/>
     </w:p>
     <w:p>
       <w:pPr>
@@ -5228,14 +5336,14 @@
           <w:lang w:val="fr-FR"/>
         </w:rPr>
       </w:pPr>
-      <w:bookmarkStart w:id="2" w:name="_Toc175154802"/>
+      <w:bookmarkStart w:id="1" w:name="_Toc175216545"/>
       <w:r>
         <w:rPr>
           <w:lang w:val="fr-FR"/>
         </w:rPr>
         <w:t>Un schéma bloc de l'EGSE</w:t>
       </w:r>
-      <w:bookmarkEnd w:id="2"/>
+      <w:bookmarkEnd w:id="1"/>
     </w:p>
     <w:p>
       <w:pPr>
@@ -5295,11 +5403,14 @@
         <w:jc w:val="center"/>
       </w:pPr>
       <w:r>
+        <w:rPr>
+          <w:noProof/>
+        </w:rPr>
         <w:drawing>
-          <wp:inline distT="0" distB="0" distL="0" distR="0" wp14:anchorId="37A99010" wp14:editId="01959519">
-            <wp:extent cx="5723965" cy="3380182"/>
-            <wp:effectExtent l="0" t="0" r="0" b="0"/>
-            <wp:docPr id="5" name="Image 5"/>
+          <wp:inline distT="0" distB="0" distL="0" distR="0" wp14:anchorId="621BB128" wp14:editId="25081BE5">
+            <wp:extent cx="6116320" cy="3077845"/>
+            <wp:effectExtent l="0" t="0" r="0" b="8255"/>
+            <wp:docPr id="20" name="Image 20"/>
             <wp:cNvGraphicFramePr>
               <a:graphicFrameLocks xmlns:a="http://schemas.openxmlformats.org/drawingml/2006/main" noChangeAspect="1"/>
             </wp:cNvGraphicFramePr>
@@ -5319,7 +5430,7 @@
                   <pic:spPr>
                     <a:xfrm>
                       <a:off x="0" y="0"/>
-                      <a:ext cx="5764175" cy="3403928"/>
+                      <a:ext cx="6116320" cy="3077845"/>
                     </a:xfrm>
                     <a:prstGeom prst="rect">
                       <a:avLst/>
@@ -5331,6 +5442,8 @@
           </wp:inline>
         </w:drawing>
       </w:r>
+      <w:bookmarkStart w:id="2" w:name="_GoBack"/>
+      <w:bookmarkEnd w:id="2"/>
     </w:p>
     <w:p>
       <w:pPr>
@@ -5344,11 +5457,12 @@
           <w:lang w:val="fr-FR"/>
         </w:rPr>
       </w:pPr>
-      <w:bookmarkStart w:id="3" w:name="_Toc175154803"/>
+      <w:bookmarkStart w:id="3" w:name="_Toc175216546"/>
       <w:r>
         <w:rPr>
           <w:lang w:val="fr-FR"/>
         </w:rPr>
+        <w:lastRenderedPageBreak/>
         <w:t>fonctionnalite de l’egse</w:t>
       </w:r>
       <w:bookmarkEnd w:id="3"/>
@@ -5380,7 +5494,7 @@
           <w:lang w:val="fr-FR"/>
         </w:rPr>
       </w:pPr>
-      <w:bookmarkStart w:id="4" w:name="_Toc175154804"/>
+      <w:bookmarkStart w:id="4" w:name="_Toc175216547"/>
       <w:r>
         <w:rPr>
           <w:lang w:val="fr-FR"/>
@@ -5449,7 +5563,7 @@
             <v:path o:extrusionok="f" gradientshapeok="t" o:connecttype="rect"/>
             <o:lock v:ext="edit" aspectratio="t"/>
           </v:shapetype>
-          <v:shape id="_x0000_i1025" type="#_x0000_t75" style="width:452.25pt;height:232.5pt">
+          <v:shape id="_x0000_i1025" type="#_x0000_t75" style="width:453.6pt;height:230.4pt">
             <v:imagedata r:id="rId10" o:title="Capture"/>
           </v:shape>
         </w:pict>
@@ -5462,7 +5576,7 @@
           <w:lang w:val="fr-FR"/>
         </w:rPr>
       </w:pPr>
-      <w:bookmarkStart w:id="5" w:name="_Toc175154805"/>
+      <w:bookmarkStart w:id="5" w:name="_Toc175216548"/>
       <w:r>
         <w:rPr>
           <w:lang w:val="fr-FR"/>
@@ -5545,7 +5659,7 @@
           <w:lang w:val="fr-FR"/>
         </w:rPr>
       </w:pPr>
-      <w:bookmarkStart w:id="6" w:name="_Toc175154806"/>
+      <w:bookmarkStart w:id="6" w:name="_Toc175216549"/>
       <w:r>
         <w:rPr>
           <w:lang w:val="fr-FR"/>
@@ -5588,10 +5702,7 @@
         <w:t xml:space="preserve"> 1 »</w:t>
       </w:r>
       <w:r>
-        <w:t xml:space="preserve">, filtre </w:t>
-      </w:r>
-      <w:r>
-        <w:t>passe-bande</w:t>
+        <w:t>, filtre passe-bande</w:t>
       </w:r>
       <w:r>
         <w:t xml:space="preserve"> à</w:t>
@@ -5649,22 +5760,7 @@
     </w:p>
     <w:p>
       <w:r>
-        <w:t>Toutes les fonctions de transfert et graphe temporelle de la partie 4</w:t>
-      </w:r>
-      <w:r>
-        <w:t xml:space="preserve"> qui suit</w:t>
-      </w:r>
-      <w:r>
-        <w:t xml:space="preserve"> </w:t>
-      </w:r>
-      <w:r>
-        <w:t xml:space="preserve">son issue d’une configuration </w:t>
-      </w:r>
-      <w:r>
-        <w:t>filtre passe-bande large</w:t>
-      </w:r>
-      <w:r>
-        <w:t xml:space="preserve"> avec un gain de deux afin d’exploiter au mieux</w:t>
+        <w:t>Toutes les fonctions de transfert et graphe temporelle de la partie 4 qui suit son issue d’une configuration filtre passe-bande large avec un gain de deux afin d’exploiter au mieux</w:t>
       </w:r>
       <w:r>
         <w:t xml:space="preserve"> la dynamique des canaux codés sur</w:t>
@@ -5682,10 +5778,7 @@
         <w:t xml:space="preserve"> soit 2^10 = 1024</w:t>
       </w:r>
       <w:r>
-        <w:t xml:space="preserve">.     </w:t>
-      </w:r>
-      <w:r>
-        <w:t xml:space="preserve">   </w:t>
+        <w:t xml:space="preserve">.        </w:t>
       </w:r>
     </w:p>
     <w:p/>
@@ -5696,7 +5789,7 @@
           <w:lang w:val="fr-FR"/>
         </w:rPr>
       </w:pPr>
-      <w:bookmarkStart w:id="7" w:name="_Toc175154807"/>
+      <w:bookmarkStart w:id="7" w:name="_Toc175216550"/>
       <w:r>
         <w:rPr>
           <w:lang w:val="fr-FR"/>
@@ -5712,7 +5805,6 @@
           <w:lang w:val="fr-FR"/>
         </w:rPr>
       </w:pPr>
-      <w:bookmarkStart w:id="8" w:name="_Toc175154808"/>
       <w:r>
         <w:rPr>
           <w:lang w:val="fr-FR"/>
@@ -5739,13 +5831,35 @@
         </w:rPr>
         <w:t xml:space="preserve"> analogique</w:t>
       </w:r>
+    </w:p>
+    <w:p/>
+    <w:p>
+      <w:pPr>
+        <w:pStyle w:val="Titre2"/>
+        <w:rPr>
+          <w:lang w:val="fr-FR"/>
+        </w:rPr>
+      </w:pPr>
+      <w:bookmarkStart w:id="8" w:name="_Toc175216551"/>
       <w:r>
         <w:rPr>
           <w:lang w:val="fr-FR"/>
         </w:rPr>
-        <w:t xml:space="preserve"> et CAN</w:t>
+        <w:t xml:space="preserve"> </w:t>
+      </w:r>
+      <w:r>
+        <w:rPr>
+          <w:lang w:val="fr-FR"/>
+        </w:rPr>
+        <w:t>CAN</w:t>
       </w:r>
       <w:bookmarkEnd w:id="8"/>
+      <w:r>
+        <w:rPr>
+          <w:lang w:val="fr-FR"/>
+        </w:rPr>
+        <w:t xml:space="preserve"> et entrée de filtre</w:t>
+      </w:r>
     </w:p>
     <w:p>
       <w:r>
@@ -5793,7 +5907,7 @@
           <w:lang w:val="fr-FR"/>
         </w:rPr>
       </w:pPr>
-      <w:bookmarkStart w:id="9" w:name="_Toc175154809"/>
+      <w:bookmarkStart w:id="9" w:name="_Toc175216552"/>
       <w:r>
         <w:rPr>
           <w:lang w:val="fr-FR"/>
@@ -5909,7 +6023,6 @@
         <w:jc w:val="center"/>
       </w:pPr>
       <w:r>
-        <w:lastRenderedPageBreak/>
         <w:drawing>
           <wp:inline distT="0" distB="0" distL="0" distR="0" wp14:anchorId="0D0343BE" wp14:editId="059EBB12">
             <wp:extent cx="6428850" cy="2810518"/>
@@ -5947,7 +6060,7 @@
           <w:lang w:val="fr-FR"/>
         </w:rPr>
       </w:pPr>
-      <w:bookmarkStart w:id="10" w:name="_Toc175154810"/>
+      <w:bookmarkStart w:id="10" w:name="_Toc175216553"/>
       <w:r>
         <w:rPr>
           <w:lang w:val="fr-FR"/>
@@ -5969,7 +6082,7 @@
           <w:lang w:val="fr-FR"/>
         </w:rPr>
       </w:pPr>
-      <w:bookmarkStart w:id="11" w:name="_Toc175154811"/>
+      <w:bookmarkStart w:id="11" w:name="_Toc175216554"/>
       <w:r>
         <w:rPr>
           <w:lang w:val="fr-FR"/>
@@ -6039,7 +6152,7 @@
           <w:lang w:val="fr-FR"/>
         </w:rPr>
       </w:pPr>
-      <w:bookmarkStart w:id="12" w:name="_Toc175154812"/>
+      <w:bookmarkStart w:id="12" w:name="_Toc175216555"/>
       <w:r>
         <w:rPr>
           <w:lang w:val="fr-FR"/>
@@ -6070,13 +6183,7 @@
         <w:rPr>
           <w:lang w:val="fr-FR"/>
         </w:rPr>
-        <w:t>”</w:t>
-      </w:r>
-      <w:r>
-        <w:rPr>
-          <w:lang w:val="fr-FR"/>
-        </w:rPr>
-        <w:t xml:space="preserve"> analogique</w:t>
+        <w:t>” analogique</w:t>
       </w:r>
       <w:r>
         <w:rPr>
@@ -6122,12 +6229,24 @@
           <w:lang w:val="fr-FR"/>
         </w:rPr>
       </w:pPr>
-      <w:bookmarkStart w:id="13" w:name="_Toc175154813"/>
+      <w:bookmarkStart w:id="13" w:name="_Toc175216556"/>
       <w:r>
         <w:rPr>
           <w:lang w:val="fr-FR"/>
         </w:rPr>
-        <w:t xml:space="preserve">Simulation filtre </w:t>
+        <w:t>Simulation</w:t>
+      </w:r>
+      <w:r>
+        <w:rPr>
+          <w:lang w:val="fr-FR"/>
+        </w:rPr>
+        <w:t xml:space="preserve"> du</w:t>
+      </w:r>
+      <w:r>
+        <w:rPr>
+          <w:lang w:val="fr-FR"/>
+        </w:rPr>
+        <w:t xml:space="preserve"> filtre </w:t>
       </w:r>
       <w:r>
         <w:rPr>
@@ -6139,7 +6258,13 @@
         <w:rPr>
           <w:lang w:val="fr-FR"/>
         </w:rPr>
-        <w:t xml:space="preserve"> et résultat du pique du spectre</w:t>
+        <w:t xml:space="preserve"> et résultat maximum</w:t>
+      </w:r>
+      <w:r>
+        <w:rPr>
+          <w:lang w:val="fr-FR"/>
+        </w:rPr>
+        <w:t xml:space="preserve"> du spectre</w:t>
       </w:r>
       <w:bookmarkEnd w:id="13"/>
     </w:p>
@@ -6155,7 +6280,7 @@
           <w:lang w:val="fr-FR"/>
         </w:rPr>
       </w:pPr>
-      <w:bookmarkStart w:id="14" w:name="_Toc175154814"/>
+      <w:bookmarkStart w:id="14" w:name="_Toc175216557"/>
       <w:r>
         <w:rPr>
           <w:lang w:val="fr-FR"/>
@@ -6172,7 +6297,19 @@
         <w:rPr>
           <w:lang w:val="fr-FR"/>
         </w:rPr>
-        <w:t>entrée “</w:t>
+        <w:t>entrée</w:t>
+      </w:r>
+      <w:r>
+        <w:rPr>
+          <w:lang w:val="fr-FR"/>
+        </w:rPr>
+        <w:t xml:space="preserve"> analogique</w:t>
+      </w:r>
+      <w:r>
+        <w:rPr>
+          <w:lang w:val="fr-FR"/>
+        </w:rPr>
+        <w:t xml:space="preserve"> “</w:t>
       </w:r>
       <w:proofErr w:type="spellStart"/>
       <w:r>
@@ -6198,7 +6335,7 @@
         <w:rPr>
           <w:lang w:val="fr-FR"/>
         </w:rPr>
-        <w:t>mV</w:t>
+        <w:t>millivolts</w:t>
       </w:r>
       <w:bookmarkEnd w:id="14"/>
       <w:r>
@@ -6261,12 +6398,30 @@
           <w:lang w:val="fr-FR"/>
         </w:rPr>
       </w:pPr>
-      <w:bookmarkStart w:id="15" w:name="_Toc175154815"/>
+      <w:bookmarkStart w:id="15" w:name="_Toc175216558"/>
       <w:r>
         <w:rPr>
           <w:lang w:val="fr-FR"/>
         </w:rPr>
-        <w:t>Simulation avec une tension entrée “</w:t>
+        <w:t>Si</w:t>
+      </w:r>
+      <w:r>
+        <w:rPr>
+          <w:lang w:val="fr-FR"/>
+        </w:rPr>
+        <w:t xml:space="preserve">mulation avec une tension </w:t>
+      </w:r>
+      <w:r>
+        <w:rPr>
+          <w:lang w:val="fr-FR"/>
+        </w:rPr>
+        <w:t>entrée analogique</w:t>
+      </w:r>
+      <w:r>
+        <w:rPr>
+          <w:lang w:val="fr-FR"/>
+        </w:rPr>
+        <w:t xml:space="preserve"> “</w:t>
       </w:r>
       <w:proofErr w:type="spellStart"/>
       <w:r>
@@ -6280,27 +6435,18 @@
         <w:rPr>
           <w:lang w:val="fr-FR"/>
         </w:rPr>
-        <w:t>”</w:t>
+        <w:t>” 850</w:t>
       </w:r>
       <w:r>
         <w:rPr>
           <w:lang w:val="fr-FR"/>
         </w:rPr>
-        <w:t xml:space="preserve"> 8</w:t>
-      </w:r>
-      <w:r>
-        <w:rPr>
-          <w:lang w:val="fr-FR"/>
-        </w:rPr>
-        <w:t>50 mV</w:t>
+        <w:t xml:space="preserve"> millivolts</w:t>
       </w:r>
       <w:bookmarkEnd w:id="15"/>
     </w:p>
     <w:p>
       <w:r>
-        <w:rPr>
-          <w:noProof/>
-        </w:rPr>
         <w:lastRenderedPageBreak/>
         <w:drawing>
           <wp:inline distT="0" distB="0" distL="0" distR="0" wp14:anchorId="27959E2A" wp14:editId="307ED1B5">
@@ -6339,6 +6485,7 @@
         </w:drawing>
       </w:r>
     </w:p>
+    <w:p/>
     <w:p>
       <w:pPr>
         <w:pStyle w:val="Titre2"/>
@@ -6350,12 +6497,12 @@
           <w:lang w:val="fr-FR"/>
         </w:rPr>
       </w:pPr>
-      <w:bookmarkStart w:id="16" w:name="_Toc175154816"/>
+      <w:bookmarkStart w:id="16" w:name="_Toc175216559"/>
       <w:r>
         <w:rPr>
           <w:lang w:val="fr-FR"/>
         </w:rPr>
-        <w:t>Simulation avec une tension entrée “</w:t>
+        <w:t>Simulation avec une tension entrée analogique “</w:t>
       </w:r>
       <w:proofErr w:type="spellStart"/>
       <w:r>
@@ -6375,21 +6522,115 @@
         <w:rPr>
           <w:lang w:val="fr-FR"/>
         </w:rPr>
-        <w:t xml:space="preserve"> 430</w:t>
+        <w:t xml:space="preserve"> 650</w:t>
       </w:r>
       <w:r>
         <w:rPr>
           <w:lang w:val="fr-FR"/>
         </w:rPr>
-        <w:t xml:space="preserve"> mV</w:t>
+        <w:t xml:space="preserve"> millivolts</w:t>
       </w:r>
       <w:bookmarkEnd w:id="16"/>
     </w:p>
+    <w:p/>
     <w:p>
       <w:r>
         <w:rPr>
           <w:noProof/>
         </w:rPr>
+        <w:drawing>
+          <wp:inline distT="0" distB="0" distL="0" distR="0" wp14:anchorId="720342E2" wp14:editId="142EB59F">
+            <wp:extent cx="6116320" cy="3602355"/>
+            <wp:effectExtent l="0" t="0" r="0" b="0"/>
+            <wp:docPr id="12" name="Image 12"/>
+            <wp:cNvGraphicFramePr>
+              <a:graphicFrameLocks xmlns:a="http://schemas.openxmlformats.org/drawingml/2006/main" noChangeAspect="1"/>
+            </wp:cNvGraphicFramePr>
+            <a:graphic xmlns:a="http://schemas.openxmlformats.org/drawingml/2006/main">
+              <a:graphicData uri="http://schemas.openxmlformats.org/drawingml/2006/picture">
+                <pic:pic xmlns:pic="http://schemas.openxmlformats.org/drawingml/2006/picture">
+                  <pic:nvPicPr>
+                    <pic:cNvPr id="1" name=""/>
+                    <pic:cNvPicPr/>
+                  </pic:nvPicPr>
+                  <pic:blipFill>
+                    <a:blip r:embed="rId20"/>
+                    <a:stretch>
+                      <a:fillRect/>
+                    </a:stretch>
+                  </pic:blipFill>
+                  <pic:spPr>
+                    <a:xfrm>
+                      <a:off x="0" y="0"/>
+                      <a:ext cx="6116320" cy="3602355"/>
+                    </a:xfrm>
+                    <a:prstGeom prst="rect">
+                      <a:avLst/>
+                    </a:prstGeom>
+                  </pic:spPr>
+                </pic:pic>
+              </a:graphicData>
+            </a:graphic>
+          </wp:inline>
+        </w:drawing>
+      </w:r>
+    </w:p>
+    <w:p/>
+    <w:p>
+      <w:pPr>
+        <w:pStyle w:val="Titre2"/>
+        <w:numPr>
+          <w:ilvl w:val="1"/>
+          <w:numId w:val="23"/>
+        </w:numPr>
+        <w:rPr>
+          <w:lang w:val="fr-FR"/>
+        </w:rPr>
+      </w:pPr>
+      <w:bookmarkStart w:id="17" w:name="_Toc175216560"/>
+      <w:r>
+        <w:rPr>
+          <w:lang w:val="fr-FR"/>
+        </w:rPr>
+        <w:t xml:space="preserve">Simulation avec une tension </w:t>
+      </w:r>
+      <w:r>
+        <w:rPr>
+          <w:lang w:val="fr-FR"/>
+        </w:rPr>
+        <w:t>entrée analogique</w:t>
+      </w:r>
+      <w:r>
+        <w:rPr>
+          <w:lang w:val="fr-FR"/>
+        </w:rPr>
+        <w:t xml:space="preserve"> “</w:t>
+      </w:r>
+      <w:proofErr w:type="spellStart"/>
+      <w:r>
+        <w:rPr>
+          <w:lang w:val="fr-FR"/>
+        </w:rPr>
+        <w:t>shaper</w:t>
+      </w:r>
+      <w:proofErr w:type="spellEnd"/>
+      <w:r>
+        <w:rPr>
+          <w:lang w:val="fr-FR"/>
+        </w:rPr>
+        <w:t xml:space="preserve">” 430 </w:t>
+      </w:r>
+      <w:r>
+        <w:rPr>
+          <w:lang w:val="fr-FR"/>
+        </w:rPr>
+        <w:t>millivolts</w:t>
+      </w:r>
+      <w:bookmarkEnd w:id="17"/>
+    </w:p>
+    <w:p>
+      <w:r>
+        <w:lastRenderedPageBreak/>
         <w:drawing>
           <wp:inline distT="0" distB="0" distL="0" distR="0" wp14:anchorId="7A658A88" wp14:editId="5043C1AD">
             <wp:extent cx="6116320" cy="2670175"/>
@@ -6406,7 +6647,7 @@
                     <pic:cNvPicPr/>
                   </pic:nvPicPr>
                   <pic:blipFill>
-                    <a:blip r:embed="rId20"/>
+                    <a:blip r:embed="rId21"/>
                     <a:stretch>
                       <a:fillRect/>
                     </a:stretch>
@@ -6434,12 +6675,24 @@
           <w:lang w:val="fr-FR"/>
         </w:rPr>
       </w:pPr>
-      <w:bookmarkStart w:id="17" w:name="_Toc175154817"/>
+      <w:bookmarkStart w:id="18" w:name="_Toc175216561"/>
       <w:r>
         <w:rPr>
           <w:lang w:val="fr-FR"/>
         </w:rPr>
-        <w:t>Simulation avec une tension entrée “</w:t>
+        <w:t xml:space="preserve">Simulation avec une tension </w:t>
+      </w:r>
+      <w:r>
+        <w:rPr>
+          <w:lang w:val="fr-FR"/>
+        </w:rPr>
+        <w:t>entrée analogique</w:t>
+      </w:r>
+      <w:r>
+        <w:rPr>
+          <w:lang w:val="fr-FR"/>
+        </w:rPr>
+        <w:t xml:space="preserve"> “</w:t>
       </w:r>
       <w:proofErr w:type="spellStart"/>
       <w:r>
@@ -6471,15 +6724,12 @@
         <w:rPr>
           <w:lang w:val="fr-FR"/>
         </w:rPr>
-        <w:t>mV</w:t>
+        <w:t>millivolts</w:t>
       </w:r>
-      <w:bookmarkEnd w:id="17"/>
+      <w:bookmarkEnd w:id="18"/>
     </w:p>
     <w:p>
       <w:r>
-        <w:rPr>
-          <w:noProof/>
-        </w:rPr>
         <w:drawing>
           <wp:inline distT="0" distB="0" distL="0" distR="0" wp14:anchorId="0DD6CE38" wp14:editId="27B67DB8">
             <wp:extent cx="6116320" cy="2617470"/>
@@ -6496,7 +6746,7 @@
                     <pic:cNvPicPr/>
                   </pic:nvPicPr>
                   <pic:blipFill>
-                    <a:blip r:embed="rId21"/>
+                    <a:blip r:embed="rId22"/>
                     <a:stretch>
                       <a:fillRect/>
                     </a:stretch>
@@ -6529,12 +6779,24 @@
           <w:lang w:val="fr-FR"/>
         </w:rPr>
       </w:pPr>
-      <w:bookmarkStart w:id="18" w:name="_Toc175154818"/>
+      <w:bookmarkStart w:id="19" w:name="_Toc175216562"/>
       <w:r>
         <w:rPr>
           <w:lang w:val="fr-FR"/>
         </w:rPr>
-        <w:t>Simulation avec une tension entrée “</w:t>
+        <w:t xml:space="preserve">Simulation avec une tension </w:t>
+      </w:r>
+      <w:r>
+        <w:rPr>
+          <w:lang w:val="fr-FR"/>
+        </w:rPr>
+        <w:t>entrée analogique</w:t>
+      </w:r>
+      <w:r>
+        <w:rPr>
+          <w:lang w:val="fr-FR"/>
+        </w:rPr>
+        <w:t xml:space="preserve"> “</w:t>
       </w:r>
       <w:proofErr w:type="spellStart"/>
       <w:r>
@@ -6548,28 +6810,20 @@
         <w:rPr>
           <w:lang w:val="fr-FR"/>
         </w:rPr>
-        <w:t>”</w:t>
+        <w:t xml:space="preserve">” 90 </w:t>
       </w:r>
       <w:r>
         <w:rPr>
           <w:lang w:val="fr-FR"/>
         </w:rPr>
-        <w:t xml:space="preserve"> 90</w:t>
+        <w:t>millivolts</w:t>
       </w:r>
-      <w:r>
-        <w:rPr>
-          <w:lang w:val="fr-FR"/>
-        </w:rPr>
-        <w:t xml:space="preserve"> mV</w:t>
-      </w:r>
-      <w:bookmarkEnd w:id="18"/>
+      <w:bookmarkEnd w:id="19"/>
     </w:p>
     <w:p/>
     <w:p>
       <w:r>
-        <w:rPr>
-          <w:noProof/>
-        </w:rPr>
+        <w:lastRenderedPageBreak/>
         <w:drawing>
           <wp:inline distT="0" distB="0" distL="0" distR="0" wp14:anchorId="569BB35A" wp14:editId="2A184248">
             <wp:extent cx="6116320" cy="2435860"/>
@@ -6586,7 +6840,7 @@
                     <pic:cNvPicPr/>
                   </pic:nvPicPr>
                   <pic:blipFill>
-                    <a:blip r:embed="rId22"/>
+                    <a:blip r:embed="rId23"/>
                     <a:stretch>
                       <a:fillRect/>
                     </a:stretch>
@@ -6607,8 +6861,80 @@
         </w:drawing>
       </w:r>
     </w:p>
+    <w:p/>
+    <w:p>
+      <w:pPr>
+        <w:pStyle w:val="Titre2"/>
+        <w:rPr>
+          <w:lang w:val="fr-FR"/>
+        </w:rPr>
+      </w:pPr>
+      <w:bookmarkStart w:id="20" w:name="_Toc175216563"/>
+      <w:r>
+        <w:rPr>
+          <w:lang w:val="fr-FR"/>
+        </w:rPr>
+        <w:t>Comparaison du spectre max mesuré et spectre max issu de la simulation</w:t>
+      </w:r>
+      <w:bookmarkEnd w:id="20"/>
+    </w:p>
+    <w:p>
+      <w:pPr>
+        <w:pStyle w:val="Titre2"/>
+        <w:numPr>
+          <w:ilvl w:val="0"/>
+          <w:numId w:val="0"/>
+        </w:numPr>
+        <w:ind w:left="792"/>
+        <w:rPr>
+          <w:lang w:val="fr-FR"/>
+        </w:rPr>
+      </w:pPr>
+    </w:p>
+    <w:p>
+      <w:pPr>
+        <w:pStyle w:val="Lgende"/>
+      </w:pPr>
+      <w:r>
+        <w:t xml:space="preserve">Pour un certain nombre de points de référence en entrée du « </w:t>
+      </w:r>
+      <w:proofErr w:type="spellStart"/>
+      <w:r>
+        <w:t>shaper</w:t>
+      </w:r>
+      <w:proofErr w:type="spellEnd"/>
+      <w:r>
+        <w:t xml:space="preserve"> », nous effectuons une comparaison des spectres maximaux entre la simulation comportementale FPGA et les résultats expérimentaux.   </w:t>
+      </w:r>
+      <w:r>
+        <w:t xml:space="preserve">   </w:t>
+      </w:r>
+    </w:p>
+    <w:p>
+      <w:pPr>
+        <w:jc w:val="left"/>
+      </w:pPr>
+      <w:r>
+        <w:rPr>
+          <w:noProof/>
+        </w:rPr>
+        <w:drawing>
+          <wp:inline distT="0" distB="0" distL="0" distR="0" wp14:anchorId="086F7A9E" wp14:editId="0BEFCDE4">
+            <wp:extent cx="6116320" cy="3517265"/>
+            <wp:effectExtent l="0" t="0" r="17780" b="6985"/>
+            <wp:docPr id="19" name="Graphique 19"/>
+            <wp:cNvGraphicFramePr/>
+            <a:graphic xmlns:a="http://schemas.openxmlformats.org/drawingml/2006/main">
+              <a:graphicData uri="http://schemas.openxmlformats.org/drawingml/2006/chart">
+                <c:chart xmlns:c="http://schemas.openxmlformats.org/drawingml/2006/chart" xmlns:r="http://schemas.openxmlformats.org/officeDocument/2006/relationships" r:id="rId24"/>
+              </a:graphicData>
+            </a:graphic>
+          </wp:inline>
+        </w:drawing>
+      </w:r>
+    </w:p>
     <w:sectPr>
-      <w:headerReference w:type="default" r:id="rId23"/>
+      <w:headerReference w:type="default" r:id="rId25"/>
       <w:pgSz w:w="11900" w:h="16840"/>
       <w:pgMar w:top="2580" w:right="1134" w:bottom="1134" w:left="1134" w:header="624" w:footer="624" w:gutter="0"/>
       <w:pgNumType w:start="1"/>
@@ -6989,7 +7315,7 @@
               <w:szCs w:val="22"/>
               <w:lang w:val="en-US"/>
             </w:rPr>
-            <w:t>12</w:t>
+            <w:t>5</w:t>
           </w:r>
           <w:r>
             <w:rPr>
@@ -7035,7 +7361,7 @@
               <w:szCs w:val="22"/>
               <w:lang w:val="en-GB"/>
             </w:rPr>
-            <w:t>12</w:t>
+            <w:t>13</w:t>
           </w:r>
           <w:r>
             <w:rPr>
@@ -11533,11 +11859,11 @@
           <c:showPercent val="0"/>
           <c:showBubbleSize val="0"/>
         </c:dLbls>
-        <c:axId val="328864344"/>
-        <c:axId val="328859248"/>
+        <c:axId val="352960224"/>
+        <c:axId val="352960616"/>
       </c:scatterChart>
       <c:valAx>
-        <c:axId val="328864344"/>
+        <c:axId val="352960224"/>
         <c:scaling>
           <c:orientation val="minMax"/>
         </c:scaling>
@@ -11649,12 +11975,12 @@
             <a:endParaRPr lang="fr-FR"/>
           </a:p>
         </c:txPr>
-        <c:crossAx val="328859248"/>
+        <c:crossAx val="352960616"/>
         <c:crosses val="autoZero"/>
         <c:crossBetween val="midCat"/>
       </c:valAx>
       <c:valAx>
-        <c:axId val="328859248"/>
+        <c:axId val="352960616"/>
         <c:scaling>
           <c:orientation val="minMax"/>
         </c:scaling>
@@ -11771,7 +12097,7 @@
             <a:endParaRPr lang="fr-FR"/>
           </a:p>
         </c:txPr>
-        <c:crossAx val="328864344"/>
+        <c:crossAx val="352960224"/>
         <c:crosses val="autoZero"/>
         <c:crossBetween val="midCat"/>
       </c:valAx>
@@ -12104,11 +12430,11 @@
           <c:showPercent val="0"/>
           <c:showBubbleSize val="0"/>
         </c:dLbls>
-        <c:axId val="328861208"/>
-        <c:axId val="328863168"/>
+        <c:axId val="352961792"/>
+        <c:axId val="352962968"/>
       </c:scatterChart>
       <c:valAx>
-        <c:axId val="328861208"/>
+        <c:axId val="352961792"/>
         <c:scaling>
           <c:orientation val="minMax"/>
         </c:scaling>
@@ -12228,12 +12554,12 @@
             <a:endParaRPr lang="fr-FR"/>
           </a:p>
         </c:txPr>
-        <c:crossAx val="328863168"/>
+        <c:crossAx val="352962968"/>
         <c:crosses val="autoZero"/>
         <c:crossBetween val="midCat"/>
       </c:valAx>
       <c:valAx>
-        <c:axId val="328863168"/>
+        <c:axId val="352962968"/>
         <c:scaling>
           <c:orientation val="minMax"/>
         </c:scaling>
@@ -12345,7 +12671,7 @@
             <a:endParaRPr lang="fr-FR"/>
           </a:p>
         </c:txPr>
-        <c:crossAx val="328861208"/>
+        <c:crossAx val="352961792"/>
         <c:crosses val="autoZero"/>
         <c:crossBetween val="midCat"/>
       </c:valAx>
@@ -14998,11 +15324,11 @@
           <c:showPercent val="0"/>
           <c:showBubbleSize val="0"/>
         </c:dLbls>
-        <c:axId val="328859640"/>
-        <c:axId val="328856112"/>
+        <c:axId val="352959440"/>
+        <c:axId val="352959832"/>
       </c:scatterChart>
       <c:valAx>
-        <c:axId val="328859640"/>
+        <c:axId val="352959440"/>
         <c:scaling>
           <c:orientation val="minMax"/>
         </c:scaling>
@@ -15113,12 +15439,12 @@
             <a:endParaRPr lang="fr-FR"/>
           </a:p>
         </c:txPr>
-        <c:crossAx val="328856112"/>
+        <c:crossAx val="352959832"/>
         <c:crosses val="autoZero"/>
         <c:crossBetween val="midCat"/>
       </c:valAx>
       <c:valAx>
-        <c:axId val="328856112"/>
+        <c:axId val="352959832"/>
         <c:scaling>
           <c:orientation val="minMax"/>
         </c:scaling>
@@ -15230,7 +15556,7 @@
             <a:endParaRPr lang="fr-FR"/>
           </a:p>
         </c:txPr>
-        <c:crossAx val="328859640"/>
+        <c:crossAx val="352959440"/>
         <c:crosses val="autoZero"/>
         <c:crossBetween val="midCat"/>
       </c:valAx>
@@ -15535,11 +15861,11 @@
           <c:showPercent val="0"/>
           <c:showBubbleSize val="0"/>
         </c:dLbls>
-        <c:axId val="328858856"/>
-        <c:axId val="328860424"/>
+        <c:axId val="352949392"/>
+        <c:axId val="352951744"/>
       </c:scatterChart>
       <c:valAx>
-        <c:axId val="328858856"/>
+        <c:axId val="352949392"/>
         <c:scaling>
           <c:orientation val="minMax"/>
         </c:scaling>
@@ -15651,12 +15977,12 @@
             <a:endParaRPr lang="fr-FR"/>
           </a:p>
         </c:txPr>
-        <c:crossAx val="328860424"/>
+        <c:crossAx val="352951744"/>
         <c:crosses val="autoZero"/>
         <c:crossBetween val="midCat"/>
       </c:valAx>
       <c:valAx>
-        <c:axId val="328860424"/>
+        <c:axId val="352951744"/>
         <c:scaling>
           <c:orientation val="minMax"/>
         </c:scaling>
@@ -15768,7 +16094,7 @@
             <a:endParaRPr lang="fr-FR"/>
           </a:p>
         </c:txPr>
-        <c:crossAx val="328858856"/>
+        <c:crossAx val="352949392"/>
         <c:crosses val="autoZero"/>
         <c:crossBetween val="midCat"/>
       </c:valAx>
@@ -16092,11 +16418,11 @@
           <c:showPercent val="0"/>
           <c:showBubbleSize val="0"/>
         </c:dLbls>
-        <c:axId val="328865128"/>
-        <c:axId val="328866304"/>
+        <c:axId val="352951352"/>
+        <c:axId val="352950176"/>
       </c:scatterChart>
       <c:valAx>
-        <c:axId val="328865128"/>
+        <c:axId val="352951352"/>
         <c:scaling>
           <c:orientation val="minMax"/>
         </c:scaling>
@@ -16208,12 +16534,12 @@
             <a:endParaRPr lang="fr-FR"/>
           </a:p>
         </c:txPr>
-        <c:crossAx val="328866304"/>
+        <c:crossAx val="352950176"/>
         <c:crosses val="autoZero"/>
         <c:crossBetween val="midCat"/>
       </c:valAx>
       <c:valAx>
-        <c:axId val="328866304"/>
+        <c:axId val="352950176"/>
         <c:scaling>
           <c:orientation val="minMax"/>
         </c:scaling>
@@ -16325,7 +16651,7 @@
             <a:endParaRPr lang="fr-FR"/>
           </a:p>
         </c:txPr>
-        <c:crossAx val="328865128"/>
+        <c:crossAx val="352951352"/>
         <c:crosses val="autoZero"/>
         <c:crossBetween val="midCat"/>
       </c:valAx>
@@ -16337,6 +16663,723 @@
         <a:effectLst/>
       </c:spPr>
     </c:plotArea>
+    <c:plotVisOnly val="1"/>
+    <c:dispBlanksAs val="gap"/>
+    <c:showDLblsOverMax val="0"/>
+  </c:chart>
+  <c:spPr>
+    <a:solidFill>
+      <a:schemeClr val="bg1"/>
+    </a:solidFill>
+    <a:ln w="9525" cap="flat" cmpd="sng" algn="ctr">
+      <a:solidFill>
+        <a:schemeClr val="tx1">
+          <a:lumMod val="15000"/>
+          <a:lumOff val="85000"/>
+        </a:schemeClr>
+      </a:solidFill>
+      <a:round/>
+    </a:ln>
+    <a:effectLst/>
+  </c:spPr>
+  <c:txPr>
+    <a:bodyPr/>
+    <a:lstStyle/>
+    <a:p>
+      <a:pPr>
+        <a:defRPr/>
+      </a:pPr>
+      <a:endParaRPr lang="fr-FR"/>
+    </a:p>
+  </c:txPr>
+  <c:externalData r:id="rId3">
+    <c:autoUpdate val="0"/>
+  </c:externalData>
+</c:chartSpace>
+</file>
+
+<file path=word/charts/chart6.xml><?xml version="1.0" encoding="utf-8"?>
+<c:chartSpace xmlns:c="http://schemas.openxmlformats.org/drawingml/2006/chart" xmlns:a="http://schemas.openxmlformats.org/drawingml/2006/main" xmlns:r="http://schemas.openxmlformats.org/officeDocument/2006/relationships">
+  <c:date1904 val="0"/>
+  <c:lang val="fr-FR"/>
+  <c:roundedCorners val="0"/>
+  <mc:AlternateContent xmlns:mc="http://schemas.openxmlformats.org/markup-compatibility/2006">
+    <mc:Choice xmlns:c14="http://schemas.microsoft.com/office/drawing/2007/8/2/chart" Requires="c14">
+      <c14:style val="102"/>
+    </mc:Choice>
+    <mc:Fallback>
+      <c:style val="2"/>
+    </mc:Fallback>
+  </mc:AlternateContent>
+  <c:chart>
+    <c:title>
+      <c:tx>
+        <c:rich>
+          <a:bodyPr rot="0" spcFirstLastPara="1" vertOverflow="ellipsis" vert="horz" wrap="square" anchor="ctr" anchorCtr="1"/>
+          <a:lstStyle/>
+          <a:p>
+            <a:pPr>
+              <a:defRPr sz="1400" b="0" i="0" u="none" strike="noStrike" kern="1200" spc="0" baseline="0">
+                <a:solidFill>
+                  <a:schemeClr val="tx1">
+                    <a:lumMod val="65000"/>
+                    <a:lumOff val="35000"/>
+                  </a:schemeClr>
+                </a:solidFill>
+                <a:latin typeface="+mn-lt"/>
+                <a:ea typeface="+mn-ea"/>
+                <a:cs typeface="+mn-cs"/>
+              </a:defRPr>
+            </a:pPr>
+            <a:r>
+              <a:rPr lang="fr-FR"/>
+              <a:t>Max du spectre en fonction de l'entrée analogique "shaper"</a:t>
+            </a:r>
+            <a:r>
+              <a:rPr lang="fr-FR" baseline="0"/>
+              <a:t> </a:t>
+            </a:r>
+            <a:r>
+              <a:rPr lang="fr-FR"/>
+              <a:t> </a:t>
+            </a:r>
+          </a:p>
+        </c:rich>
+      </c:tx>
+      <c:overlay val="0"/>
+      <c:spPr>
+        <a:noFill/>
+        <a:ln>
+          <a:noFill/>
+        </a:ln>
+        <a:effectLst/>
+      </c:spPr>
+      <c:txPr>
+        <a:bodyPr rot="0" spcFirstLastPara="1" vertOverflow="ellipsis" vert="horz" wrap="square" anchor="ctr" anchorCtr="1"/>
+        <a:lstStyle/>
+        <a:p>
+          <a:pPr>
+            <a:defRPr sz="1400" b="0" i="0" u="none" strike="noStrike" kern="1200" spc="0" baseline="0">
+              <a:solidFill>
+                <a:schemeClr val="tx1">
+                  <a:lumMod val="65000"/>
+                  <a:lumOff val="35000"/>
+                </a:schemeClr>
+              </a:solidFill>
+              <a:latin typeface="+mn-lt"/>
+              <a:ea typeface="+mn-ea"/>
+              <a:cs typeface="+mn-cs"/>
+            </a:defRPr>
+          </a:pPr>
+          <a:endParaRPr lang="fr-FR"/>
+        </a:p>
+      </c:txPr>
+    </c:title>
+    <c:autoTitleDeleted val="0"/>
+    <c:plotArea>
+      <c:layout/>
+      <c:scatterChart>
+        <c:scatterStyle val="smoothMarker"/>
+        <c:varyColors val="0"/>
+        <c:ser>
+          <c:idx val="0"/>
+          <c:order val="0"/>
+          <c:tx>
+            <c:strRef>
+              <c:f>Feuil1!$B$1</c:f>
+              <c:strCache>
+                <c:ptCount val="1"/>
+                <c:pt idx="0">
+                  <c:v>spectre max mesuré en ADU</c:v>
+                </c:pt>
+              </c:strCache>
+            </c:strRef>
+          </c:tx>
+          <c:spPr>
+            <a:ln w="19050" cap="rnd">
+              <a:solidFill>
+                <a:schemeClr val="accent1"/>
+              </a:solidFill>
+              <a:round/>
+            </a:ln>
+            <a:effectLst/>
+          </c:spPr>
+          <c:marker>
+            <c:symbol val="circle"/>
+            <c:size val="5"/>
+            <c:spPr>
+              <a:solidFill>
+                <a:schemeClr val="accent1"/>
+              </a:solidFill>
+              <a:ln w="9525">
+                <a:solidFill>
+                  <a:schemeClr val="accent1"/>
+                </a:solidFill>
+              </a:ln>
+              <a:effectLst/>
+            </c:spPr>
+          </c:marker>
+          <c:dLbls>
+            <c:spPr>
+              <a:noFill/>
+              <a:ln>
+                <a:noFill/>
+              </a:ln>
+              <a:effectLst/>
+            </c:spPr>
+            <c:txPr>
+              <a:bodyPr rot="0" spcFirstLastPara="1" vertOverflow="ellipsis" vert="horz" wrap="square" lIns="38100" tIns="19050" rIns="38100" bIns="19050" anchor="ctr" anchorCtr="1">
+                <a:spAutoFit/>
+              </a:bodyPr>
+              <a:lstStyle/>
+              <a:p>
+                <a:pPr>
+                  <a:defRPr sz="900" b="0" i="0" u="none" strike="noStrike" kern="1200" baseline="0">
+                    <a:solidFill>
+                      <a:schemeClr val="tx1">
+                        <a:lumMod val="75000"/>
+                        <a:lumOff val="25000"/>
+                      </a:schemeClr>
+                    </a:solidFill>
+                    <a:latin typeface="+mn-lt"/>
+                    <a:ea typeface="+mn-ea"/>
+                    <a:cs typeface="+mn-cs"/>
+                  </a:defRPr>
+                </a:pPr>
+                <a:endParaRPr lang="fr-FR"/>
+              </a:p>
+            </c:txPr>
+            <c:dLblPos val="t"/>
+            <c:showLegendKey val="0"/>
+            <c:showVal val="1"/>
+            <c:showCatName val="0"/>
+            <c:showSerName val="0"/>
+            <c:showPercent val="0"/>
+            <c:showBubbleSize val="0"/>
+            <c:showLeaderLines val="0"/>
+            <c:extLst>
+              <c:ext xmlns:c15="http://schemas.microsoft.com/office/drawing/2012/chart" uri="{CE6537A1-D6FC-4f65-9D91-7224C49458BB}">
+                <c15:showLeaderLines val="1"/>
+                <c15:leaderLines>
+                  <c:spPr>
+                    <a:ln w="9525" cap="flat" cmpd="sng" algn="ctr">
+                      <a:solidFill>
+                        <a:schemeClr val="tx1">
+                          <a:lumMod val="35000"/>
+                          <a:lumOff val="65000"/>
+                        </a:schemeClr>
+                      </a:solidFill>
+                      <a:round/>
+                    </a:ln>
+                    <a:effectLst/>
+                  </c:spPr>
+                </c15:leaderLines>
+              </c:ext>
+            </c:extLst>
+          </c:dLbls>
+          <c:xVal>
+            <c:numRef>
+              <c:f>Feuil1!$A$2:$A$7</c:f>
+              <c:numCache>
+                <c:formatCode>General</c:formatCode>
+                <c:ptCount val="6"/>
+                <c:pt idx="0">
+                  <c:v>90</c:v>
+                </c:pt>
+                <c:pt idx="1">
+                  <c:v>350</c:v>
+                </c:pt>
+                <c:pt idx="2">
+                  <c:v>430</c:v>
+                </c:pt>
+                <c:pt idx="3">
+                  <c:v>650</c:v>
+                </c:pt>
+                <c:pt idx="4">
+                  <c:v>850</c:v>
+                </c:pt>
+                <c:pt idx="5">
+                  <c:v>950</c:v>
+                </c:pt>
+              </c:numCache>
+            </c:numRef>
+          </c:xVal>
+          <c:yVal>
+            <c:numRef>
+              <c:f>Feuil1!$B$2:$B$7</c:f>
+              <c:numCache>
+                <c:formatCode>General</c:formatCode>
+                <c:ptCount val="6"/>
+                <c:pt idx="0">
+                  <c:v>83</c:v>
+                </c:pt>
+                <c:pt idx="1">
+                  <c:v>324</c:v>
+                </c:pt>
+                <c:pt idx="2">
+                  <c:v>399</c:v>
+                </c:pt>
+                <c:pt idx="3">
+                  <c:v>603</c:v>
+                </c:pt>
+                <c:pt idx="4">
+                  <c:v>789</c:v>
+                </c:pt>
+                <c:pt idx="5">
+                  <c:v>882</c:v>
+                </c:pt>
+              </c:numCache>
+            </c:numRef>
+          </c:yVal>
+          <c:smooth val="1"/>
+        </c:ser>
+        <c:ser>
+          <c:idx val="1"/>
+          <c:order val="1"/>
+          <c:tx>
+            <c:strRef>
+              <c:f>Feuil1!$C$1</c:f>
+              <c:strCache>
+                <c:ptCount val="1"/>
+                <c:pt idx="0">
+                  <c:v>spectre max simu en ADU</c:v>
+                </c:pt>
+              </c:strCache>
+            </c:strRef>
+          </c:tx>
+          <c:spPr>
+            <a:ln w="19050" cap="rnd">
+              <a:solidFill>
+                <a:schemeClr val="accent2"/>
+              </a:solidFill>
+              <a:round/>
+            </a:ln>
+            <a:effectLst/>
+          </c:spPr>
+          <c:marker>
+            <c:symbol val="circle"/>
+            <c:size val="5"/>
+            <c:spPr>
+              <a:solidFill>
+                <a:schemeClr val="accent2"/>
+              </a:solidFill>
+              <a:ln w="9525">
+                <a:solidFill>
+                  <a:schemeClr val="accent2"/>
+                </a:solidFill>
+              </a:ln>
+              <a:effectLst/>
+            </c:spPr>
+          </c:marker>
+          <c:dLbls>
+            <c:spPr>
+              <a:noFill/>
+              <a:ln>
+                <a:noFill/>
+              </a:ln>
+              <a:effectLst/>
+            </c:spPr>
+            <c:txPr>
+              <a:bodyPr rot="0" spcFirstLastPara="1" vertOverflow="ellipsis" vert="horz" wrap="square" lIns="38100" tIns="19050" rIns="38100" bIns="19050" anchor="ctr" anchorCtr="1">
+                <a:spAutoFit/>
+              </a:bodyPr>
+              <a:lstStyle/>
+              <a:p>
+                <a:pPr>
+                  <a:defRPr sz="900" b="0" i="0" u="none" strike="noStrike" kern="1200" baseline="0">
+                    <a:solidFill>
+                      <a:schemeClr val="tx1">
+                        <a:lumMod val="75000"/>
+                        <a:lumOff val="25000"/>
+                      </a:schemeClr>
+                    </a:solidFill>
+                    <a:latin typeface="+mn-lt"/>
+                    <a:ea typeface="+mn-ea"/>
+                    <a:cs typeface="+mn-cs"/>
+                  </a:defRPr>
+                </a:pPr>
+                <a:endParaRPr lang="fr-FR"/>
+              </a:p>
+            </c:txPr>
+            <c:dLblPos val="t"/>
+            <c:showLegendKey val="0"/>
+            <c:showVal val="1"/>
+            <c:showCatName val="0"/>
+            <c:showSerName val="0"/>
+            <c:showPercent val="0"/>
+            <c:showBubbleSize val="0"/>
+            <c:showLeaderLines val="0"/>
+            <c:extLst>
+              <c:ext xmlns:c15="http://schemas.microsoft.com/office/drawing/2012/chart" uri="{CE6537A1-D6FC-4f65-9D91-7224C49458BB}">
+                <c15:showLeaderLines val="1"/>
+                <c15:leaderLines>
+                  <c:spPr>
+                    <a:ln w="9525" cap="flat" cmpd="sng" algn="ctr">
+                      <a:solidFill>
+                        <a:schemeClr val="tx1">
+                          <a:lumMod val="35000"/>
+                          <a:lumOff val="65000"/>
+                        </a:schemeClr>
+                      </a:solidFill>
+                      <a:round/>
+                    </a:ln>
+                    <a:effectLst/>
+                  </c:spPr>
+                </c15:leaderLines>
+              </c:ext>
+            </c:extLst>
+          </c:dLbls>
+          <c:xVal>
+            <c:numRef>
+              <c:f>Feuil1!$A$2:$A$7</c:f>
+              <c:numCache>
+                <c:formatCode>General</c:formatCode>
+                <c:ptCount val="6"/>
+                <c:pt idx="0">
+                  <c:v>90</c:v>
+                </c:pt>
+                <c:pt idx="1">
+                  <c:v>350</c:v>
+                </c:pt>
+                <c:pt idx="2">
+                  <c:v>430</c:v>
+                </c:pt>
+                <c:pt idx="3">
+                  <c:v>650</c:v>
+                </c:pt>
+                <c:pt idx="4">
+                  <c:v>850</c:v>
+                </c:pt>
+                <c:pt idx="5">
+                  <c:v>950</c:v>
+                </c:pt>
+              </c:numCache>
+            </c:numRef>
+          </c:xVal>
+          <c:yVal>
+            <c:numRef>
+              <c:f>Feuil1!$C$2:$C$7</c:f>
+              <c:numCache>
+                <c:formatCode>General</c:formatCode>
+                <c:ptCount val="6"/>
+                <c:pt idx="0">
+                  <c:v>81</c:v>
+                </c:pt>
+                <c:pt idx="1">
+                  <c:v>325</c:v>
+                </c:pt>
+                <c:pt idx="2">
+                  <c:v>395</c:v>
+                </c:pt>
+                <c:pt idx="3">
+                  <c:v>604</c:v>
+                </c:pt>
+                <c:pt idx="4">
+                  <c:v>789</c:v>
+                </c:pt>
+                <c:pt idx="5">
+                  <c:v>881</c:v>
+                </c:pt>
+              </c:numCache>
+            </c:numRef>
+          </c:yVal>
+          <c:smooth val="1"/>
+        </c:ser>
+        <c:dLbls>
+          <c:dLblPos val="t"/>
+          <c:showLegendKey val="0"/>
+          <c:showVal val="1"/>
+          <c:showCatName val="0"/>
+          <c:showSerName val="0"/>
+          <c:showPercent val="0"/>
+          <c:showBubbleSize val="0"/>
+        </c:dLbls>
+        <c:axId val="348718440"/>
+        <c:axId val="348718048"/>
+      </c:scatterChart>
+      <c:valAx>
+        <c:axId val="348718440"/>
+        <c:scaling>
+          <c:orientation val="minMax"/>
+        </c:scaling>
+        <c:delete val="0"/>
+        <c:axPos val="b"/>
+        <c:majorGridlines>
+          <c:spPr>
+            <a:ln w="9525" cap="flat" cmpd="sng" algn="ctr">
+              <a:solidFill>
+                <a:schemeClr val="tx1">
+                  <a:lumMod val="15000"/>
+                  <a:lumOff val="85000"/>
+                </a:schemeClr>
+              </a:solidFill>
+              <a:round/>
+            </a:ln>
+            <a:effectLst/>
+          </c:spPr>
+        </c:majorGridlines>
+        <c:title>
+          <c:tx>
+            <c:rich>
+              <a:bodyPr rot="0" spcFirstLastPara="1" vertOverflow="ellipsis" vert="horz" wrap="square" anchor="ctr" anchorCtr="1"/>
+              <a:lstStyle/>
+              <a:p>
+                <a:pPr>
+                  <a:defRPr sz="1000" b="0" i="0" u="none" strike="noStrike" kern="1200" baseline="0">
+                    <a:solidFill>
+                      <a:schemeClr val="tx1">
+                        <a:lumMod val="65000"/>
+                        <a:lumOff val="35000"/>
+                      </a:schemeClr>
+                    </a:solidFill>
+                    <a:latin typeface="+mn-lt"/>
+                    <a:ea typeface="+mn-ea"/>
+                    <a:cs typeface="+mn-cs"/>
+                  </a:defRPr>
+                </a:pPr>
+                <a:r>
+                  <a:rPr lang="fr-FR"/>
+                  <a:t>Tension</a:t>
+                </a:r>
+                <a:r>
+                  <a:rPr lang="fr-FR" baseline="0"/>
+                  <a:t> d'entrée analogique "shaper"</a:t>
+                </a:r>
+                <a:endParaRPr lang="fr-FR"/>
+              </a:p>
+            </c:rich>
+          </c:tx>
+          <c:overlay val="0"/>
+          <c:spPr>
+            <a:noFill/>
+            <a:ln>
+              <a:noFill/>
+            </a:ln>
+            <a:effectLst/>
+          </c:spPr>
+          <c:txPr>
+            <a:bodyPr rot="0" spcFirstLastPara="1" vertOverflow="ellipsis" vert="horz" wrap="square" anchor="ctr" anchorCtr="1"/>
+            <a:lstStyle/>
+            <a:p>
+              <a:pPr>
+                <a:defRPr sz="1000" b="0" i="0" u="none" strike="noStrike" kern="1200" baseline="0">
+                  <a:solidFill>
+                    <a:schemeClr val="tx1">
+                      <a:lumMod val="65000"/>
+                      <a:lumOff val="35000"/>
+                    </a:schemeClr>
+                  </a:solidFill>
+                  <a:latin typeface="+mn-lt"/>
+                  <a:ea typeface="+mn-ea"/>
+                  <a:cs typeface="+mn-cs"/>
+                </a:defRPr>
+              </a:pPr>
+              <a:endParaRPr lang="fr-FR"/>
+            </a:p>
+          </c:txPr>
+        </c:title>
+        <c:numFmt formatCode="General" sourceLinked="1"/>
+        <c:majorTickMark val="none"/>
+        <c:minorTickMark val="none"/>
+        <c:tickLblPos val="nextTo"/>
+        <c:spPr>
+          <a:noFill/>
+          <a:ln w="9525" cap="flat" cmpd="sng" algn="ctr">
+            <a:solidFill>
+              <a:schemeClr val="tx1">
+                <a:lumMod val="25000"/>
+                <a:lumOff val="75000"/>
+              </a:schemeClr>
+            </a:solidFill>
+            <a:round/>
+          </a:ln>
+          <a:effectLst/>
+        </c:spPr>
+        <c:txPr>
+          <a:bodyPr rot="-60000000" spcFirstLastPara="1" vertOverflow="ellipsis" vert="horz" wrap="square" anchor="ctr" anchorCtr="1"/>
+          <a:lstStyle/>
+          <a:p>
+            <a:pPr>
+              <a:defRPr sz="900" b="0" i="0" u="none" strike="noStrike" kern="1200" baseline="0">
+                <a:solidFill>
+                  <a:schemeClr val="tx1">
+                    <a:lumMod val="65000"/>
+                    <a:lumOff val="35000"/>
+                  </a:schemeClr>
+                </a:solidFill>
+                <a:latin typeface="+mn-lt"/>
+                <a:ea typeface="+mn-ea"/>
+                <a:cs typeface="+mn-cs"/>
+              </a:defRPr>
+            </a:pPr>
+            <a:endParaRPr lang="fr-FR"/>
+          </a:p>
+        </c:txPr>
+        <c:crossAx val="348718048"/>
+        <c:crosses val="autoZero"/>
+        <c:crossBetween val="midCat"/>
+      </c:valAx>
+      <c:valAx>
+        <c:axId val="348718048"/>
+        <c:scaling>
+          <c:orientation val="minMax"/>
+        </c:scaling>
+        <c:delete val="0"/>
+        <c:axPos val="l"/>
+        <c:majorGridlines>
+          <c:spPr>
+            <a:ln w="9525" cap="flat" cmpd="sng" algn="ctr">
+              <a:solidFill>
+                <a:schemeClr val="tx1">
+                  <a:lumMod val="15000"/>
+                  <a:lumOff val="85000"/>
+                </a:schemeClr>
+              </a:solidFill>
+              <a:round/>
+            </a:ln>
+            <a:effectLst/>
+          </c:spPr>
+        </c:majorGridlines>
+        <c:title>
+          <c:tx>
+            <c:rich>
+              <a:bodyPr rot="-5400000" spcFirstLastPara="1" vertOverflow="ellipsis" vert="horz" wrap="square" anchor="ctr" anchorCtr="1"/>
+              <a:lstStyle/>
+              <a:p>
+                <a:pPr>
+                  <a:defRPr sz="1000" b="0" i="0" u="none" strike="noStrike" kern="1200" baseline="0">
+                    <a:solidFill>
+                      <a:schemeClr val="tx1">
+                        <a:lumMod val="65000"/>
+                        <a:lumOff val="35000"/>
+                      </a:schemeClr>
+                    </a:solidFill>
+                    <a:latin typeface="+mn-lt"/>
+                    <a:ea typeface="+mn-ea"/>
+                    <a:cs typeface="+mn-cs"/>
+                  </a:defRPr>
+                </a:pPr>
+                <a:r>
+                  <a:rPr lang="fr-FR"/>
+                  <a:t>spectre</a:t>
+                </a:r>
+                <a:r>
+                  <a:rPr lang="fr-FR" baseline="0"/>
+                  <a:t> max en ADU</a:t>
+                </a:r>
+                <a:endParaRPr lang="fr-FR"/>
+              </a:p>
+            </c:rich>
+          </c:tx>
+          <c:overlay val="0"/>
+          <c:spPr>
+            <a:noFill/>
+            <a:ln>
+              <a:noFill/>
+            </a:ln>
+            <a:effectLst/>
+          </c:spPr>
+          <c:txPr>
+            <a:bodyPr rot="-5400000" spcFirstLastPara="1" vertOverflow="ellipsis" vert="horz" wrap="square" anchor="ctr" anchorCtr="1"/>
+            <a:lstStyle/>
+            <a:p>
+              <a:pPr>
+                <a:defRPr sz="1000" b="0" i="0" u="none" strike="noStrike" kern="1200" baseline="0">
+                  <a:solidFill>
+                    <a:schemeClr val="tx1">
+                      <a:lumMod val="65000"/>
+                      <a:lumOff val="35000"/>
+                    </a:schemeClr>
+                  </a:solidFill>
+                  <a:latin typeface="+mn-lt"/>
+                  <a:ea typeface="+mn-ea"/>
+                  <a:cs typeface="+mn-cs"/>
+                </a:defRPr>
+              </a:pPr>
+              <a:endParaRPr lang="fr-FR"/>
+            </a:p>
+          </c:txPr>
+        </c:title>
+        <c:numFmt formatCode="General" sourceLinked="1"/>
+        <c:majorTickMark val="none"/>
+        <c:minorTickMark val="none"/>
+        <c:tickLblPos val="nextTo"/>
+        <c:spPr>
+          <a:noFill/>
+          <a:ln w="9525" cap="flat" cmpd="sng" algn="ctr">
+            <a:solidFill>
+              <a:schemeClr val="tx1">
+                <a:lumMod val="25000"/>
+                <a:lumOff val="75000"/>
+              </a:schemeClr>
+            </a:solidFill>
+            <a:round/>
+          </a:ln>
+          <a:effectLst/>
+        </c:spPr>
+        <c:txPr>
+          <a:bodyPr rot="-60000000" spcFirstLastPara="1" vertOverflow="ellipsis" vert="horz" wrap="square" anchor="ctr" anchorCtr="1"/>
+          <a:lstStyle/>
+          <a:p>
+            <a:pPr>
+              <a:defRPr sz="900" b="0" i="0" u="none" strike="noStrike" kern="1200" baseline="0">
+                <a:solidFill>
+                  <a:schemeClr val="tx1">
+                    <a:lumMod val="65000"/>
+                    <a:lumOff val="35000"/>
+                  </a:schemeClr>
+                </a:solidFill>
+                <a:latin typeface="+mn-lt"/>
+                <a:ea typeface="+mn-ea"/>
+                <a:cs typeface="+mn-cs"/>
+              </a:defRPr>
+            </a:pPr>
+            <a:endParaRPr lang="fr-FR"/>
+          </a:p>
+        </c:txPr>
+        <c:crossAx val="348718440"/>
+        <c:crosses val="autoZero"/>
+        <c:crossBetween val="midCat"/>
+      </c:valAx>
+      <c:spPr>
+        <a:noFill/>
+        <a:ln>
+          <a:noFill/>
+        </a:ln>
+        <a:effectLst/>
+      </c:spPr>
+    </c:plotArea>
+    <c:legend>
+      <c:legendPos val="b"/>
+      <c:overlay val="0"/>
+      <c:spPr>
+        <a:noFill/>
+        <a:ln>
+          <a:noFill/>
+        </a:ln>
+        <a:effectLst/>
+      </c:spPr>
+      <c:txPr>
+        <a:bodyPr rot="0" spcFirstLastPara="1" vertOverflow="ellipsis" vert="horz" wrap="square" anchor="ctr" anchorCtr="1"/>
+        <a:lstStyle/>
+        <a:p>
+          <a:pPr>
+            <a:defRPr sz="900" b="0" i="0" u="none" strike="noStrike" kern="1200" baseline="0">
+              <a:solidFill>
+                <a:schemeClr val="tx1">
+                  <a:lumMod val="65000"/>
+                  <a:lumOff val="35000"/>
+                </a:schemeClr>
+              </a:solidFill>
+              <a:latin typeface="+mn-lt"/>
+              <a:ea typeface="+mn-ea"/>
+              <a:cs typeface="+mn-cs"/>
+            </a:defRPr>
+          </a:pPr>
+          <a:endParaRPr lang="fr-FR"/>
+        </a:p>
+      </c:txPr>
+    </c:legend>
     <c:plotVisOnly val="1"/>
     <c:dispBlanksAs val="gap"/>
     <c:showDLblsOverMax val="0"/>
@@ -16533,6 +17576,46 @@
 </file>
 
 <file path=word/charts/colors5.xml><?xml version="1.0" encoding="utf-8"?>
+<cs:colorStyle xmlns:cs="http://schemas.microsoft.com/office/drawing/2012/chartStyle" xmlns:a="http://schemas.openxmlformats.org/drawingml/2006/main" meth="cycle" id="10">
+  <a:schemeClr val="accent1"/>
+  <a:schemeClr val="accent2"/>
+  <a:schemeClr val="accent3"/>
+  <a:schemeClr val="accent4"/>
+  <a:schemeClr val="accent5"/>
+  <a:schemeClr val="accent6"/>
+  <cs:variation/>
+  <cs:variation>
+    <a:lumMod val="60000"/>
+  </cs:variation>
+  <cs:variation>
+    <a:lumMod val="80000"/>
+    <a:lumOff val="20000"/>
+  </cs:variation>
+  <cs:variation>
+    <a:lumMod val="80000"/>
+  </cs:variation>
+  <cs:variation>
+    <a:lumMod val="60000"/>
+    <a:lumOff val="40000"/>
+  </cs:variation>
+  <cs:variation>
+    <a:lumMod val="50000"/>
+  </cs:variation>
+  <cs:variation>
+    <a:lumMod val="70000"/>
+    <a:lumOff val="30000"/>
+  </cs:variation>
+  <cs:variation>
+    <a:lumMod val="70000"/>
+  </cs:variation>
+  <cs:variation>
+    <a:lumMod val="50000"/>
+    <a:lumOff val="50000"/>
+  </cs:variation>
+</cs:colorStyle>
+</file>
+
+<file path=word/charts/colors6.xml><?xml version="1.0" encoding="utf-8"?>
 <cs:colorStyle xmlns:cs="http://schemas.microsoft.com/office/drawing/2012/chartStyle" xmlns:a="http://schemas.openxmlformats.org/drawingml/2006/main" meth="cycle" id="10">
   <a:schemeClr val="accent1"/>
   <a:schemeClr val="accent2"/>
@@ -19152,6 +20235,522 @@
 </cs:chartStyle>
 </file>
 
+<file path=word/charts/style6.xml><?xml version="1.0" encoding="utf-8"?>
+<cs:chartStyle xmlns:cs="http://schemas.microsoft.com/office/drawing/2012/chartStyle" xmlns:a="http://schemas.openxmlformats.org/drawingml/2006/main" id="240">
+  <cs:axisTitle>
+    <cs:lnRef idx="0"/>
+    <cs:fillRef idx="0"/>
+    <cs:effectRef idx="0"/>
+    <cs:fontRef idx="minor">
+      <a:schemeClr val="tx1">
+        <a:lumMod val="65000"/>
+        <a:lumOff val="35000"/>
+      </a:schemeClr>
+    </cs:fontRef>
+    <cs:defRPr sz="1000" kern="1200"/>
+  </cs:axisTitle>
+  <cs:categoryAxis>
+    <cs:lnRef idx="0"/>
+    <cs:fillRef idx="0"/>
+    <cs:effectRef idx="0"/>
+    <cs:fontRef idx="minor">
+      <a:schemeClr val="tx1">
+        <a:lumMod val="65000"/>
+        <a:lumOff val="35000"/>
+      </a:schemeClr>
+    </cs:fontRef>
+    <cs:spPr>
+      <a:ln w="9525" cap="flat" cmpd="sng" algn="ctr">
+        <a:solidFill>
+          <a:schemeClr val="tx1">
+            <a:lumMod val="25000"/>
+            <a:lumOff val="75000"/>
+          </a:schemeClr>
+        </a:solidFill>
+        <a:round/>
+      </a:ln>
+    </cs:spPr>
+    <cs:defRPr sz="900" kern="1200"/>
+  </cs:categoryAxis>
+  <cs:chartArea mods="allowNoFillOverride allowNoLineOverride">
+    <cs:lnRef idx="0"/>
+    <cs:fillRef idx="0"/>
+    <cs:effectRef idx="0"/>
+    <cs:fontRef idx="minor">
+      <a:schemeClr val="tx1"/>
+    </cs:fontRef>
+    <cs:spPr>
+      <a:solidFill>
+        <a:schemeClr val="bg1"/>
+      </a:solidFill>
+      <a:ln w="9525" cap="flat" cmpd="sng" algn="ctr">
+        <a:solidFill>
+          <a:schemeClr val="tx1">
+            <a:lumMod val="15000"/>
+            <a:lumOff val="85000"/>
+          </a:schemeClr>
+        </a:solidFill>
+        <a:round/>
+      </a:ln>
+    </cs:spPr>
+    <cs:defRPr sz="1000" kern="1200"/>
+  </cs:chartArea>
+  <cs:dataLabel>
+    <cs:lnRef idx="0"/>
+    <cs:fillRef idx="0"/>
+    <cs:effectRef idx="0"/>
+    <cs:fontRef idx="minor">
+      <a:schemeClr val="tx1">
+        <a:lumMod val="75000"/>
+        <a:lumOff val="25000"/>
+      </a:schemeClr>
+    </cs:fontRef>
+    <cs:defRPr sz="900" kern="1200"/>
+  </cs:dataLabel>
+  <cs:dataLabelCallout>
+    <cs:lnRef idx="0"/>
+    <cs:fillRef idx="0"/>
+    <cs:effectRef idx="0"/>
+    <cs:fontRef idx="minor">
+      <a:schemeClr val="dk1">
+        <a:lumMod val="65000"/>
+        <a:lumOff val="35000"/>
+      </a:schemeClr>
+    </cs:fontRef>
+    <cs:spPr>
+      <a:solidFill>
+        <a:schemeClr val="lt1"/>
+      </a:solidFill>
+      <a:ln>
+        <a:solidFill>
+          <a:schemeClr val="dk1">
+            <a:lumMod val="25000"/>
+            <a:lumOff val="75000"/>
+          </a:schemeClr>
+        </a:solidFill>
+      </a:ln>
+    </cs:spPr>
+    <cs:defRPr sz="900" kern="1200"/>
+    <cs:bodyPr rot="0" spcFirstLastPara="1" vertOverflow="clip" horzOverflow="clip" vert="horz" wrap="square" lIns="36576" tIns="18288" rIns="36576" bIns="18288" anchor="ctr" anchorCtr="1">
+      <a:spAutoFit/>
+    </cs:bodyPr>
+  </cs:dataLabelCallout>
+  <cs:dataPoint>
+    <cs:lnRef idx="0"/>
+    <cs:fillRef idx="1">
+      <cs:styleClr val="auto"/>
+    </cs:fillRef>
+    <cs:effectRef idx="0"/>
+    <cs:fontRef idx="minor">
+      <a:schemeClr val="tx1"/>
+    </cs:fontRef>
+  </cs:dataPoint>
+  <cs:dataPoint3D>
+    <cs:lnRef idx="0"/>
+    <cs:fillRef idx="1">
+      <cs:styleClr val="auto"/>
+    </cs:fillRef>
+    <cs:effectRef idx="0"/>
+    <cs:fontRef idx="minor">
+      <a:schemeClr val="tx1"/>
+    </cs:fontRef>
+  </cs:dataPoint3D>
+  <cs:dataPointLine>
+    <cs:lnRef idx="0">
+      <cs:styleClr val="auto"/>
+    </cs:lnRef>
+    <cs:fillRef idx="1"/>
+    <cs:effectRef idx="0"/>
+    <cs:fontRef idx="minor">
+      <a:schemeClr val="tx1"/>
+    </cs:fontRef>
+    <cs:spPr>
+      <a:ln w="19050" cap="rnd">
+        <a:solidFill>
+          <a:schemeClr val="phClr"/>
+        </a:solidFill>
+        <a:round/>
+      </a:ln>
+    </cs:spPr>
+  </cs:dataPointLine>
+  <cs:dataPointMarker>
+    <cs:lnRef idx="0">
+      <cs:styleClr val="auto"/>
+    </cs:lnRef>
+    <cs:fillRef idx="1">
+      <cs:styleClr val="auto"/>
+    </cs:fillRef>
+    <cs:effectRef idx="0"/>
+    <cs:fontRef idx="minor">
+      <a:schemeClr val="tx1"/>
+    </cs:fontRef>
+    <cs:spPr>
+      <a:ln w="9525">
+        <a:solidFill>
+          <a:schemeClr val="phClr"/>
+        </a:solidFill>
+      </a:ln>
+    </cs:spPr>
+  </cs:dataPointMarker>
+  <cs:dataPointMarkerLayout symbol="circle" size="5"/>
+  <cs:dataPointWireframe>
+    <cs:lnRef idx="0">
+      <cs:styleClr val="auto"/>
+    </cs:lnRef>
+    <cs:fillRef idx="0"/>
+    <cs:effectRef idx="0"/>
+    <cs:fontRef idx="minor">
+      <a:schemeClr val="dk1"/>
+    </cs:fontRef>
+    <cs:spPr>
+      <a:ln w="9525" cap="rnd">
+        <a:solidFill>
+          <a:schemeClr val="phClr"/>
+        </a:solidFill>
+        <a:round/>
+      </a:ln>
+    </cs:spPr>
+  </cs:dataPointWireframe>
+  <cs:dataTable>
+    <cs:lnRef idx="0"/>
+    <cs:fillRef idx="0"/>
+    <cs:effectRef idx="0"/>
+    <cs:fontRef idx="minor">
+      <a:schemeClr val="tx1">
+        <a:lumMod val="65000"/>
+        <a:lumOff val="35000"/>
+      </a:schemeClr>
+    </cs:fontRef>
+    <cs:spPr>
+      <a:noFill/>
+      <a:ln w="9525" cap="flat" cmpd="sng" algn="ctr">
+        <a:solidFill>
+          <a:schemeClr val="tx1">
+            <a:lumMod val="15000"/>
+            <a:lumOff val="85000"/>
+          </a:schemeClr>
+        </a:solidFill>
+        <a:round/>
+      </a:ln>
+    </cs:spPr>
+    <cs:defRPr sz="900" kern="1200"/>
+  </cs:dataTable>
+  <cs:downBar>
+    <cs:lnRef idx="0"/>
+    <cs:fillRef idx="0"/>
+    <cs:effectRef idx="0"/>
+    <cs:fontRef idx="minor">
+      <a:schemeClr val="tx1"/>
+    </cs:fontRef>
+    <cs:spPr>
+      <a:solidFill>
+        <a:schemeClr val="dk1">
+          <a:lumMod val="75000"/>
+          <a:lumOff val="25000"/>
+        </a:schemeClr>
+      </a:solidFill>
+      <a:ln w="9525" cap="flat" cmpd="sng" algn="ctr">
+        <a:solidFill>
+          <a:schemeClr val="tx1">
+            <a:lumMod val="65000"/>
+            <a:lumOff val="35000"/>
+          </a:schemeClr>
+        </a:solidFill>
+        <a:round/>
+      </a:ln>
+    </cs:spPr>
+  </cs:downBar>
+  <cs:dropLine>
+    <cs:lnRef idx="0"/>
+    <cs:fillRef idx="0"/>
+    <cs:effectRef idx="0"/>
+    <cs:fontRef idx="minor">
+      <a:schemeClr val="tx1"/>
+    </cs:fontRef>
+    <cs:spPr>
+      <a:ln w="9525" cap="flat" cmpd="sng" algn="ctr">
+        <a:solidFill>
+          <a:schemeClr val="tx1">
+            <a:lumMod val="35000"/>
+            <a:lumOff val="65000"/>
+          </a:schemeClr>
+        </a:solidFill>
+        <a:round/>
+      </a:ln>
+    </cs:spPr>
+  </cs:dropLine>
+  <cs:errorBar>
+    <cs:lnRef idx="0"/>
+    <cs:fillRef idx="0"/>
+    <cs:effectRef idx="0"/>
+    <cs:fontRef idx="minor">
+      <a:schemeClr val="tx1"/>
+    </cs:fontRef>
+    <cs:spPr>
+      <a:ln w="9525" cap="flat" cmpd="sng" algn="ctr">
+        <a:solidFill>
+          <a:schemeClr val="tx1">
+            <a:lumMod val="65000"/>
+            <a:lumOff val="35000"/>
+          </a:schemeClr>
+        </a:solidFill>
+        <a:round/>
+      </a:ln>
+    </cs:spPr>
+  </cs:errorBar>
+  <cs:floor>
+    <cs:lnRef idx="0"/>
+    <cs:fillRef idx="0"/>
+    <cs:effectRef idx="0"/>
+    <cs:fontRef idx="minor">
+      <a:schemeClr val="tx1"/>
+    </cs:fontRef>
+    <cs:spPr>
+      <a:noFill/>
+      <a:ln>
+        <a:noFill/>
+      </a:ln>
+    </cs:spPr>
+  </cs:floor>
+  <cs:gridlineMajor>
+    <cs:lnRef idx="0"/>
+    <cs:fillRef idx="0"/>
+    <cs:effectRef idx="0"/>
+    <cs:fontRef idx="minor">
+      <a:schemeClr val="tx1"/>
+    </cs:fontRef>
+    <cs:spPr>
+      <a:ln w="9525" cap="flat" cmpd="sng" algn="ctr">
+        <a:solidFill>
+          <a:schemeClr val="tx1">
+            <a:lumMod val="15000"/>
+            <a:lumOff val="85000"/>
+          </a:schemeClr>
+        </a:solidFill>
+        <a:round/>
+      </a:ln>
+    </cs:spPr>
+  </cs:gridlineMajor>
+  <cs:gridlineMinor>
+    <cs:lnRef idx="0"/>
+    <cs:fillRef idx="0"/>
+    <cs:effectRef idx="0"/>
+    <cs:fontRef idx="minor">
+      <a:schemeClr val="tx1"/>
+    </cs:fontRef>
+    <cs:spPr>
+      <a:ln w="9525" cap="flat" cmpd="sng" algn="ctr">
+        <a:solidFill>
+          <a:schemeClr val="tx1">
+            <a:lumMod val="5000"/>
+            <a:lumOff val="95000"/>
+          </a:schemeClr>
+        </a:solidFill>
+        <a:round/>
+      </a:ln>
+    </cs:spPr>
+  </cs:gridlineMinor>
+  <cs:hiLoLine>
+    <cs:lnRef idx="0"/>
+    <cs:fillRef idx="0"/>
+    <cs:effectRef idx="0"/>
+    <cs:fontRef idx="minor">
+      <a:schemeClr val="tx1"/>
+    </cs:fontRef>
+    <cs:spPr>
+      <a:ln w="9525" cap="flat" cmpd="sng" algn="ctr">
+        <a:solidFill>
+          <a:schemeClr val="tx1">
+            <a:lumMod val="50000"/>
+            <a:lumOff val="50000"/>
+          </a:schemeClr>
+        </a:solidFill>
+        <a:round/>
+      </a:ln>
+    </cs:spPr>
+  </cs:hiLoLine>
+  <cs:leaderLine>
+    <cs:lnRef idx="0"/>
+    <cs:fillRef idx="0"/>
+    <cs:effectRef idx="0"/>
+    <cs:fontRef idx="minor">
+      <a:schemeClr val="tx1"/>
+    </cs:fontRef>
+    <cs:spPr>
+      <a:ln w="9525" cap="flat" cmpd="sng" algn="ctr">
+        <a:solidFill>
+          <a:schemeClr val="tx1">
+            <a:lumMod val="35000"/>
+            <a:lumOff val="65000"/>
+          </a:schemeClr>
+        </a:solidFill>
+        <a:round/>
+      </a:ln>
+    </cs:spPr>
+  </cs:leaderLine>
+  <cs:legend>
+    <cs:lnRef idx="0"/>
+    <cs:fillRef idx="0"/>
+    <cs:effectRef idx="0"/>
+    <cs:fontRef idx="minor">
+      <a:schemeClr val="tx1">
+        <a:lumMod val="65000"/>
+        <a:lumOff val="35000"/>
+      </a:schemeClr>
+    </cs:fontRef>
+    <cs:defRPr sz="900" kern="1200"/>
+  </cs:legend>
+  <cs:plotArea mods="allowNoFillOverride allowNoLineOverride">
+    <cs:lnRef idx="0"/>
+    <cs:fillRef idx="0"/>
+    <cs:effectRef idx="0"/>
+    <cs:fontRef idx="minor">
+      <a:schemeClr val="tx1"/>
+    </cs:fontRef>
+  </cs:plotArea>
+  <cs:plotArea3D mods="allowNoFillOverride allowNoLineOverride">
+    <cs:lnRef idx="0"/>
+    <cs:fillRef idx="0"/>
+    <cs:effectRef idx="0"/>
+    <cs:fontRef idx="minor">
+      <a:schemeClr val="tx1"/>
+    </cs:fontRef>
+  </cs:plotArea3D>
+  <cs:seriesAxis>
+    <cs:lnRef idx="0"/>
+    <cs:fillRef idx="0"/>
+    <cs:effectRef idx="0"/>
+    <cs:fontRef idx="minor">
+      <a:schemeClr val="tx1">
+        <a:lumMod val="65000"/>
+        <a:lumOff val="35000"/>
+      </a:schemeClr>
+    </cs:fontRef>
+    <cs:defRPr sz="900" kern="1200"/>
+  </cs:seriesAxis>
+  <cs:seriesLine>
+    <cs:lnRef idx="0"/>
+    <cs:fillRef idx="0"/>
+    <cs:effectRef idx="0"/>
+    <cs:fontRef idx="minor">
+      <a:schemeClr val="tx1"/>
+    </cs:fontRef>
+    <cs:spPr>
+      <a:ln w="9525" cap="flat" cmpd="sng" algn="ctr">
+        <a:solidFill>
+          <a:schemeClr val="tx1">
+            <a:lumMod val="35000"/>
+            <a:lumOff val="65000"/>
+          </a:schemeClr>
+        </a:solidFill>
+        <a:round/>
+      </a:ln>
+    </cs:spPr>
+  </cs:seriesLine>
+  <cs:title>
+    <cs:lnRef idx="0"/>
+    <cs:fillRef idx="0"/>
+    <cs:effectRef idx="0"/>
+    <cs:fontRef idx="minor">
+      <a:schemeClr val="tx1">
+        <a:lumMod val="65000"/>
+        <a:lumOff val="35000"/>
+      </a:schemeClr>
+    </cs:fontRef>
+    <cs:defRPr sz="1400" b="0" kern="1200" spc="0" baseline="0"/>
+  </cs:title>
+  <cs:trendline>
+    <cs:lnRef idx="0">
+      <cs:styleClr val="auto"/>
+    </cs:lnRef>
+    <cs:fillRef idx="0"/>
+    <cs:effectRef idx="0"/>
+    <cs:fontRef idx="minor">
+      <a:schemeClr val="tx1"/>
+    </cs:fontRef>
+    <cs:spPr>
+      <a:ln w="19050" cap="rnd">
+        <a:solidFill>
+          <a:schemeClr val="phClr"/>
+        </a:solidFill>
+        <a:prstDash val="sysDot"/>
+      </a:ln>
+    </cs:spPr>
+  </cs:trendline>
+  <cs:trendlineLabel>
+    <cs:lnRef idx="0"/>
+    <cs:fillRef idx="0"/>
+    <cs:effectRef idx="0"/>
+    <cs:fontRef idx="minor">
+      <a:schemeClr val="tx1">
+        <a:lumMod val="65000"/>
+        <a:lumOff val="35000"/>
+      </a:schemeClr>
+    </cs:fontRef>
+    <cs:defRPr sz="900" kern="1200"/>
+  </cs:trendlineLabel>
+  <cs:upBar>
+    <cs:lnRef idx="0"/>
+    <cs:fillRef idx="0"/>
+    <cs:effectRef idx="0"/>
+    <cs:fontRef idx="minor">
+      <a:schemeClr val="tx1"/>
+    </cs:fontRef>
+    <cs:spPr>
+      <a:solidFill>
+        <a:schemeClr val="lt1"/>
+      </a:solidFill>
+      <a:ln w="9525" cap="flat" cmpd="sng" algn="ctr">
+        <a:solidFill>
+          <a:schemeClr val="tx1">
+            <a:lumMod val="65000"/>
+            <a:lumOff val="35000"/>
+          </a:schemeClr>
+        </a:solidFill>
+        <a:round/>
+      </a:ln>
+    </cs:spPr>
+  </cs:upBar>
+  <cs:valueAxis>
+    <cs:lnRef idx="0"/>
+    <cs:fillRef idx="0"/>
+    <cs:effectRef idx="0"/>
+    <cs:fontRef idx="minor">
+      <a:schemeClr val="tx1">
+        <a:lumMod val="65000"/>
+        <a:lumOff val="35000"/>
+      </a:schemeClr>
+    </cs:fontRef>
+    <cs:spPr>
+      <a:ln w="9525" cap="flat" cmpd="sng" algn="ctr">
+        <a:solidFill>
+          <a:schemeClr val="tx1">
+            <a:lumMod val="25000"/>
+            <a:lumOff val="75000"/>
+          </a:schemeClr>
+        </a:solidFill>
+        <a:round/>
+      </a:ln>
+    </cs:spPr>
+    <cs:defRPr sz="900" kern="1200"/>
+  </cs:valueAxis>
+  <cs:wall>
+    <cs:lnRef idx="0"/>
+    <cs:fillRef idx="0"/>
+    <cs:effectRef idx="0"/>
+    <cs:fontRef idx="minor">
+      <a:schemeClr val="tx1"/>
+    </cs:fontRef>
+    <cs:spPr>
+      <a:noFill/>
+      <a:ln>
+        <a:noFill/>
+      </a:ln>
+    </cs:spPr>
+  </cs:wall>
+</cs:chartStyle>
+</file>
+
 <file path=word/theme/theme1.xml><?xml version="1.0" encoding="utf-8"?>
 <a:theme xmlns:a="http://schemas.openxmlformats.org/drawingml/2006/main" name="Thème Office">
   <a:themeElements>
@@ -19418,7 +21017,7 @@
 </file>
 
 <file path=customXml/itemProps1.xml><?xml version="1.0" encoding="utf-8"?>
-<ds:datastoreItem xmlns:ds="http://schemas.openxmlformats.org/officeDocument/2006/customXml" ds:itemID="{C8ACFD39-B9E0-4B1F-9943-554FC8820F9A}">
+<ds:datastoreItem xmlns:ds="http://schemas.openxmlformats.org/officeDocument/2006/customXml" ds:itemID="{A554BB43-3AC6-46C1-8E06-346C5C7E907C}">
   <ds:schemaRefs>
     <ds:schemaRef ds:uri="http://schemas.openxmlformats.org/officeDocument/2006/bibliography"/>
   </ds:schemaRefs>

</xml_diff>

<commit_message>
+ Ajout shaper sur le doc Architecture_resultat_EGSE.docx
</commit_message>
<xml_diff>
--- a/doc/Architecture_resultat_EGSE.docx
+++ b/doc/Architecture_resultat_EGSE.docx
@@ -2676,11 +2676,21 @@
             <w:r>
               <w:t xml:space="preserve">DR </w:t>
             </w:r>
-            <w:fldSimple w:instr=" SEQ DR \* ARABIC ">
-              <w:r>
-                <w:t>1</w:t>
-              </w:r>
-            </w:fldSimple>
+            <w:r>
+              <w:fldChar w:fldCharType="begin"/>
+            </w:r>
+            <w:r>
+              <w:instrText xml:space="preserve"> SEQ DR \* ARABIC </w:instrText>
+            </w:r>
+            <w:r>
+              <w:fldChar w:fldCharType="separate"/>
+            </w:r>
+            <w:r>
+              <w:t>1</w:t>
+            </w:r>
+            <w:r>
+              <w:fldChar w:fldCharType="end"/>
+            </w:r>
           </w:p>
         </w:tc>
         <w:tc>
@@ -2744,11 +2754,21 @@
             <w:r>
               <w:t xml:space="preserve">DR </w:t>
             </w:r>
-            <w:fldSimple w:instr=" SEQ DR \* ARABIC ">
-              <w:r>
-                <w:t>2</w:t>
-              </w:r>
-            </w:fldSimple>
+            <w:r>
+              <w:fldChar w:fldCharType="begin"/>
+            </w:r>
+            <w:r>
+              <w:instrText xml:space="preserve"> SEQ DR \* ARABIC </w:instrText>
+            </w:r>
+            <w:r>
+              <w:fldChar w:fldCharType="separate"/>
+            </w:r>
+            <w:r>
+              <w:t>2</w:t>
+            </w:r>
+            <w:r>
+              <w:fldChar w:fldCharType="end"/>
+            </w:r>
           </w:p>
         </w:tc>
         <w:tc>
@@ -2812,11 +2832,21 @@
             <w:r>
               <w:t xml:space="preserve">DR </w:t>
             </w:r>
-            <w:fldSimple w:instr=" SEQ DR \* ARABIC ">
-              <w:r>
-                <w:t>3</w:t>
-              </w:r>
-            </w:fldSimple>
+            <w:r>
+              <w:fldChar w:fldCharType="begin"/>
+            </w:r>
+            <w:r>
+              <w:instrText xml:space="preserve"> SEQ DR \* ARABIC </w:instrText>
+            </w:r>
+            <w:r>
+              <w:fldChar w:fldCharType="separate"/>
+            </w:r>
+            <w:r>
+              <w:t>3</w:t>
+            </w:r>
+            <w:r>
+              <w:fldChar w:fldCharType="end"/>
+            </w:r>
           </w:p>
         </w:tc>
         <w:tc>
@@ -3063,11 +3093,21 @@
             <w:r>
               <w:t xml:space="preserve">DA </w:t>
             </w:r>
-            <w:fldSimple w:instr=" SEQ AD \* ARABIC ">
-              <w:r>
-                <w:t>1</w:t>
-              </w:r>
-            </w:fldSimple>
+            <w:r>
+              <w:fldChar w:fldCharType="begin"/>
+            </w:r>
+            <w:r>
+              <w:instrText xml:space="preserve"> SEQ AD \* ARABIC </w:instrText>
+            </w:r>
+            <w:r>
+              <w:fldChar w:fldCharType="separate"/>
+            </w:r>
+            <w:r>
+              <w:t>1</w:t>
+            </w:r>
+            <w:r>
+              <w:fldChar w:fldCharType="end"/>
+            </w:r>
           </w:p>
         </w:tc>
         <w:tc>
@@ -3132,11 +3172,21 @@
             <w:r>
               <w:t xml:space="preserve">DA </w:t>
             </w:r>
-            <w:fldSimple w:instr=" SEQ AD \* ARABIC ">
-              <w:r>
-                <w:t>2</w:t>
-              </w:r>
-            </w:fldSimple>
+            <w:r>
+              <w:fldChar w:fldCharType="begin"/>
+            </w:r>
+            <w:r>
+              <w:instrText xml:space="preserve"> SEQ AD \* ARABIC </w:instrText>
+            </w:r>
+            <w:r>
+              <w:fldChar w:fldCharType="separate"/>
+            </w:r>
+            <w:r>
+              <w:t>2</w:t>
+            </w:r>
+            <w:r>
+              <w:fldChar w:fldCharType="end"/>
+            </w:r>
           </w:p>
         </w:tc>
         <w:tc>
@@ -3201,11 +3251,21 @@
             <w:r>
               <w:t xml:space="preserve">DA </w:t>
             </w:r>
-            <w:fldSimple w:instr=" SEQ AD \* ARABIC ">
-              <w:r>
-                <w:t>3</w:t>
-              </w:r>
-            </w:fldSimple>
+            <w:r>
+              <w:fldChar w:fldCharType="begin"/>
+            </w:r>
+            <w:r>
+              <w:instrText xml:space="preserve"> SEQ AD \* ARABIC </w:instrText>
+            </w:r>
+            <w:r>
+              <w:fldChar w:fldCharType="separate"/>
+            </w:r>
+            <w:r>
+              <w:t>3</w:t>
+            </w:r>
+            <w:r>
+              <w:fldChar w:fldCharType="end"/>
+            </w:r>
           </w:p>
         </w:tc>
         <w:tc>
@@ -3345,7 +3405,7 @@
         </w:rPr>
         <w:fldChar w:fldCharType="separate"/>
       </w:r>
-      <w:hyperlink w:anchor="_Toc175216544" w:history="1">
+      <w:hyperlink w:anchor="_Toc175303193" w:history="1">
         <w:r>
           <w:rPr>
             <w:rStyle w:val="Lienhypertexte"/>
@@ -3393,7 +3453,7 @@
             <w:noProof/>
             <w:webHidden/>
           </w:rPr>
-          <w:instrText xml:space="preserve"> PAGEREF _Toc175216544 \h </w:instrText>
+          <w:instrText xml:space="preserve"> PAGEREF _Toc175303193 \h </w:instrText>
         </w:r>
         <w:r>
           <w:rPr>
@@ -3441,7 +3501,7 @@
           <w:lang w:val="fr-FR"/>
         </w:rPr>
       </w:pPr>
-      <w:hyperlink w:anchor="_Toc175216545" w:history="1">
+      <w:hyperlink w:anchor="_Toc175303194" w:history="1">
         <w:r>
           <w:rPr>
             <w:rStyle w:val="Lienhypertexte"/>
@@ -3489,7 +3549,7 @@
             <w:noProof/>
             <w:webHidden/>
           </w:rPr>
-          <w:instrText xml:space="preserve"> PAGEREF _Toc175216545 \h </w:instrText>
+          <w:instrText xml:space="preserve"> PAGEREF _Toc175303194 \h </w:instrText>
         </w:r>
         <w:r>
           <w:rPr>
@@ -3537,7 +3597,7 @@
           <w:lang w:val="fr-FR"/>
         </w:rPr>
       </w:pPr>
-      <w:hyperlink w:anchor="_Toc175216546" w:history="1">
+      <w:hyperlink w:anchor="_Toc175303195" w:history="1">
         <w:r>
           <w:rPr>
             <w:rStyle w:val="Lienhypertexte"/>
@@ -3585,7 +3645,7 @@
             <w:noProof/>
             <w:webHidden/>
           </w:rPr>
-          <w:instrText xml:space="preserve"> PAGEREF _Toc175216546 \h </w:instrText>
+          <w:instrText xml:space="preserve"> PAGEREF _Toc175303195 \h </w:instrText>
         </w:r>
         <w:r>
           <w:rPr>
@@ -3632,7 +3692,7 @@
           <w:lang w:val="fr-FR"/>
         </w:rPr>
       </w:pPr>
-      <w:hyperlink w:anchor="_Toc175216547" w:history="1">
+      <w:hyperlink w:anchor="_Toc175303196" w:history="1">
         <w:r>
           <w:rPr>
             <w:rStyle w:val="Lienhypertexte"/>
@@ -3679,7 +3739,7 @@
             <w:noProof/>
             <w:webHidden/>
           </w:rPr>
-          <w:instrText xml:space="preserve"> PAGEREF _Toc175216547 \h </w:instrText>
+          <w:instrText xml:space="preserve"> PAGEREF _Toc175303196 \h </w:instrText>
         </w:r>
         <w:r>
           <w:rPr>
@@ -3726,7 +3786,7 @@
           <w:lang w:val="fr-FR"/>
         </w:rPr>
       </w:pPr>
-      <w:hyperlink w:anchor="_Toc175216548" w:history="1">
+      <w:hyperlink w:anchor="_Toc175303197" w:history="1">
         <w:r>
           <w:rPr>
             <w:rStyle w:val="Lienhypertexte"/>
@@ -3773,7 +3833,7 @@
             <w:noProof/>
             <w:webHidden/>
           </w:rPr>
-          <w:instrText xml:space="preserve"> PAGEREF _Toc175216548 \h </w:instrText>
+          <w:instrText xml:space="preserve"> PAGEREF _Toc175303197 \h </w:instrText>
         </w:r>
         <w:r>
           <w:rPr>
@@ -3820,7 +3880,7 @@
           <w:lang w:val="fr-FR"/>
         </w:rPr>
       </w:pPr>
-      <w:hyperlink w:anchor="_Toc175216549" w:history="1">
+      <w:hyperlink w:anchor="_Toc175303198" w:history="1">
         <w:r>
           <w:rPr>
             <w:rStyle w:val="Lienhypertexte"/>
@@ -3867,7 +3927,7 @@
             <w:noProof/>
             <w:webHidden/>
           </w:rPr>
-          <w:instrText xml:space="preserve"> PAGEREF _Toc175216549 \h </w:instrText>
+          <w:instrText xml:space="preserve"> PAGEREF _Toc175303198 \h </w:instrText>
         </w:r>
         <w:r>
           <w:rPr>
@@ -3915,7 +3975,7 @@
           <w:lang w:val="fr-FR"/>
         </w:rPr>
       </w:pPr>
-      <w:hyperlink w:anchor="_Toc175216550" w:history="1">
+      <w:hyperlink w:anchor="_Toc175303199" w:history="1">
         <w:r>
           <w:rPr>
             <w:rStyle w:val="Lienhypertexte"/>
@@ -3963,7 +4023,7 @@
             <w:noProof/>
             <w:webHidden/>
           </w:rPr>
-          <w:instrText xml:space="preserve"> PAGEREF _Toc175216550 \h </w:instrText>
+          <w:instrText xml:space="preserve"> PAGEREF _Toc175303199 \h </w:instrText>
         </w:r>
         <w:r>
           <w:rPr>
@@ -4010,7 +4070,7 @@
           <w:lang w:val="fr-FR"/>
         </w:rPr>
       </w:pPr>
-      <w:hyperlink w:anchor="_Toc175216551" w:history="1">
+      <w:hyperlink w:anchor="_Toc175303200" w:history="1">
         <w:r>
           <w:rPr>
             <w:rStyle w:val="Lienhypertexte"/>
@@ -4036,7 +4096,7 @@
             <w:noProof/>
             <w:lang w:val="fr-FR"/>
           </w:rPr>
-          <w:t>“Shaper” analogique et CAN</w:t>
+          <w:t>“Shaper” analogique</w:t>
         </w:r>
         <w:r>
           <w:rPr>
@@ -4057,7 +4117,7 @@
             <w:noProof/>
             <w:webHidden/>
           </w:rPr>
-          <w:instrText xml:space="preserve"> PAGEREF _Toc175216551 \h </w:instrText>
+          <w:instrText xml:space="preserve"> PAGEREF _Toc175303200 \h </w:instrText>
         </w:r>
         <w:r>
           <w:rPr>
@@ -4104,7 +4164,7 @@
           <w:lang w:val="fr-FR"/>
         </w:rPr>
       </w:pPr>
-      <w:hyperlink w:anchor="_Toc175216552" w:history="1">
+      <w:hyperlink w:anchor="_Toc175303201" w:history="1">
         <w:r>
           <w:rPr>
             <w:rStyle w:val="Lienhypertexte"/>
@@ -4130,7 +4190,7 @@
             <w:noProof/>
             <w:lang w:val="fr-FR"/>
           </w:rPr>
-          <w:t>Fonction de transfert de la lecture du CAN</w:t>
+          <w:t>CAN et entrée de filtre</w:t>
         </w:r>
         <w:r>
           <w:rPr>
@@ -4151,7 +4211,7 @@
             <w:noProof/>
             <w:webHidden/>
           </w:rPr>
-          <w:instrText xml:space="preserve"> PAGEREF _Toc175216552 \h </w:instrText>
+          <w:instrText xml:space="preserve"> PAGEREF _Toc175303201 \h </w:instrText>
         </w:r>
         <w:r>
           <w:rPr>
@@ -4171,7 +4231,7 @@
             <w:noProof/>
             <w:webHidden/>
           </w:rPr>
-          <w:t>7</w:t>
+          <w:t>8</w:t>
         </w:r>
         <w:r>
           <w:rPr>
@@ -4198,7 +4258,7 @@
           <w:lang w:val="fr-FR"/>
         </w:rPr>
       </w:pPr>
-      <w:hyperlink w:anchor="_Toc175216553" w:history="1">
+      <w:hyperlink w:anchor="_Toc175303202" w:history="1">
         <w:r>
           <w:rPr>
             <w:rStyle w:val="Lienhypertexte"/>
@@ -4224,6 +4284,100 @@
             <w:noProof/>
             <w:lang w:val="fr-FR"/>
           </w:rPr>
+          <w:t>Fonction de transfert de la lecture du CAN</w:t>
+        </w:r>
+        <w:r>
+          <w:rPr>
+            <w:noProof/>
+            <w:webHidden/>
+          </w:rPr>
+          <w:tab/>
+        </w:r>
+        <w:r>
+          <w:rPr>
+            <w:noProof/>
+            <w:webHidden/>
+          </w:rPr>
+          <w:fldChar w:fldCharType="begin"/>
+        </w:r>
+        <w:r>
+          <w:rPr>
+            <w:noProof/>
+            <w:webHidden/>
+          </w:rPr>
+          <w:instrText xml:space="preserve"> PAGEREF _Toc175303202 \h </w:instrText>
+        </w:r>
+        <w:r>
+          <w:rPr>
+            <w:noProof/>
+            <w:webHidden/>
+          </w:rPr>
+        </w:r>
+        <w:r>
+          <w:rPr>
+            <w:noProof/>
+            <w:webHidden/>
+          </w:rPr>
+          <w:fldChar w:fldCharType="separate"/>
+        </w:r>
+        <w:r>
+          <w:rPr>
+            <w:noProof/>
+            <w:webHidden/>
+          </w:rPr>
+          <w:t>8</w:t>
+        </w:r>
+        <w:r>
+          <w:rPr>
+            <w:noProof/>
+            <w:webHidden/>
+          </w:rPr>
+          <w:fldChar w:fldCharType="end"/>
+        </w:r>
+      </w:hyperlink>
+    </w:p>
+    <w:p>
+      <w:pPr>
+        <w:pStyle w:val="TM2"/>
+        <w:tabs>
+          <w:tab w:val="left" w:pos="960"/>
+          <w:tab w:val="right" w:leader="dot" w:pos="9622"/>
+        </w:tabs>
+        <w:rPr>
+          <w:rFonts w:asciiTheme="minorHAnsi" w:eastAsiaTheme="minorEastAsia" w:hAnsiTheme="minorHAnsi" w:cstheme="minorBidi"/>
+          <w:smallCaps w:val="0"/>
+          <w:noProof/>
+          <w:sz w:val="22"/>
+          <w:szCs w:val="22"/>
+          <w:lang w:val="fr-FR"/>
+        </w:rPr>
+      </w:pPr>
+      <w:hyperlink w:anchor="_Toc175303203" w:history="1">
+        <w:r>
+          <w:rPr>
+            <w:rStyle w:val="Lienhypertexte"/>
+            <w:noProof/>
+            <w:lang w:val="fr-FR"/>
+          </w:rPr>
+          <w:t>4.4.</w:t>
+        </w:r>
+        <w:r>
+          <w:rPr>
+            <w:rFonts w:asciiTheme="minorHAnsi" w:eastAsiaTheme="minorEastAsia" w:hAnsiTheme="minorHAnsi" w:cstheme="minorBidi"/>
+            <w:smallCaps w:val="0"/>
+            <w:noProof/>
+            <w:sz w:val="22"/>
+            <w:szCs w:val="22"/>
+            <w:lang w:val="fr-FR"/>
+          </w:rPr>
+          <w:tab/>
+        </w:r>
+        <w:r>
+          <w:rPr>
+            <w:rStyle w:val="Lienhypertexte"/>
+            <w:noProof/>
+            <w:lang w:val="fr-FR"/>
+          </w:rPr>
           <w:t>Fonction de transfert du filtre à réponse impulsionnelle finie</w:t>
         </w:r>
         <w:r>
@@ -4245,7 +4399,7 @@
             <w:noProof/>
             <w:webHidden/>
           </w:rPr>
-          <w:instrText xml:space="preserve"> PAGEREF _Toc175216553 \h </w:instrText>
+          <w:instrText xml:space="preserve"> PAGEREF _Toc175303203 \h </w:instrText>
         </w:r>
         <w:r>
           <w:rPr>
@@ -4265,7 +4419,7 @@
             <w:noProof/>
             <w:webHidden/>
           </w:rPr>
-          <w:t>8</w:t>
+          <w:t>9</w:t>
         </w:r>
         <w:r>
           <w:rPr>
@@ -4292,14 +4446,14 @@
           <w:lang w:val="fr-FR"/>
         </w:rPr>
       </w:pPr>
-      <w:hyperlink w:anchor="_Toc175216554" w:history="1">
+      <w:hyperlink w:anchor="_Toc175303204" w:history="1">
         <w:r>
           <w:rPr>
             <w:rStyle w:val="Lienhypertexte"/>
             <w:noProof/>
             <w:lang w:val="fr-FR"/>
           </w:rPr>
-          <w:t>4.3.1.</w:t>
+          <w:t>4.4.1.</w:t>
         </w:r>
         <w:r>
           <w:rPr>
@@ -4339,7 +4493,7 @@
             <w:noProof/>
             <w:webHidden/>
           </w:rPr>
-          <w:instrText xml:space="preserve"> PAGEREF _Toc175216554 \h </w:instrText>
+          <w:instrText xml:space="preserve"> PAGEREF _Toc175303204 \h </w:instrText>
         </w:r>
         <w:r>
           <w:rPr>
@@ -4359,7 +4513,7 @@
             <w:noProof/>
             <w:webHidden/>
           </w:rPr>
-          <w:t>8</w:t>
+          <w:t>9</w:t>
         </w:r>
         <w:r>
           <w:rPr>
@@ -4386,14 +4540,14 @@
           <w:lang w:val="fr-FR"/>
         </w:rPr>
       </w:pPr>
-      <w:hyperlink w:anchor="_Toc175216555" w:history="1">
+      <w:hyperlink w:anchor="_Toc175303205" w:history="1">
         <w:r>
           <w:rPr>
             <w:rStyle w:val="Lienhypertexte"/>
             <w:noProof/>
             <w:lang w:val="fr-FR"/>
           </w:rPr>
-          <w:t>4.4.</w:t>
+          <w:t>4.5.</w:t>
         </w:r>
         <w:r>
           <w:rPr>
@@ -4433,7 +4587,7 @@
             <w:noProof/>
             <w:webHidden/>
           </w:rPr>
-          <w:instrText xml:space="preserve"> PAGEREF _Toc175216555 \h </w:instrText>
+          <w:instrText xml:space="preserve"> PAGEREF _Toc175303205 \h </w:instrText>
         </w:r>
         <w:r>
           <w:rPr>
@@ -4453,7 +4607,7 @@
             <w:noProof/>
             <w:webHidden/>
           </w:rPr>
-          <w:t>9</w:t>
+          <w:t>10</w:t>
         </w:r>
         <w:r>
           <w:rPr>
@@ -4481,7 +4635,7 @@
           <w:lang w:val="fr-FR"/>
         </w:rPr>
       </w:pPr>
-      <w:hyperlink w:anchor="_Toc175216556" w:history="1">
+      <w:hyperlink w:anchor="_Toc175303206" w:history="1">
         <w:r>
           <w:rPr>
             <w:rStyle w:val="Lienhypertexte"/>
@@ -4529,7 +4683,7 @@
             <w:noProof/>
             <w:webHidden/>
           </w:rPr>
-          <w:instrText xml:space="preserve"> PAGEREF _Toc175216556 \h </w:instrText>
+          <w:instrText xml:space="preserve"> PAGEREF _Toc175303206 \h </w:instrText>
         </w:r>
         <w:r>
           <w:rPr>
@@ -4576,7 +4730,7 @@
           <w:lang w:val="fr-FR"/>
         </w:rPr>
       </w:pPr>
-      <w:hyperlink w:anchor="_Toc175216557" w:history="1">
+      <w:hyperlink w:anchor="_Toc175303207" w:history="1">
         <w:r>
           <w:rPr>
             <w:rStyle w:val="Lienhypertexte"/>
@@ -4623,7 +4777,7 @@
             <w:noProof/>
             <w:webHidden/>
           </w:rPr>
-          <w:instrText xml:space="preserve"> PAGEREF _Toc175216557 \h </w:instrText>
+          <w:instrText xml:space="preserve"> PAGEREF _Toc175303207 \h </w:instrText>
         </w:r>
         <w:r>
           <w:rPr>
@@ -4670,7 +4824,7 @@
           <w:lang w:val="fr-FR"/>
         </w:rPr>
       </w:pPr>
-      <w:hyperlink w:anchor="_Toc175216558" w:history="1">
+      <w:hyperlink w:anchor="_Toc175303208" w:history="1">
         <w:r>
           <w:rPr>
             <w:rStyle w:val="Lienhypertexte"/>
@@ -4717,7 +4871,7 @@
             <w:noProof/>
             <w:webHidden/>
           </w:rPr>
-          <w:instrText xml:space="preserve"> PAGEREF _Toc175216558 \h </w:instrText>
+          <w:instrText xml:space="preserve"> PAGEREF _Toc175303208 \h </w:instrText>
         </w:r>
         <w:r>
           <w:rPr>
@@ -4737,7 +4891,7 @@
             <w:noProof/>
             <w:webHidden/>
           </w:rPr>
-          <w:t>10</w:t>
+          <w:t>11</w:t>
         </w:r>
         <w:r>
           <w:rPr>
@@ -4764,7 +4918,7 @@
           <w:lang w:val="fr-FR"/>
         </w:rPr>
       </w:pPr>
-      <w:hyperlink w:anchor="_Toc175216559" w:history="1">
+      <w:hyperlink w:anchor="_Toc175303209" w:history="1">
         <w:r>
           <w:rPr>
             <w:rStyle w:val="Lienhypertexte"/>
@@ -4811,7 +4965,7 @@
             <w:noProof/>
             <w:webHidden/>
           </w:rPr>
-          <w:instrText xml:space="preserve"> PAGEREF _Toc175216559 \h </w:instrText>
+          <w:instrText xml:space="preserve"> PAGEREF _Toc175303209 \h </w:instrText>
         </w:r>
         <w:r>
           <w:rPr>
@@ -4858,7 +5012,7 @@
           <w:lang w:val="fr-FR"/>
         </w:rPr>
       </w:pPr>
-      <w:hyperlink w:anchor="_Toc175216560" w:history="1">
+      <w:hyperlink w:anchor="_Toc175303210" w:history="1">
         <w:r>
           <w:rPr>
             <w:rStyle w:val="Lienhypertexte"/>
@@ -4905,7 +5059,7 @@
             <w:noProof/>
             <w:webHidden/>
           </w:rPr>
-          <w:instrText xml:space="preserve"> PAGEREF _Toc175216560 \h </w:instrText>
+          <w:instrText xml:space="preserve"> PAGEREF _Toc175303210 \h </w:instrText>
         </w:r>
         <w:r>
           <w:rPr>
@@ -4925,7 +5079,7 @@
             <w:noProof/>
             <w:webHidden/>
           </w:rPr>
-          <w:t>11</w:t>
+          <w:t>12</w:t>
         </w:r>
         <w:r>
           <w:rPr>
@@ -4952,7 +5106,7 @@
           <w:lang w:val="fr-FR"/>
         </w:rPr>
       </w:pPr>
-      <w:hyperlink w:anchor="_Toc175216561" w:history="1">
+      <w:hyperlink w:anchor="_Toc175303211" w:history="1">
         <w:r>
           <w:rPr>
             <w:rStyle w:val="Lienhypertexte"/>
@@ -4999,7 +5153,7 @@
             <w:noProof/>
             <w:webHidden/>
           </w:rPr>
-          <w:instrText xml:space="preserve"> PAGEREF _Toc175216561 \h </w:instrText>
+          <w:instrText xml:space="preserve"> PAGEREF _Toc175303211 \h </w:instrText>
         </w:r>
         <w:r>
           <w:rPr>
@@ -5046,7 +5200,7 @@
           <w:lang w:val="fr-FR"/>
         </w:rPr>
       </w:pPr>
-      <w:hyperlink w:anchor="_Toc175216562" w:history="1">
+      <w:hyperlink w:anchor="_Toc175303212" w:history="1">
         <w:r>
           <w:rPr>
             <w:rStyle w:val="Lienhypertexte"/>
@@ -5093,7 +5247,7 @@
             <w:noProof/>
             <w:webHidden/>
           </w:rPr>
-          <w:instrText xml:space="preserve"> PAGEREF _Toc175216562 \h </w:instrText>
+          <w:instrText xml:space="preserve"> PAGEREF _Toc175303212 \h </w:instrText>
         </w:r>
         <w:r>
           <w:rPr>
@@ -5113,7 +5267,7 @@
             <w:noProof/>
             <w:webHidden/>
           </w:rPr>
-          <w:t>12</w:t>
+          <w:t>13</w:t>
         </w:r>
         <w:r>
           <w:rPr>
@@ -5140,7 +5294,7 @@
           <w:lang w:val="fr-FR"/>
         </w:rPr>
       </w:pPr>
-      <w:hyperlink w:anchor="_Toc175216563" w:history="1">
+      <w:hyperlink w:anchor="_Toc175303213" w:history="1">
         <w:r>
           <w:rPr>
             <w:rStyle w:val="Lienhypertexte"/>
@@ -5187,7 +5341,7 @@
             <w:noProof/>
             <w:webHidden/>
           </w:rPr>
-          <w:instrText xml:space="preserve"> PAGEREF _Toc175216563 \h </w:instrText>
+          <w:instrText xml:space="preserve"> PAGEREF _Toc175303213 \h </w:instrText>
         </w:r>
         <w:r>
           <w:rPr>
@@ -5208,6 +5362,288 @@
             <w:webHidden/>
           </w:rPr>
           <w:t>13</w:t>
+        </w:r>
+        <w:r>
+          <w:rPr>
+            <w:noProof/>
+            <w:webHidden/>
+          </w:rPr>
+          <w:fldChar w:fldCharType="end"/>
+        </w:r>
+      </w:hyperlink>
+    </w:p>
+    <w:p>
+      <w:pPr>
+        <w:pStyle w:val="TM1"/>
+        <w:tabs>
+          <w:tab w:val="left" w:pos="480"/>
+          <w:tab w:val="right" w:leader="dot" w:pos="9622"/>
+        </w:tabs>
+        <w:rPr>
+          <w:rFonts w:asciiTheme="minorHAnsi" w:eastAsiaTheme="minorEastAsia" w:hAnsiTheme="minorHAnsi" w:cstheme="minorBidi"/>
+          <w:b w:val="0"/>
+          <w:caps w:val="0"/>
+          <w:noProof/>
+          <w:sz w:val="22"/>
+          <w:szCs w:val="22"/>
+          <w:lang w:val="fr-FR"/>
+        </w:rPr>
+      </w:pPr>
+      <w:hyperlink w:anchor="_Toc175303214" w:history="1">
+        <w:r>
+          <w:rPr>
+            <w:rStyle w:val="Lienhypertexte"/>
+            <w:noProof/>
+          </w:rPr>
+          <w:t>6.</w:t>
+        </w:r>
+        <w:r>
+          <w:rPr>
+            <w:rFonts w:asciiTheme="minorHAnsi" w:eastAsiaTheme="minorEastAsia" w:hAnsiTheme="minorHAnsi" w:cstheme="minorBidi"/>
+            <w:b w:val="0"/>
+            <w:caps w:val="0"/>
+            <w:noProof/>
+            <w:sz w:val="22"/>
+            <w:szCs w:val="22"/>
+            <w:lang w:val="fr-FR"/>
+          </w:rPr>
+          <w:tab/>
+        </w:r>
+        <w:r>
+          <w:rPr>
+            <w:rStyle w:val="Lienhypertexte"/>
+            <w:noProof/>
+          </w:rPr>
+          <w:t>spectre Avec Wiener</w:t>
+        </w:r>
+        <w:r>
+          <w:rPr>
+            <w:noProof/>
+            <w:webHidden/>
+          </w:rPr>
+          <w:tab/>
+        </w:r>
+        <w:r>
+          <w:rPr>
+            <w:noProof/>
+            <w:webHidden/>
+          </w:rPr>
+          <w:fldChar w:fldCharType="begin"/>
+        </w:r>
+        <w:r>
+          <w:rPr>
+            <w:noProof/>
+            <w:webHidden/>
+          </w:rPr>
+          <w:instrText xml:space="preserve"> PAGEREF _Toc175303214 \h </w:instrText>
+        </w:r>
+        <w:r>
+          <w:rPr>
+            <w:noProof/>
+            <w:webHidden/>
+          </w:rPr>
+        </w:r>
+        <w:r>
+          <w:rPr>
+            <w:noProof/>
+            <w:webHidden/>
+          </w:rPr>
+          <w:fldChar w:fldCharType="separate"/>
+        </w:r>
+        <w:r>
+          <w:rPr>
+            <w:noProof/>
+            <w:webHidden/>
+          </w:rPr>
+          <w:t>14</w:t>
+        </w:r>
+        <w:r>
+          <w:rPr>
+            <w:noProof/>
+            <w:webHidden/>
+          </w:rPr>
+          <w:fldChar w:fldCharType="end"/>
+        </w:r>
+      </w:hyperlink>
+    </w:p>
+    <w:p>
+      <w:pPr>
+        <w:pStyle w:val="TM1"/>
+        <w:tabs>
+          <w:tab w:val="left" w:pos="480"/>
+          <w:tab w:val="right" w:leader="dot" w:pos="9622"/>
+        </w:tabs>
+        <w:rPr>
+          <w:rFonts w:asciiTheme="minorHAnsi" w:eastAsiaTheme="minorEastAsia" w:hAnsiTheme="minorHAnsi" w:cstheme="minorBidi"/>
+          <w:b w:val="0"/>
+          <w:caps w:val="0"/>
+          <w:noProof/>
+          <w:sz w:val="22"/>
+          <w:szCs w:val="22"/>
+          <w:lang w:val="fr-FR"/>
+        </w:rPr>
+      </w:pPr>
+      <w:hyperlink w:anchor="_Toc175303215" w:history="1">
+        <w:r>
+          <w:rPr>
+            <w:rStyle w:val="Lienhypertexte"/>
+            <w:noProof/>
+          </w:rPr>
+          <w:t>7.</w:t>
+        </w:r>
+        <w:r>
+          <w:rPr>
+            <w:rFonts w:asciiTheme="minorHAnsi" w:eastAsiaTheme="minorEastAsia" w:hAnsiTheme="minorHAnsi" w:cstheme="minorBidi"/>
+            <w:b w:val="0"/>
+            <w:caps w:val="0"/>
+            <w:noProof/>
+            <w:sz w:val="22"/>
+            <w:szCs w:val="22"/>
+            <w:lang w:val="fr-FR"/>
+          </w:rPr>
+          <w:tab/>
+        </w:r>
+        <w:r>
+          <w:rPr>
+            <w:rStyle w:val="Lienhypertexte"/>
+            <w:noProof/>
+          </w:rPr>
+          <w:t>spectre Avec Source</w:t>
+        </w:r>
+        <w:r>
+          <w:rPr>
+            <w:noProof/>
+            <w:webHidden/>
+          </w:rPr>
+          <w:tab/>
+        </w:r>
+        <w:r>
+          <w:rPr>
+            <w:noProof/>
+            <w:webHidden/>
+          </w:rPr>
+          <w:fldChar w:fldCharType="begin"/>
+        </w:r>
+        <w:r>
+          <w:rPr>
+            <w:noProof/>
+            <w:webHidden/>
+          </w:rPr>
+          <w:instrText xml:space="preserve"> PAGEREF _Toc175303215 \h </w:instrText>
+        </w:r>
+        <w:r>
+          <w:rPr>
+            <w:noProof/>
+            <w:webHidden/>
+          </w:rPr>
+        </w:r>
+        <w:r>
+          <w:rPr>
+            <w:noProof/>
+            <w:webHidden/>
+          </w:rPr>
+          <w:fldChar w:fldCharType="separate"/>
+        </w:r>
+        <w:r>
+          <w:rPr>
+            <w:noProof/>
+            <w:webHidden/>
+          </w:rPr>
+          <w:t>14</w:t>
+        </w:r>
+        <w:r>
+          <w:rPr>
+            <w:noProof/>
+            <w:webHidden/>
+          </w:rPr>
+          <w:fldChar w:fldCharType="end"/>
+        </w:r>
+      </w:hyperlink>
+    </w:p>
+    <w:p>
+      <w:pPr>
+        <w:pStyle w:val="TM1"/>
+        <w:tabs>
+          <w:tab w:val="left" w:pos="480"/>
+          <w:tab w:val="right" w:leader="dot" w:pos="9622"/>
+        </w:tabs>
+        <w:rPr>
+          <w:rFonts w:asciiTheme="minorHAnsi" w:eastAsiaTheme="minorEastAsia" w:hAnsiTheme="minorHAnsi" w:cstheme="minorBidi"/>
+          <w:b w:val="0"/>
+          <w:caps w:val="0"/>
+          <w:noProof/>
+          <w:sz w:val="22"/>
+          <w:szCs w:val="22"/>
+          <w:lang w:val="fr-FR"/>
+        </w:rPr>
+      </w:pPr>
+      <w:hyperlink w:anchor="_Toc175303216" w:history="1">
+        <w:r>
+          <w:rPr>
+            <w:rStyle w:val="Lienhypertexte"/>
+            <w:noProof/>
+          </w:rPr>
+          <w:t>8.</w:t>
+        </w:r>
+        <w:r>
+          <w:rPr>
+            <w:rFonts w:asciiTheme="minorHAnsi" w:eastAsiaTheme="minorEastAsia" w:hAnsiTheme="minorHAnsi" w:cstheme="minorBidi"/>
+            <w:b w:val="0"/>
+            <w:caps w:val="0"/>
+            <w:noProof/>
+            <w:sz w:val="22"/>
+            <w:szCs w:val="22"/>
+            <w:lang w:val="fr-FR"/>
+          </w:rPr>
+          <w:tab/>
+        </w:r>
+        <w:r>
+          <w:rPr>
+            <w:rStyle w:val="Lienhypertexte"/>
+            <w:noProof/>
+          </w:rPr>
+          <w:t>Reference interne IRAP</w:t>
+        </w:r>
+        <w:r>
+          <w:rPr>
+            <w:noProof/>
+            <w:webHidden/>
+          </w:rPr>
+          <w:tab/>
+        </w:r>
+        <w:r>
+          <w:rPr>
+            <w:noProof/>
+            <w:webHidden/>
+          </w:rPr>
+          <w:fldChar w:fldCharType="begin"/>
+        </w:r>
+        <w:r>
+          <w:rPr>
+            <w:noProof/>
+            <w:webHidden/>
+          </w:rPr>
+          <w:instrText xml:space="preserve"> PAGEREF _Toc175303216 \h </w:instrText>
+        </w:r>
+        <w:r>
+          <w:rPr>
+            <w:noProof/>
+            <w:webHidden/>
+          </w:rPr>
+        </w:r>
+        <w:r>
+          <w:rPr>
+            <w:noProof/>
+            <w:webHidden/>
+          </w:rPr>
+          <w:fldChar w:fldCharType="separate"/>
+        </w:r>
+        <w:r>
+          <w:rPr>
+            <w:noProof/>
+            <w:webHidden/>
+          </w:rPr>
+          <w:t>14</w:t>
         </w:r>
         <w:r>
           <w:rPr>
@@ -5241,7 +5677,7 @@
           <w:lang w:val="fr-FR"/>
         </w:rPr>
       </w:pPr>
-      <w:bookmarkStart w:id="0" w:name="_Toc175216544"/>
+      <w:bookmarkStart w:id="0" w:name="_Toc175303193"/>
       <w:r>
         <w:rPr>
           <w:lang w:val="fr-FR"/>
@@ -5285,6 +5721,9 @@
     </w:p>
     <w:p>
       <w:r>
+        <w:rPr>
+          <w:noProof/>
+        </w:rPr>
         <w:drawing>
           <wp:inline distT="0" distB="0" distL="0" distR="0" wp14:anchorId="4BB3AEFC" wp14:editId="36CE49F8">
             <wp:extent cx="6116320" cy="2752090"/>
@@ -5336,7 +5775,7 @@
           <w:lang w:val="fr-FR"/>
         </w:rPr>
       </w:pPr>
-      <w:bookmarkStart w:id="1" w:name="_Toc175216545"/>
+      <w:bookmarkStart w:id="1" w:name="_Toc175303194"/>
       <w:r>
         <w:rPr>
           <w:lang w:val="fr-FR"/>
@@ -5442,8 +5881,6 @@
           </wp:inline>
         </w:drawing>
       </w:r>
-      <w:bookmarkStart w:id="2" w:name="_GoBack"/>
-      <w:bookmarkEnd w:id="2"/>
     </w:p>
     <w:p>
       <w:pPr>
@@ -5457,7 +5894,7 @@
           <w:lang w:val="fr-FR"/>
         </w:rPr>
       </w:pPr>
-      <w:bookmarkStart w:id="3" w:name="_Toc175216546"/>
+      <w:bookmarkStart w:id="2" w:name="_Toc175303195"/>
       <w:r>
         <w:rPr>
           <w:lang w:val="fr-FR"/>
@@ -5465,7 +5902,7 @@
         <w:lastRenderedPageBreak/>
         <w:t>fonctionnalite de l’egse</w:t>
       </w:r>
-      <w:bookmarkEnd w:id="3"/>
+      <w:bookmarkEnd w:id="2"/>
     </w:p>
     <w:p>
       <w:r>
@@ -5494,7 +5931,7 @@
           <w:lang w:val="fr-FR"/>
         </w:rPr>
       </w:pPr>
-      <w:bookmarkStart w:id="4" w:name="_Toc175216547"/>
+      <w:bookmarkStart w:id="3" w:name="_Toc175303196"/>
       <w:r>
         <w:rPr>
           <w:lang w:val="fr-FR"/>
@@ -5507,7 +5944,7 @@
         </w:rPr>
         <w:t>njection</w:t>
       </w:r>
-      <w:bookmarkEnd w:id="4"/>
+      <w:bookmarkEnd w:id="3"/>
     </w:p>
     <w:p>
       <w:r>
@@ -5563,7 +6000,7 @@
             <v:path o:extrusionok="f" gradientshapeok="t" o:connecttype="rect"/>
             <o:lock v:ext="edit" aspectratio="t"/>
           </v:shapetype>
-          <v:shape id="_x0000_i1025" type="#_x0000_t75" style="width:453.6pt;height:230.4pt">
+          <v:shape id="_x0000_i1025" type="#_x0000_t75" style="width:453.2pt;height:230.6pt">
             <v:imagedata r:id="rId10" o:title="Capture"/>
           </v:shape>
         </w:pict>
@@ -5576,7 +6013,7 @@
           <w:lang w:val="fr-FR"/>
         </w:rPr>
       </w:pPr>
-      <w:bookmarkStart w:id="5" w:name="_Toc175216548"/>
+      <w:bookmarkStart w:id="4" w:name="_Toc175303197"/>
       <w:r>
         <w:rPr>
           <w:lang w:val="fr-FR"/>
@@ -5589,7 +6026,7 @@
         </w:rPr>
         <w:t>s</w:t>
       </w:r>
-      <w:bookmarkEnd w:id="5"/>
+      <w:bookmarkEnd w:id="4"/>
     </w:p>
     <w:p>
       <w:r>
@@ -5609,6 +6046,9 @@
     </w:p>
     <w:p>
       <w:r>
+        <w:rPr>
+          <w:noProof/>
+        </w:rPr>
         <w:drawing>
           <wp:inline distT="0" distB="0" distL="0" distR="0" wp14:anchorId="6355CCAB" wp14:editId="20766A30">
             <wp:extent cx="6116320" cy="1661160"/>
@@ -5659,14 +6099,14 @@
           <w:lang w:val="fr-FR"/>
         </w:rPr>
       </w:pPr>
-      <w:bookmarkStart w:id="6" w:name="_Toc175216549"/>
+      <w:bookmarkStart w:id="5" w:name="_Toc175303198"/>
       <w:r>
         <w:rPr>
           <w:lang w:val="fr-FR"/>
         </w:rPr>
         <w:t>Configuration des filtres</w:t>
       </w:r>
-      <w:bookmarkEnd w:id="6"/>
+      <w:bookmarkEnd w:id="5"/>
     </w:p>
     <w:p/>
     <w:p>
@@ -5714,6 +6154,9 @@
     <w:p/>
     <w:p>
       <w:r>
+        <w:rPr>
+          <w:noProof/>
+        </w:rPr>
         <w:lastRenderedPageBreak/>
         <w:drawing>
           <wp:inline distT="0" distB="0" distL="0" distR="0" wp14:anchorId="4D56F1CA" wp14:editId="3FC1DA93">
@@ -5789,14 +6232,14 @@
           <w:lang w:val="fr-FR"/>
         </w:rPr>
       </w:pPr>
-      <w:bookmarkStart w:id="7" w:name="_Toc175216550"/>
+      <w:bookmarkStart w:id="6" w:name="_Toc175303199"/>
       <w:r>
         <w:rPr>
           <w:lang w:val="fr-FR"/>
         </w:rPr>
         <w:t>Les fonctions de transfer</w:t>
       </w:r>
-      <w:bookmarkEnd w:id="7"/>
+      <w:bookmarkEnd w:id="6"/>
     </w:p>
     <w:p>
       <w:pPr>
@@ -5805,6 +6248,7 @@
           <w:lang w:val="fr-FR"/>
         </w:rPr>
       </w:pPr>
+      <w:bookmarkStart w:id="7" w:name="_Toc175303200"/>
       <w:r>
         <w:rPr>
           <w:lang w:val="fr-FR"/>
@@ -5831,68 +6275,103 @@
         </w:rPr>
         <w:t xml:space="preserve"> analogique</w:t>
       </w:r>
+      <w:bookmarkEnd w:id="7"/>
+    </w:p>
+    <w:p>
+      <w:r>
+        <w:t>Le générateur de fonction se substitue à l’amplificateur de charge</w:t>
+      </w:r>
+      <w:r>
+        <w:t xml:space="preserve"> et fourni un signal post CPA de couleur jaune</w:t>
+      </w:r>
+      <w:r>
+        <w:t>.</w:t>
+      </w:r>
+      <w:r>
+        <w:t xml:space="preserve"> Le pulse</w:t>
+      </w:r>
+      <w:r>
+        <w:t xml:space="preserve"> de</w:t>
+      </w:r>
+      <w:r>
+        <w:t xml:space="preserve"> couleur rose est la sortie du « </w:t>
+      </w:r>
+      <w:proofErr w:type="spellStart"/>
+      <w:r>
+        <w:t>shaper</w:t>
+      </w:r>
+      <w:proofErr w:type="spellEnd"/>
+      <w:r>
+        <w:t> »</w:t>
+      </w:r>
+      <w:r>
+        <w:t>, appliqué à l’entrée du CAN.</w:t>
+      </w:r>
+    </w:p>
+    <w:p>
+      <w:pPr>
+        <w:jc w:val="center"/>
+      </w:pPr>
+      <w:r>
+        <w:rPr>
+          <w:noProof/>
+        </w:rPr>
+        <w:drawing>
+          <wp:inline distT="0" distB="0" distL="0" distR="0" wp14:anchorId="375626DF" wp14:editId="07D7B9C0">
+            <wp:extent cx="6116320" cy="2882900"/>
+            <wp:effectExtent l="0" t="0" r="0" b="0"/>
+            <wp:docPr id="10" name="Image 10"/>
+            <wp:cNvGraphicFramePr>
+              <a:graphicFrameLocks xmlns:a="http://schemas.openxmlformats.org/drawingml/2006/main" noChangeAspect="1"/>
+            </wp:cNvGraphicFramePr>
+            <a:graphic xmlns:a="http://schemas.openxmlformats.org/drawingml/2006/main">
+              <a:graphicData uri="http://schemas.openxmlformats.org/drawingml/2006/picture">
+                <pic:pic xmlns:pic="http://schemas.openxmlformats.org/drawingml/2006/picture">
+                  <pic:nvPicPr>
+                    <pic:cNvPr id="1" name=""/>
+                    <pic:cNvPicPr/>
+                  </pic:nvPicPr>
+                  <pic:blipFill>
+                    <a:blip r:embed="rId13"/>
+                    <a:stretch>
+                      <a:fillRect/>
+                    </a:stretch>
+                  </pic:blipFill>
+                  <pic:spPr>
+                    <a:xfrm>
+                      <a:off x="0" y="0"/>
+                      <a:ext cx="6116320" cy="2882900"/>
+                    </a:xfrm>
+                    <a:prstGeom prst="rect">
+                      <a:avLst/>
+                    </a:prstGeom>
+                  </pic:spPr>
+                </pic:pic>
+              </a:graphicData>
+            </a:graphic>
+          </wp:inline>
+        </w:drawing>
+      </w:r>
     </w:p>
     <w:p/>
     <w:p>
       <w:pPr>
-        <w:pStyle w:val="Titre2"/>
-        <w:rPr>
-          <w:lang w:val="fr-FR"/>
-        </w:rPr>
+        <w:jc w:val="center"/>
       </w:pPr>
-      <w:bookmarkStart w:id="8" w:name="_Toc175216551"/>
       <w:r>
         <w:rPr>
-          <w:lang w:val="fr-FR"/>
+          <w:noProof/>
         </w:rPr>
-        <w:t xml:space="preserve"> </w:t>
-      </w:r>
-      <w:r>
-        <w:rPr>
-          <w:lang w:val="fr-FR"/>
-        </w:rPr>
-        <w:t>CAN</w:t>
-      </w:r>
-      <w:bookmarkEnd w:id="8"/>
-      <w:r>
-        <w:rPr>
-          <w:lang w:val="fr-FR"/>
-        </w:rPr>
-        <w:t xml:space="preserve"> et entrée de filtre</w:t>
-      </w:r>
-    </w:p>
-    <w:p>
-      <w:r>
-        <w:t>Le générateur de fonction se substitue</w:t>
-      </w:r>
-      <w:r>
-        <w:t xml:space="preserve"> à l’amplificateur de charge</w:t>
-      </w:r>
-      <w:r>
-        <w:t xml:space="preserve"> et permet de tracer plu</w:t>
-      </w:r>
-      <w:r>
-        <w:t>sieurs pulse après numérisation, signal qui est appliqué à l’entrée du filtre numérique.</w:t>
-      </w:r>
-      <w:r>
-        <w:t xml:space="preserve"> </w:t>
-      </w:r>
-      <w:r>
-        <w:t xml:space="preserve">  </w:t>
-      </w:r>
-    </w:p>
-    <w:p/>
-    <w:p>
-      <w:r>
+        <w:lastRenderedPageBreak/>
         <w:drawing>
-          <wp:inline distT="0" distB="0" distL="0" distR="0" wp14:anchorId="3E748B46" wp14:editId="043EAD01">
-            <wp:extent cx="6116320" cy="3457575"/>
-            <wp:effectExtent l="0" t="0" r="17780" b="9525"/>
-            <wp:docPr id="9" name="Graphique 9"/>
+          <wp:inline distT="0" distB="0" distL="0" distR="0" wp14:anchorId="7D82D948" wp14:editId="0B79A73D">
+            <wp:extent cx="4572000" cy="2743200"/>
+            <wp:effectExtent l="0" t="0" r="0" b="0"/>
+            <wp:docPr id="5" name="Graphique 5"/>
             <wp:cNvGraphicFramePr/>
             <a:graphic xmlns:a="http://schemas.openxmlformats.org/drawingml/2006/main">
               <a:graphicData uri="http://schemas.openxmlformats.org/drawingml/2006/chart">
-                <c:chart xmlns:c="http://schemas.openxmlformats.org/drawingml/2006/chart" xmlns:r="http://schemas.openxmlformats.org/officeDocument/2006/relationships" r:id="rId13"/>
+                <c:chart xmlns:c="http://schemas.openxmlformats.org/drawingml/2006/chart" xmlns:r="http://schemas.openxmlformats.org/officeDocument/2006/relationships" r:id="rId14"/>
               </a:graphicData>
             </a:graphic>
           </wp:inline>
@@ -5907,7 +6386,91 @@
           <w:lang w:val="fr-FR"/>
         </w:rPr>
       </w:pPr>
-      <w:bookmarkStart w:id="9" w:name="_Toc175216552"/>
+      <w:r>
+        <w:rPr>
+          <w:lang w:val="fr-FR"/>
+        </w:rPr>
+        <w:t xml:space="preserve"> </w:t>
+      </w:r>
+      <w:bookmarkStart w:id="8" w:name="_Toc175303201"/>
+      <w:r>
+        <w:rPr>
+          <w:lang w:val="fr-FR"/>
+        </w:rPr>
+        <w:t>CAN</w:t>
+      </w:r>
+      <w:r>
+        <w:rPr>
+          <w:lang w:val="fr-FR"/>
+        </w:rPr>
+        <w:t xml:space="preserve"> et entrée de filtre</w:t>
+      </w:r>
+      <w:bookmarkEnd w:id="8"/>
+    </w:p>
+    <w:p/>
+    <w:p>
+      <w:r>
+        <w:t>On voit ci-dessous le pulse numérisé en sortie de « </w:t>
+      </w:r>
+      <w:proofErr w:type="spellStart"/>
+      <w:r>
+        <w:t>shaper</w:t>
+      </w:r>
+      <w:proofErr w:type="spellEnd"/>
+      <w:r>
+        <w:t> ». C’est ce signal qui est appliqué en entrée de</w:t>
+      </w:r>
+      <w:r>
+        <w:t>s</w:t>
+      </w:r>
+      <w:r>
+        <w:t xml:space="preserve"> filtre</w:t>
+      </w:r>
+      <w:r>
+        <w:t>s</w:t>
+      </w:r>
+      <w:r>
+        <w:t xml:space="preserve"> numérique. </w:t>
+      </w:r>
+      <w:r>
+        <w:t xml:space="preserve"> </w:t>
+      </w:r>
+      <w:r>
+        <w:t xml:space="preserve">  </w:t>
+      </w:r>
+      <w:bookmarkStart w:id="9" w:name="_GoBack"/>
+      <w:bookmarkEnd w:id="9"/>
+    </w:p>
+    <w:p/>
+    <w:p>
+      <w:r>
+        <w:rPr>
+          <w:noProof/>
+        </w:rPr>
+        <w:drawing>
+          <wp:inline distT="0" distB="0" distL="0" distR="0" wp14:anchorId="3E748B46" wp14:editId="043EAD01">
+            <wp:extent cx="6116320" cy="3457575"/>
+            <wp:effectExtent l="0" t="0" r="17780" b="9525"/>
+            <wp:docPr id="9" name="Graphique 9"/>
+            <wp:cNvGraphicFramePr/>
+            <a:graphic xmlns:a="http://schemas.openxmlformats.org/drawingml/2006/main">
+              <a:graphicData uri="http://schemas.openxmlformats.org/drawingml/2006/chart">
+                <c:chart xmlns:c="http://schemas.openxmlformats.org/drawingml/2006/chart" xmlns:r="http://schemas.openxmlformats.org/officeDocument/2006/relationships" r:id="rId15"/>
+              </a:graphicData>
+            </a:graphic>
+          </wp:inline>
+        </w:drawing>
+      </w:r>
+    </w:p>
+    <w:p/>
+    <w:p>
+      <w:pPr>
+        <w:pStyle w:val="Titre2"/>
+        <w:rPr>
+          <w:lang w:val="fr-FR"/>
+        </w:rPr>
+      </w:pPr>
+      <w:bookmarkStart w:id="10" w:name="_Toc175303202"/>
       <w:r>
         <w:rPr>
           <w:lang w:val="fr-FR"/>
@@ -5932,7 +6495,7 @@
         </w:rPr>
         <w:t xml:space="preserve"> de la lecture du CAN</w:t>
       </w:r>
-      <w:bookmarkEnd w:id="9"/>
+      <w:bookmarkEnd w:id="10"/>
     </w:p>
     <w:p>
       <w:r>
@@ -6023,6 +6586,9 @@
         <w:jc w:val="center"/>
       </w:pPr>
       <w:r>
+        <w:rPr>
+          <w:noProof/>
+        </w:rPr>
         <w:drawing>
           <wp:inline distT="0" distB="0" distL="0" distR="0" wp14:anchorId="0D0343BE" wp14:editId="059EBB12">
             <wp:extent cx="6428850" cy="2810518"/>
@@ -6031,7 +6597,7 @@
             <wp:cNvGraphicFramePr/>
             <a:graphic xmlns:a="http://schemas.openxmlformats.org/drawingml/2006/main">
               <a:graphicData uri="http://schemas.openxmlformats.org/drawingml/2006/chart">
-                <c:chart xmlns:c="http://schemas.openxmlformats.org/drawingml/2006/chart" xmlns:r="http://schemas.openxmlformats.org/officeDocument/2006/relationships" r:id="rId14"/>
+                <c:chart xmlns:c="http://schemas.openxmlformats.org/drawingml/2006/chart" xmlns:r="http://schemas.openxmlformats.org/officeDocument/2006/relationships" r:id="rId16"/>
               </a:graphicData>
             </a:graphic>
           </wp:inline>
@@ -6060,14 +6626,14 @@
           <w:lang w:val="fr-FR"/>
         </w:rPr>
       </w:pPr>
-      <w:bookmarkStart w:id="10" w:name="_Toc175216553"/>
+      <w:bookmarkStart w:id="11" w:name="_Toc175303203"/>
       <w:r>
         <w:rPr>
           <w:lang w:val="fr-FR"/>
         </w:rPr>
         <w:t>Fonction de transfert du filtre à réponse impulsionnelle finie</w:t>
       </w:r>
-      <w:bookmarkEnd w:id="10"/>
+      <w:bookmarkEnd w:id="11"/>
       <w:r>
         <w:rPr>
           <w:lang w:val="fr-FR"/>
@@ -6082,14 +6648,14 @@
           <w:lang w:val="fr-FR"/>
         </w:rPr>
       </w:pPr>
-      <w:bookmarkStart w:id="11" w:name="_Toc175216554"/>
+      <w:bookmarkStart w:id="12" w:name="_Toc175303204"/>
       <w:r>
         <w:rPr>
           <w:lang w:val="fr-FR"/>
         </w:rPr>
         <w:t>Mesure</w:t>
       </w:r>
-      <w:bookmarkEnd w:id="11"/>
+      <w:bookmarkEnd w:id="12"/>
     </w:p>
     <w:p/>
     <w:p>
@@ -6097,16 +6663,18 @@
         <w:jc w:val="center"/>
       </w:pPr>
       <w:r>
-        <w:lastRenderedPageBreak/>
+        <w:rPr>
+          <w:noProof/>
+        </w:rPr>
         <w:drawing>
-          <wp:inline distT="0" distB="0" distL="0" distR="0" wp14:anchorId="48C450DA" wp14:editId="5DFFA2A6">
-            <wp:extent cx="6116320" cy="4528185"/>
-            <wp:effectExtent l="0" t="0" r="17780" b="5715"/>
+          <wp:inline distT="0" distB="0" distL="0" distR="0" wp14:anchorId="48C450DA" wp14:editId="3CB62AF1">
+            <wp:extent cx="5559328" cy="3904432"/>
+            <wp:effectExtent l="0" t="0" r="3810" b="1270"/>
             <wp:docPr id="11" name="Graphique 11"/>
             <wp:cNvGraphicFramePr/>
             <a:graphic xmlns:a="http://schemas.openxmlformats.org/drawingml/2006/main">
               <a:graphicData uri="http://schemas.openxmlformats.org/drawingml/2006/chart">
-                <c:chart xmlns:c="http://schemas.openxmlformats.org/drawingml/2006/chart" xmlns:r="http://schemas.openxmlformats.org/officeDocument/2006/relationships" r:id="rId15"/>
+                <c:chart xmlns:c="http://schemas.openxmlformats.org/drawingml/2006/chart" xmlns:r="http://schemas.openxmlformats.org/officeDocument/2006/relationships" r:id="rId17"/>
               </a:graphicData>
             </a:graphic>
           </wp:inline>
@@ -6120,7 +6688,11 @@
     </w:p>
     <w:p>
       <w:r>
-        <w:t xml:space="preserve">La droite ci-dessous montre la linéarité du filtre numérique, sortie en fonction de l'entrée pour les valeurs maximums des pulses.  </w:t>
+        <w:t xml:space="preserve">La droite ci-dessous montre la linéarité du filtre numérique, sortie en fonction de l'entrée pour les </w:t>
+      </w:r>
+      <w:r>
+        <w:lastRenderedPageBreak/>
+        <w:t xml:space="preserve">valeurs maximums des pulses.  </w:t>
       </w:r>
     </w:p>
     <w:p/>
@@ -6129,6 +6701,9 @@
         <w:jc w:val="center"/>
       </w:pPr>
       <w:r>
+        <w:rPr>
+          <w:noProof/>
+        </w:rPr>
         <w:drawing>
           <wp:inline distT="0" distB="0" distL="0" distR="0" wp14:anchorId="00ED73B3" wp14:editId="330F9AA7">
             <wp:extent cx="6116320" cy="2440940"/>
@@ -6137,7 +6712,7 @@
             <wp:cNvGraphicFramePr/>
             <a:graphic xmlns:a="http://schemas.openxmlformats.org/drawingml/2006/main">
               <a:graphicData uri="http://schemas.openxmlformats.org/drawingml/2006/chart">
-                <c:chart xmlns:c="http://schemas.openxmlformats.org/drawingml/2006/chart" xmlns:r="http://schemas.openxmlformats.org/officeDocument/2006/relationships" r:id="rId16"/>
+                <c:chart xmlns:c="http://schemas.openxmlformats.org/drawingml/2006/chart" xmlns:r="http://schemas.openxmlformats.org/officeDocument/2006/relationships" r:id="rId18"/>
               </a:graphicData>
             </a:graphic>
           </wp:inline>
@@ -6152,7 +6727,7 @@
           <w:lang w:val="fr-FR"/>
         </w:rPr>
       </w:pPr>
-      <w:bookmarkStart w:id="12" w:name="_Toc175216555"/>
+      <w:bookmarkStart w:id="13" w:name="_Toc175303205"/>
       <w:r>
         <w:rPr>
           <w:lang w:val="fr-FR"/>
@@ -6197,7 +6772,7 @@
         </w:rPr>
         <w:t xml:space="preserve"> numérique</w:t>
       </w:r>
-      <w:bookmarkEnd w:id="12"/>
+      <w:bookmarkEnd w:id="13"/>
     </w:p>
     <w:p/>
     <w:p>
@@ -6205,7 +6780,9 @@
         <w:jc w:val="center"/>
       </w:pPr>
       <w:r>
-        <w:lastRenderedPageBreak/>
+        <w:rPr>
+          <w:noProof/>
+        </w:rPr>
         <w:drawing>
           <wp:inline distT="0" distB="0" distL="0" distR="0" wp14:anchorId="469A5031" wp14:editId="78ACD9D9">
             <wp:extent cx="5643475" cy="4110452"/>
@@ -6214,7 +6791,7 @@
             <wp:cNvGraphicFramePr/>
             <a:graphic xmlns:a="http://schemas.openxmlformats.org/drawingml/2006/main">
               <a:graphicData uri="http://schemas.openxmlformats.org/drawingml/2006/chart">
-                <c:chart xmlns:c="http://schemas.openxmlformats.org/drawingml/2006/chart" xmlns:r="http://schemas.openxmlformats.org/officeDocument/2006/relationships" r:id="rId17"/>
+                <c:chart xmlns:c="http://schemas.openxmlformats.org/drawingml/2006/chart" xmlns:r="http://schemas.openxmlformats.org/officeDocument/2006/relationships" r:id="rId19"/>
               </a:graphicData>
             </a:graphic>
           </wp:inline>
@@ -6229,7 +6806,7 @@
           <w:lang w:val="fr-FR"/>
         </w:rPr>
       </w:pPr>
-      <w:bookmarkStart w:id="13" w:name="_Toc175216556"/>
+      <w:bookmarkStart w:id="14" w:name="_Toc175303206"/>
       <w:r>
         <w:rPr>
           <w:lang w:val="fr-FR"/>
@@ -6266,7 +6843,7 @@
         </w:rPr>
         <w:t xml:space="preserve"> du spectre</w:t>
       </w:r>
-      <w:bookmarkEnd w:id="13"/>
+      <w:bookmarkEnd w:id="14"/>
     </w:p>
     <w:p>
       <w:r>
@@ -6280,7 +6857,7 @@
           <w:lang w:val="fr-FR"/>
         </w:rPr>
       </w:pPr>
-      <w:bookmarkStart w:id="14" w:name="_Toc175216557"/>
+      <w:bookmarkStart w:id="15" w:name="_Toc175303207"/>
       <w:r>
         <w:rPr>
           <w:lang w:val="fr-FR"/>
@@ -6337,7 +6914,7 @@
         </w:rPr>
         <w:t>millivolts</w:t>
       </w:r>
-      <w:bookmarkEnd w:id="14"/>
+      <w:bookmarkEnd w:id="15"/>
       <w:r>
         <w:rPr>
           <w:lang w:val="fr-FR"/>
@@ -6350,6 +6927,10 @@
         <w:jc w:val="center"/>
       </w:pPr>
       <w:r>
+        <w:rPr>
+          <w:noProof/>
+        </w:rPr>
+        <w:lastRenderedPageBreak/>
         <w:drawing>
           <wp:inline distT="0" distB="0" distL="0" distR="0" wp14:anchorId="4022E24B" wp14:editId="53BBD004">
             <wp:extent cx="6116320" cy="2717800"/>
@@ -6366,7 +6947,7 @@
                     <pic:cNvPicPr/>
                   </pic:nvPicPr>
                   <pic:blipFill>
-                    <a:blip r:embed="rId18"/>
+                    <a:blip r:embed="rId20"/>
                     <a:stretch>
                       <a:fillRect/>
                     </a:stretch>
@@ -6398,7 +6979,7 @@
           <w:lang w:val="fr-FR"/>
         </w:rPr>
       </w:pPr>
-      <w:bookmarkStart w:id="15" w:name="_Toc175216558"/>
+      <w:bookmarkStart w:id="16" w:name="_Toc175303208"/>
       <w:r>
         <w:rPr>
           <w:lang w:val="fr-FR"/>
@@ -6409,13 +6990,7 @@
         <w:rPr>
           <w:lang w:val="fr-FR"/>
         </w:rPr>
-        <w:t xml:space="preserve">mulation avec une tension </w:t>
-      </w:r>
-      <w:r>
-        <w:rPr>
-          <w:lang w:val="fr-FR"/>
-        </w:rPr>
-        <w:t>entrée analogique</w:t>
+        <w:t>mulation avec une tension entrée analogique</w:t>
       </w:r>
       <w:r>
         <w:rPr>
@@ -6443,11 +7018,13 @@
         </w:rPr>
         <w:t xml:space="preserve"> millivolts</w:t>
       </w:r>
-      <w:bookmarkEnd w:id="15"/>
+      <w:bookmarkEnd w:id="16"/>
     </w:p>
     <w:p>
       <w:r>
-        <w:lastRenderedPageBreak/>
+        <w:rPr>
+          <w:noProof/>
+        </w:rPr>
         <w:drawing>
           <wp:inline distT="0" distB="0" distL="0" distR="0" wp14:anchorId="27959E2A" wp14:editId="307ED1B5">
             <wp:extent cx="6116320" cy="2552065"/>
@@ -6464,7 +7041,7 @@
                     <pic:cNvPicPr/>
                   </pic:nvPicPr>
                   <pic:blipFill>
-                    <a:blip r:embed="rId19"/>
+                    <a:blip r:embed="rId21"/>
                     <a:stretch>
                       <a:fillRect/>
                     </a:stretch>
@@ -6497,7 +7074,7 @@
           <w:lang w:val="fr-FR"/>
         </w:rPr>
       </w:pPr>
-      <w:bookmarkStart w:id="16" w:name="_Toc175216559"/>
+      <w:bookmarkStart w:id="17" w:name="_Toc175303209"/>
       <w:r>
         <w:rPr>
           <w:lang w:val="fr-FR"/>
@@ -6530,7 +7107,7 @@
         </w:rPr>
         <w:t xml:space="preserve"> millivolts</w:t>
       </w:r>
-      <w:bookmarkEnd w:id="16"/>
+      <w:bookmarkEnd w:id="17"/>
     </w:p>
     <w:p/>
     <w:p>
@@ -6538,6 +7115,7 @@
         <w:rPr>
           <w:noProof/>
         </w:rPr>
+        <w:lastRenderedPageBreak/>
         <w:drawing>
           <wp:inline distT="0" distB="0" distL="0" distR="0" wp14:anchorId="720342E2" wp14:editId="142EB59F">
             <wp:extent cx="6116320" cy="3602355"/>
@@ -6554,7 +7132,7 @@
                     <pic:cNvPicPr/>
                   </pic:nvPicPr>
                   <pic:blipFill>
-                    <a:blip r:embed="rId20"/>
+                    <a:blip r:embed="rId22"/>
                     <a:stretch>
                       <a:fillRect/>
                     </a:stretch>
@@ -6587,7 +7165,7 @@
           <w:lang w:val="fr-FR"/>
         </w:rPr>
       </w:pPr>
-      <w:bookmarkStart w:id="17" w:name="_Toc175216560"/>
+      <w:bookmarkStart w:id="18" w:name="_Toc175303210"/>
       <w:r>
         <w:rPr>
           <w:lang w:val="fr-FR"/>
@@ -6626,11 +7204,13 @@
         </w:rPr>
         <w:t>millivolts</w:t>
       </w:r>
-      <w:bookmarkEnd w:id="17"/>
+      <w:bookmarkEnd w:id="18"/>
     </w:p>
     <w:p>
       <w:r>
-        <w:lastRenderedPageBreak/>
+        <w:rPr>
+          <w:noProof/>
+        </w:rPr>
         <w:drawing>
           <wp:inline distT="0" distB="0" distL="0" distR="0" wp14:anchorId="7A658A88" wp14:editId="5043C1AD">
             <wp:extent cx="6116320" cy="2670175"/>
@@ -6647,7 +7227,7 @@
                     <pic:cNvPicPr/>
                   </pic:nvPicPr>
                   <pic:blipFill>
-                    <a:blip r:embed="rId21"/>
+                    <a:blip r:embed="rId23"/>
                     <a:stretch>
                       <a:fillRect/>
                     </a:stretch>
@@ -6675,7 +7255,7 @@
           <w:lang w:val="fr-FR"/>
         </w:rPr>
       </w:pPr>
-      <w:bookmarkStart w:id="18" w:name="_Toc175216561"/>
+      <w:bookmarkStart w:id="19" w:name="_Toc175303211"/>
       <w:r>
         <w:rPr>
           <w:lang w:val="fr-FR"/>
@@ -6726,10 +7306,14 @@
         </w:rPr>
         <w:t>millivolts</w:t>
       </w:r>
-      <w:bookmarkEnd w:id="18"/>
+      <w:bookmarkEnd w:id="19"/>
     </w:p>
     <w:p>
       <w:r>
+        <w:rPr>
+          <w:noProof/>
+        </w:rPr>
+        <w:lastRenderedPageBreak/>
         <w:drawing>
           <wp:inline distT="0" distB="0" distL="0" distR="0" wp14:anchorId="0DD6CE38" wp14:editId="27B67DB8">
             <wp:extent cx="6116320" cy="2617470"/>
@@ -6746,7 +7330,7 @@
                     <pic:cNvPicPr/>
                   </pic:nvPicPr>
                   <pic:blipFill>
-                    <a:blip r:embed="rId22"/>
+                    <a:blip r:embed="rId24"/>
                     <a:stretch>
                       <a:fillRect/>
                     </a:stretch>
@@ -6779,7 +7363,7 @@
           <w:lang w:val="fr-FR"/>
         </w:rPr>
       </w:pPr>
-      <w:bookmarkStart w:id="19" w:name="_Toc175216562"/>
+      <w:bookmarkStart w:id="20" w:name="_Toc175303212"/>
       <w:r>
         <w:rPr>
           <w:lang w:val="fr-FR"/>
@@ -6818,12 +7402,14 @@
         </w:rPr>
         <w:t>millivolts</w:t>
       </w:r>
-      <w:bookmarkEnd w:id="19"/>
+      <w:bookmarkEnd w:id="20"/>
     </w:p>
     <w:p/>
     <w:p>
       <w:r>
-        <w:lastRenderedPageBreak/>
+        <w:rPr>
+          <w:noProof/>
+        </w:rPr>
         <w:drawing>
           <wp:inline distT="0" distB="0" distL="0" distR="0" wp14:anchorId="569BB35A" wp14:editId="2A184248">
             <wp:extent cx="6116320" cy="2435860"/>
@@ -6840,7 +7426,7 @@
                     <pic:cNvPicPr/>
                   </pic:nvPicPr>
                   <pic:blipFill>
-                    <a:blip r:embed="rId23"/>
+                    <a:blip r:embed="rId25"/>
                     <a:stretch>
                       <a:fillRect/>
                     </a:stretch>
@@ -6869,14 +7455,14 @@
           <w:lang w:val="fr-FR"/>
         </w:rPr>
       </w:pPr>
-      <w:bookmarkStart w:id="20" w:name="_Toc175216563"/>
+      <w:bookmarkStart w:id="21" w:name="_Toc175303213"/>
       <w:r>
         <w:rPr>
           <w:lang w:val="fr-FR"/>
         </w:rPr>
         <w:t>Comparaison du spectre max mesuré et spectre max issu de la simulation</w:t>
       </w:r>
-      <w:bookmarkEnd w:id="20"/>
+      <w:bookmarkEnd w:id="21"/>
     </w:p>
     <w:p>
       <w:pPr>
@@ -6918,6 +7504,7 @@
         <w:rPr>
           <w:noProof/>
         </w:rPr>
+        <w:lastRenderedPageBreak/>
         <w:drawing>
           <wp:inline distT="0" distB="0" distL="0" distR="0" wp14:anchorId="086F7A9E" wp14:editId="0BEFCDE4">
             <wp:extent cx="6116320" cy="3517265"/>
@@ -6926,15 +7513,117 @@
             <wp:cNvGraphicFramePr/>
             <a:graphic xmlns:a="http://schemas.openxmlformats.org/drawingml/2006/main">
               <a:graphicData uri="http://schemas.openxmlformats.org/drawingml/2006/chart">
-                <c:chart xmlns:c="http://schemas.openxmlformats.org/drawingml/2006/chart" xmlns:r="http://schemas.openxmlformats.org/officeDocument/2006/relationships" r:id="rId24"/>
+                <c:chart xmlns:c="http://schemas.openxmlformats.org/drawingml/2006/chart" xmlns:r="http://schemas.openxmlformats.org/officeDocument/2006/relationships" r:id="rId26"/>
               </a:graphicData>
             </a:graphic>
           </wp:inline>
         </w:drawing>
       </w:r>
     </w:p>
+    <w:p>
+      <w:pPr>
+        <w:jc w:val="left"/>
+      </w:pPr>
+    </w:p>
+    <w:p>
+      <w:pPr>
+        <w:pStyle w:val="Titre1"/>
+      </w:pPr>
+      <w:bookmarkStart w:id="22" w:name="_Toc175303214"/>
+      <w:r>
+        <w:t>spe</w:t>
+      </w:r>
+      <w:r>
+        <w:t xml:space="preserve">ctre </w:t>
+      </w:r>
+      <w:r>
+        <w:t>Avec Wiener</w:t>
+      </w:r>
+      <w:bookmarkEnd w:id="22"/>
+    </w:p>
+    <w:p>
+      <w:pPr>
+        <w:rPr>
+          <w:lang w:val="en-US"/>
+        </w:rPr>
+      </w:pPr>
+    </w:p>
+    <w:p>
+      <w:pPr>
+        <w:pStyle w:val="Titre1"/>
+      </w:pPr>
+      <w:bookmarkStart w:id="23" w:name="_Toc175303215"/>
+      <w:r>
+        <w:t xml:space="preserve">spectre </w:t>
+      </w:r>
+      <w:r>
+        <w:t>Avec Source</w:t>
+      </w:r>
+      <w:bookmarkEnd w:id="23"/>
+    </w:p>
+    <w:p>
+      <w:pPr>
+        <w:rPr>
+          <w:lang w:val="en-US"/>
+        </w:rPr>
+      </w:pPr>
+    </w:p>
+    <w:p>
+      <w:pPr>
+        <w:rPr>
+          <w:lang w:val="en-US"/>
+        </w:rPr>
+      </w:pPr>
+    </w:p>
+    <w:p>
+      <w:pPr>
+        <w:pStyle w:val="Titre1"/>
+      </w:pPr>
+      <w:bookmarkStart w:id="24" w:name="_Toc175303216"/>
+      <w:r>
+        <w:t>Reference interne IRAP</w:t>
+      </w:r>
+      <w:bookmarkEnd w:id="24"/>
+    </w:p>
+    <w:p>
+      <w:pPr>
+        <w:rPr>
+          <w:lang w:val="en-US"/>
+        </w:rPr>
+      </w:pPr>
+    </w:p>
+    <w:p>
+      <w:r>
+        <w:t>Ces mesures répondent</w:t>
+      </w:r>
+      <w:r>
+        <w:t xml:space="preserve"> aux architecture FPGA sauvegardé sur GIT 23/08/2024 </w:t>
+      </w:r>
+      <w:r>
+        <w:rPr>
+          <w:rFonts w:ascii="Consolas" w:eastAsia="Times" w:hAnsi="Consolas" w:cs="Consolas"/>
+          <w:color w:val="000000"/>
+          <w:sz w:val="18"/>
+          <w:szCs w:val="18"/>
+          <w:highlight w:val="white"/>
+        </w:rPr>
+        <w:t>SHA-1: 0f5009969f456a4a247045063d1314184e039d60</w:t>
+      </w:r>
+      <w:r>
+        <w:rPr>
+          <w:rFonts w:ascii="Consolas" w:eastAsia="Times" w:hAnsi="Consolas" w:cs="Consolas"/>
+          <w:color w:val="000000"/>
+          <w:sz w:val="18"/>
+          <w:szCs w:val="18"/>
+        </w:rPr>
+        <w:t xml:space="preserve">. </w:t>
+      </w:r>
+      <w:r>
+        <w:t xml:space="preserve"> </w:t>
+      </w:r>
+    </w:p>
     <w:sectPr>
-      <w:headerReference w:type="default" r:id="rId25"/>
+      <w:headerReference w:type="default" r:id="rId27"/>
       <w:pgSz w:w="11900" w:h="16840"/>
       <w:pgMar w:top="2580" w:right="1134" w:bottom="1134" w:left="1134" w:header="624" w:footer="624" w:gutter="0"/>
       <w:pgNumType w:start="1"/>
@@ -7315,7 +8004,7 @@
               <w:szCs w:val="22"/>
               <w:lang w:val="en-US"/>
             </w:rPr>
-            <w:t>5</w:t>
+            <w:t>14</w:t>
           </w:r>
           <w:r>
             <w:rPr>
@@ -7361,7 +8050,7 @@
               <w:szCs w:val="22"/>
               <w:lang w:val="en-GB"/>
             </w:rPr>
-            <w:t>13</w:t>
+            <w:t>14</w:t>
           </w:r>
           <w:r>
             <w:rPr>
@@ -9387,6 +10076,520 @@
               </a:defRPr>
             </a:pPr>
             <a:r>
+              <a:rPr lang="en-US"/>
+              <a:t>Sortie du shaper en fonction de son entrée</a:t>
+            </a:r>
+          </a:p>
+        </c:rich>
+      </c:tx>
+      <c:overlay val="0"/>
+      <c:spPr>
+        <a:noFill/>
+        <a:ln>
+          <a:noFill/>
+        </a:ln>
+        <a:effectLst/>
+      </c:spPr>
+      <c:txPr>
+        <a:bodyPr rot="0" spcFirstLastPara="1" vertOverflow="ellipsis" vert="horz" wrap="square" anchor="ctr" anchorCtr="1"/>
+        <a:lstStyle/>
+        <a:p>
+          <a:pPr>
+            <a:defRPr sz="1400" b="0" i="0" u="none" strike="noStrike" kern="1200" spc="0" baseline="0">
+              <a:solidFill>
+                <a:schemeClr val="tx1">
+                  <a:lumMod val="65000"/>
+                  <a:lumOff val="35000"/>
+                </a:schemeClr>
+              </a:solidFill>
+              <a:latin typeface="+mn-lt"/>
+              <a:ea typeface="+mn-ea"/>
+              <a:cs typeface="+mn-cs"/>
+            </a:defRPr>
+          </a:pPr>
+          <a:endParaRPr lang="fr-FR"/>
+        </a:p>
+      </c:txPr>
+    </c:title>
+    <c:autoTitleDeleted val="0"/>
+    <c:plotArea>
+      <c:layout/>
+      <c:scatterChart>
+        <c:scatterStyle val="smoothMarker"/>
+        <c:varyColors val="0"/>
+        <c:ser>
+          <c:idx val="0"/>
+          <c:order val="0"/>
+          <c:tx>
+            <c:v>Sortie du shaper en fonction de l'entrée</c:v>
+          </c:tx>
+          <c:spPr>
+            <a:ln w="19050" cap="rnd">
+              <a:solidFill>
+                <a:schemeClr val="accent1"/>
+              </a:solidFill>
+              <a:round/>
+            </a:ln>
+            <a:effectLst/>
+          </c:spPr>
+          <c:marker>
+            <c:symbol val="circle"/>
+            <c:size val="5"/>
+            <c:spPr>
+              <a:solidFill>
+                <a:schemeClr val="accent1"/>
+              </a:solidFill>
+              <a:ln w="9525">
+                <a:solidFill>
+                  <a:schemeClr val="accent1"/>
+                </a:solidFill>
+              </a:ln>
+              <a:effectLst/>
+            </c:spPr>
+          </c:marker>
+          <c:dLbls>
+            <c:spPr>
+              <a:noFill/>
+              <a:ln>
+                <a:noFill/>
+              </a:ln>
+              <a:effectLst/>
+            </c:spPr>
+            <c:txPr>
+              <a:bodyPr rot="0" spcFirstLastPara="1" vertOverflow="ellipsis" vert="horz" wrap="square" lIns="38100" tIns="19050" rIns="38100" bIns="19050" anchor="ctr" anchorCtr="1">
+                <a:spAutoFit/>
+              </a:bodyPr>
+              <a:lstStyle/>
+              <a:p>
+                <a:pPr>
+                  <a:defRPr sz="900" b="0" i="0" u="none" strike="noStrike" kern="1200" baseline="0">
+                    <a:solidFill>
+                      <a:schemeClr val="tx1">
+                        <a:lumMod val="75000"/>
+                        <a:lumOff val="25000"/>
+                      </a:schemeClr>
+                    </a:solidFill>
+                    <a:latin typeface="+mn-lt"/>
+                    <a:ea typeface="+mn-ea"/>
+                    <a:cs typeface="+mn-cs"/>
+                  </a:defRPr>
+                </a:pPr>
+                <a:endParaRPr lang="fr-FR"/>
+              </a:p>
+            </c:txPr>
+            <c:dLblPos val="t"/>
+            <c:showLegendKey val="0"/>
+            <c:showVal val="1"/>
+            <c:showCatName val="0"/>
+            <c:showSerName val="0"/>
+            <c:showPercent val="0"/>
+            <c:showBubbleSize val="0"/>
+            <c:showLeaderLines val="0"/>
+            <c:extLst>
+              <c:ext xmlns:c15="http://schemas.microsoft.com/office/drawing/2012/chart" uri="{CE6537A1-D6FC-4f65-9D91-7224C49458BB}">
+                <c15:showLeaderLines val="1"/>
+                <c15:leaderLines>
+                  <c:spPr>
+                    <a:ln w="9525" cap="flat" cmpd="sng" algn="ctr">
+                      <a:solidFill>
+                        <a:schemeClr val="tx1">
+                          <a:lumMod val="35000"/>
+                          <a:lumOff val="65000"/>
+                        </a:schemeClr>
+                      </a:solidFill>
+                      <a:round/>
+                    </a:ln>
+                    <a:effectLst/>
+                  </c:spPr>
+                </c15:leaderLines>
+              </c:ext>
+            </c:extLst>
+          </c:dLbls>
+          <c:xVal>
+            <c:numRef>
+              <c:f>'@1MSps numérisation'!$A$2:$A$8</c:f>
+              <c:numCache>
+                <c:formatCode>General</c:formatCode>
+                <c:ptCount val="7"/>
+                <c:pt idx="0">
+                  <c:v>0.02</c:v>
+                </c:pt>
+                <c:pt idx="1">
+                  <c:v>0.09</c:v>
+                </c:pt>
+                <c:pt idx="2">
+                  <c:v>0.255</c:v>
+                </c:pt>
+                <c:pt idx="3">
+                  <c:v>0.43</c:v>
+                </c:pt>
+                <c:pt idx="4">
+                  <c:v>0.59</c:v>
+                </c:pt>
+                <c:pt idx="5">
+                  <c:v>0.76</c:v>
+                </c:pt>
+                <c:pt idx="6">
+                  <c:v>0.95</c:v>
+                </c:pt>
+              </c:numCache>
+            </c:numRef>
+          </c:xVal>
+          <c:yVal>
+            <c:numRef>
+              <c:f>'@1MSps numérisation'!$B$2:$B$8</c:f>
+              <c:numCache>
+                <c:formatCode>General</c:formatCode>
+                <c:ptCount val="7"/>
+                <c:pt idx="0">
+                  <c:v>0.3</c:v>
+                </c:pt>
+                <c:pt idx="1">
+                  <c:v>0.5</c:v>
+                </c:pt>
+                <c:pt idx="2">
+                  <c:v>1</c:v>
+                </c:pt>
+                <c:pt idx="3">
+                  <c:v>1.5</c:v>
+                </c:pt>
+                <c:pt idx="4">
+                  <c:v>2</c:v>
+                </c:pt>
+                <c:pt idx="5">
+                  <c:v>2.5</c:v>
+                </c:pt>
+                <c:pt idx="6">
+                  <c:v>3.1</c:v>
+                </c:pt>
+              </c:numCache>
+            </c:numRef>
+          </c:yVal>
+          <c:smooth val="1"/>
+        </c:ser>
+        <c:dLbls>
+          <c:dLblPos val="t"/>
+          <c:showLegendKey val="0"/>
+          <c:showVal val="1"/>
+          <c:showCatName val="0"/>
+          <c:showSerName val="0"/>
+          <c:showPercent val="0"/>
+          <c:showBubbleSize val="0"/>
+        </c:dLbls>
+        <c:axId val="286951768"/>
+        <c:axId val="286952160"/>
+      </c:scatterChart>
+      <c:valAx>
+        <c:axId val="286951768"/>
+        <c:scaling>
+          <c:orientation val="minMax"/>
+        </c:scaling>
+        <c:delete val="0"/>
+        <c:axPos val="b"/>
+        <c:majorGridlines>
+          <c:spPr>
+            <a:ln w="9525" cap="flat" cmpd="sng" algn="ctr">
+              <a:solidFill>
+                <a:schemeClr val="tx1">
+                  <a:lumMod val="15000"/>
+                  <a:lumOff val="85000"/>
+                </a:schemeClr>
+              </a:solidFill>
+              <a:round/>
+            </a:ln>
+            <a:effectLst/>
+          </c:spPr>
+        </c:majorGridlines>
+        <c:title>
+          <c:tx>
+            <c:rich>
+              <a:bodyPr rot="0" spcFirstLastPara="1" vertOverflow="ellipsis" vert="horz" wrap="square" anchor="ctr" anchorCtr="1"/>
+              <a:lstStyle/>
+              <a:p>
+                <a:pPr>
+                  <a:defRPr sz="1000" b="0" i="0" u="none" strike="noStrike" kern="1200" baseline="0">
+                    <a:solidFill>
+                      <a:schemeClr val="tx1">
+                        <a:lumMod val="65000"/>
+                        <a:lumOff val="35000"/>
+                      </a:schemeClr>
+                    </a:solidFill>
+                    <a:latin typeface="+mn-lt"/>
+                    <a:ea typeface="+mn-ea"/>
+                    <a:cs typeface="+mn-cs"/>
+                  </a:defRPr>
+                </a:pPr>
+                <a:r>
+                  <a:rPr lang="fr-FR"/>
+                  <a:t>Entrée en Volts</a:t>
+                </a:r>
+              </a:p>
+            </c:rich>
+          </c:tx>
+          <c:overlay val="0"/>
+          <c:spPr>
+            <a:noFill/>
+            <a:ln>
+              <a:noFill/>
+            </a:ln>
+            <a:effectLst/>
+          </c:spPr>
+          <c:txPr>
+            <a:bodyPr rot="0" spcFirstLastPara="1" vertOverflow="ellipsis" vert="horz" wrap="square" anchor="ctr" anchorCtr="1"/>
+            <a:lstStyle/>
+            <a:p>
+              <a:pPr>
+                <a:defRPr sz="1000" b="0" i="0" u="none" strike="noStrike" kern="1200" baseline="0">
+                  <a:solidFill>
+                    <a:schemeClr val="tx1">
+                      <a:lumMod val="65000"/>
+                      <a:lumOff val="35000"/>
+                    </a:schemeClr>
+                  </a:solidFill>
+                  <a:latin typeface="+mn-lt"/>
+                  <a:ea typeface="+mn-ea"/>
+                  <a:cs typeface="+mn-cs"/>
+                </a:defRPr>
+              </a:pPr>
+              <a:endParaRPr lang="fr-FR"/>
+            </a:p>
+          </c:txPr>
+        </c:title>
+        <c:numFmt formatCode="General" sourceLinked="1"/>
+        <c:majorTickMark val="none"/>
+        <c:minorTickMark val="none"/>
+        <c:tickLblPos val="nextTo"/>
+        <c:spPr>
+          <a:noFill/>
+          <a:ln w="9525" cap="flat" cmpd="sng" algn="ctr">
+            <a:solidFill>
+              <a:schemeClr val="tx1">
+                <a:lumMod val="25000"/>
+                <a:lumOff val="75000"/>
+              </a:schemeClr>
+            </a:solidFill>
+            <a:round/>
+          </a:ln>
+          <a:effectLst/>
+        </c:spPr>
+        <c:txPr>
+          <a:bodyPr rot="-60000000" spcFirstLastPara="1" vertOverflow="ellipsis" vert="horz" wrap="square" anchor="ctr" anchorCtr="1"/>
+          <a:lstStyle/>
+          <a:p>
+            <a:pPr>
+              <a:defRPr sz="900" b="0" i="0" u="none" strike="noStrike" kern="1200" baseline="0">
+                <a:solidFill>
+                  <a:schemeClr val="tx1">
+                    <a:lumMod val="65000"/>
+                    <a:lumOff val="35000"/>
+                  </a:schemeClr>
+                </a:solidFill>
+                <a:latin typeface="+mn-lt"/>
+                <a:ea typeface="+mn-ea"/>
+                <a:cs typeface="+mn-cs"/>
+              </a:defRPr>
+            </a:pPr>
+            <a:endParaRPr lang="fr-FR"/>
+          </a:p>
+        </c:txPr>
+        <c:crossAx val="286952160"/>
+        <c:crosses val="autoZero"/>
+        <c:crossBetween val="midCat"/>
+      </c:valAx>
+      <c:valAx>
+        <c:axId val="286952160"/>
+        <c:scaling>
+          <c:orientation val="minMax"/>
+        </c:scaling>
+        <c:delete val="0"/>
+        <c:axPos val="l"/>
+        <c:majorGridlines>
+          <c:spPr>
+            <a:ln w="9525" cap="flat" cmpd="sng" algn="ctr">
+              <a:solidFill>
+                <a:schemeClr val="tx1">
+                  <a:lumMod val="15000"/>
+                  <a:lumOff val="85000"/>
+                </a:schemeClr>
+              </a:solidFill>
+              <a:round/>
+            </a:ln>
+            <a:effectLst/>
+          </c:spPr>
+        </c:majorGridlines>
+        <c:title>
+          <c:tx>
+            <c:rich>
+              <a:bodyPr rot="-5400000" spcFirstLastPara="1" vertOverflow="ellipsis" vert="horz" wrap="square" anchor="ctr" anchorCtr="1"/>
+              <a:lstStyle/>
+              <a:p>
+                <a:pPr>
+                  <a:defRPr sz="1000" b="0" i="0" u="none" strike="noStrike" kern="1200" baseline="0">
+                    <a:solidFill>
+                      <a:schemeClr val="tx1">
+                        <a:lumMod val="65000"/>
+                        <a:lumOff val="35000"/>
+                      </a:schemeClr>
+                    </a:solidFill>
+                    <a:latin typeface="+mn-lt"/>
+                    <a:ea typeface="+mn-ea"/>
+                    <a:cs typeface="+mn-cs"/>
+                  </a:defRPr>
+                </a:pPr>
+                <a:r>
+                  <a:rPr lang="fr-FR"/>
+                  <a:t>Volts</a:t>
+                </a:r>
+              </a:p>
+            </c:rich>
+          </c:tx>
+          <c:overlay val="0"/>
+          <c:spPr>
+            <a:noFill/>
+            <a:ln>
+              <a:noFill/>
+            </a:ln>
+            <a:effectLst/>
+          </c:spPr>
+          <c:txPr>
+            <a:bodyPr rot="-5400000" spcFirstLastPara="1" vertOverflow="ellipsis" vert="horz" wrap="square" anchor="ctr" anchorCtr="1"/>
+            <a:lstStyle/>
+            <a:p>
+              <a:pPr>
+                <a:defRPr sz="1000" b="0" i="0" u="none" strike="noStrike" kern="1200" baseline="0">
+                  <a:solidFill>
+                    <a:schemeClr val="tx1">
+                      <a:lumMod val="65000"/>
+                      <a:lumOff val="35000"/>
+                    </a:schemeClr>
+                  </a:solidFill>
+                  <a:latin typeface="+mn-lt"/>
+                  <a:ea typeface="+mn-ea"/>
+                  <a:cs typeface="+mn-cs"/>
+                </a:defRPr>
+              </a:pPr>
+              <a:endParaRPr lang="fr-FR"/>
+            </a:p>
+          </c:txPr>
+        </c:title>
+        <c:numFmt formatCode="General" sourceLinked="1"/>
+        <c:majorTickMark val="none"/>
+        <c:minorTickMark val="none"/>
+        <c:tickLblPos val="nextTo"/>
+        <c:spPr>
+          <a:noFill/>
+          <a:ln w="9525" cap="flat" cmpd="sng" algn="ctr">
+            <a:solidFill>
+              <a:schemeClr val="tx1">
+                <a:lumMod val="25000"/>
+                <a:lumOff val="75000"/>
+              </a:schemeClr>
+            </a:solidFill>
+            <a:round/>
+          </a:ln>
+          <a:effectLst/>
+        </c:spPr>
+        <c:txPr>
+          <a:bodyPr rot="-60000000" spcFirstLastPara="1" vertOverflow="ellipsis" vert="horz" wrap="square" anchor="ctr" anchorCtr="1"/>
+          <a:lstStyle/>
+          <a:p>
+            <a:pPr>
+              <a:defRPr sz="900" b="0" i="0" u="none" strike="noStrike" kern="1200" baseline="0">
+                <a:solidFill>
+                  <a:schemeClr val="tx1">
+                    <a:lumMod val="65000"/>
+                    <a:lumOff val="35000"/>
+                  </a:schemeClr>
+                </a:solidFill>
+                <a:latin typeface="+mn-lt"/>
+                <a:ea typeface="+mn-ea"/>
+                <a:cs typeface="+mn-cs"/>
+              </a:defRPr>
+            </a:pPr>
+            <a:endParaRPr lang="fr-FR"/>
+          </a:p>
+        </c:txPr>
+        <c:crossAx val="286951768"/>
+        <c:crosses val="autoZero"/>
+        <c:crossBetween val="midCat"/>
+      </c:valAx>
+      <c:spPr>
+        <a:noFill/>
+        <a:ln>
+          <a:noFill/>
+        </a:ln>
+        <a:effectLst/>
+      </c:spPr>
+    </c:plotArea>
+    <c:plotVisOnly val="1"/>
+    <c:dispBlanksAs val="gap"/>
+    <c:showDLblsOverMax val="0"/>
+  </c:chart>
+  <c:spPr>
+    <a:solidFill>
+      <a:schemeClr val="bg1"/>
+    </a:solidFill>
+    <a:ln w="9525" cap="flat" cmpd="sng" algn="ctr">
+      <a:solidFill>
+        <a:schemeClr val="tx1">
+          <a:lumMod val="15000"/>
+          <a:lumOff val="85000"/>
+        </a:schemeClr>
+      </a:solidFill>
+      <a:round/>
+    </a:ln>
+    <a:effectLst/>
+  </c:spPr>
+  <c:txPr>
+    <a:bodyPr/>
+    <a:lstStyle/>
+    <a:p>
+      <a:pPr>
+        <a:defRPr/>
+      </a:pPr>
+      <a:endParaRPr lang="fr-FR"/>
+    </a:p>
+  </c:txPr>
+  <c:externalData r:id="rId3">
+    <c:autoUpdate val="0"/>
+  </c:externalData>
+</c:chartSpace>
+</file>
+
+<file path=word/charts/chart2.xml><?xml version="1.0" encoding="utf-8"?>
+<c:chartSpace xmlns:c="http://schemas.openxmlformats.org/drawingml/2006/chart" xmlns:a="http://schemas.openxmlformats.org/drawingml/2006/main" xmlns:r="http://schemas.openxmlformats.org/officeDocument/2006/relationships">
+  <c:date1904 val="0"/>
+  <c:lang val="fr-FR"/>
+  <c:roundedCorners val="0"/>
+  <mc:AlternateContent xmlns:mc="http://schemas.openxmlformats.org/markup-compatibility/2006">
+    <mc:Choice xmlns:c14="http://schemas.microsoft.com/office/drawing/2007/8/2/chart" Requires="c14">
+      <c14:style val="102"/>
+    </mc:Choice>
+    <mc:Fallback>
+      <c:style val="2"/>
+    </mc:Fallback>
+  </mc:AlternateContent>
+  <c:chart>
+    <c:title>
+      <c:tx>
+        <c:rich>
+          <a:bodyPr rot="0" spcFirstLastPara="1" vertOverflow="ellipsis" vert="horz" wrap="square" anchor="ctr" anchorCtr="1"/>
+          <a:lstStyle/>
+          <a:p>
+            <a:pPr>
+              <a:defRPr sz="1400" b="0" i="0" u="none" strike="noStrike" kern="1200" spc="0" baseline="0">
+                <a:solidFill>
+                  <a:schemeClr val="tx1">
+                    <a:lumMod val="65000"/>
+                    <a:lumOff val="35000"/>
+                  </a:schemeClr>
+                </a:solidFill>
+                <a:latin typeface="+mn-lt"/>
+                <a:ea typeface="+mn-ea"/>
+                <a:cs typeface="+mn-cs"/>
+              </a:defRPr>
+            </a:pPr>
+            <a:r>
               <a:rPr lang="fr-FR"/>
               <a:t>Entrée</a:t>
             </a:r>
@@ -11859,11 +13062,11 @@
           <c:showPercent val="0"/>
           <c:showBubbleSize val="0"/>
         </c:dLbls>
-        <c:axId val="352960224"/>
-        <c:axId val="352960616"/>
+        <c:axId val="286949808"/>
+        <c:axId val="286952552"/>
       </c:scatterChart>
       <c:valAx>
-        <c:axId val="352960224"/>
+        <c:axId val="286949808"/>
         <c:scaling>
           <c:orientation val="minMax"/>
         </c:scaling>
@@ -11975,12 +13178,12 @@
             <a:endParaRPr lang="fr-FR"/>
           </a:p>
         </c:txPr>
-        <c:crossAx val="352960616"/>
+        <c:crossAx val="286952552"/>
         <c:crosses val="autoZero"/>
         <c:crossBetween val="midCat"/>
       </c:valAx>
       <c:valAx>
-        <c:axId val="352960616"/>
+        <c:axId val="286952552"/>
         <c:scaling>
           <c:orientation val="minMax"/>
         </c:scaling>
@@ -12097,7 +13300,7 @@
             <a:endParaRPr lang="fr-FR"/>
           </a:p>
         </c:txPr>
-        <c:crossAx val="352960224"/>
+        <c:crossAx val="286949808"/>
         <c:crosses val="autoZero"/>
         <c:crossBetween val="midCat"/>
       </c:valAx>
@@ -12175,7 +13378,7 @@
 </c:chartSpace>
 </file>
 
-<file path=word/charts/chart2.xml><?xml version="1.0" encoding="utf-8"?>
+<file path=word/charts/chart3.xml><?xml version="1.0" encoding="utf-8"?>
 <c:chartSpace xmlns:c="http://schemas.openxmlformats.org/drawingml/2006/chart" xmlns:a="http://schemas.openxmlformats.org/drawingml/2006/main" xmlns:r="http://schemas.openxmlformats.org/officeDocument/2006/relationships">
   <c:date1904 val="0"/>
   <c:lang val="fr-FR"/>
@@ -12430,11 +13633,11 @@
           <c:showPercent val="0"/>
           <c:showBubbleSize val="0"/>
         </c:dLbls>
-        <c:axId val="352961792"/>
-        <c:axId val="352962968"/>
+        <c:axId val="370362992"/>
+        <c:axId val="370361424"/>
       </c:scatterChart>
       <c:valAx>
-        <c:axId val="352961792"/>
+        <c:axId val="370362992"/>
         <c:scaling>
           <c:orientation val="minMax"/>
         </c:scaling>
@@ -12554,12 +13757,12 @@
             <a:endParaRPr lang="fr-FR"/>
           </a:p>
         </c:txPr>
-        <c:crossAx val="352962968"/>
+        <c:crossAx val="370361424"/>
         <c:crosses val="autoZero"/>
         <c:crossBetween val="midCat"/>
       </c:valAx>
       <c:valAx>
-        <c:axId val="352962968"/>
+        <c:axId val="370361424"/>
         <c:scaling>
           <c:orientation val="minMax"/>
         </c:scaling>
@@ -12671,7 +13874,7 @@
             <a:endParaRPr lang="fr-FR"/>
           </a:p>
         </c:txPr>
-        <c:crossAx val="352961792"/>
+        <c:crossAx val="370362992"/>
         <c:crosses val="autoZero"/>
         <c:crossBetween val="midCat"/>
       </c:valAx>
@@ -12749,7 +13952,7 @@
 </c:chartSpace>
 </file>
 
-<file path=word/charts/chart3.xml><?xml version="1.0" encoding="utf-8"?>
+<file path=word/charts/chart4.xml><?xml version="1.0" encoding="utf-8"?>
 <c:chartSpace xmlns:c="http://schemas.openxmlformats.org/drawingml/2006/chart" xmlns:a="http://schemas.openxmlformats.org/drawingml/2006/main" xmlns:r="http://schemas.openxmlformats.org/officeDocument/2006/relationships">
   <c:date1904 val="0"/>
   <c:lang val="fr-FR"/>
@@ -15324,11 +16527,11 @@
           <c:showPercent val="0"/>
           <c:showBubbleSize val="0"/>
         </c:dLbls>
-        <c:axId val="352959440"/>
-        <c:axId val="352959832"/>
+        <c:axId val="286956904"/>
+        <c:axId val="286954944"/>
       </c:scatterChart>
       <c:valAx>
-        <c:axId val="352959440"/>
+        <c:axId val="286956904"/>
         <c:scaling>
           <c:orientation val="minMax"/>
         </c:scaling>
@@ -15439,12 +16642,12 @@
             <a:endParaRPr lang="fr-FR"/>
           </a:p>
         </c:txPr>
-        <c:crossAx val="352959832"/>
+        <c:crossAx val="286954944"/>
         <c:crosses val="autoZero"/>
         <c:crossBetween val="midCat"/>
       </c:valAx>
       <c:valAx>
-        <c:axId val="352959832"/>
+        <c:axId val="286954944"/>
         <c:scaling>
           <c:orientation val="minMax"/>
         </c:scaling>
@@ -15556,7 +16759,7 @@
             <a:endParaRPr lang="fr-FR"/>
           </a:p>
         </c:txPr>
-        <c:crossAx val="352959440"/>
+        <c:crossAx val="286956904"/>
         <c:crosses val="autoZero"/>
         <c:crossBetween val="midCat"/>
       </c:valAx>
@@ -15634,7 +16837,7 @@
 </c:chartSpace>
 </file>
 
-<file path=word/charts/chart4.xml><?xml version="1.0" encoding="utf-8"?>
+<file path=word/charts/chart5.xml><?xml version="1.0" encoding="utf-8"?>
 <c:chartSpace xmlns:c="http://schemas.openxmlformats.org/drawingml/2006/chart" xmlns:a="http://schemas.openxmlformats.org/drawingml/2006/main" xmlns:r="http://schemas.openxmlformats.org/officeDocument/2006/relationships">
   <c:date1904 val="0"/>
   <c:lang val="fr-FR"/>
@@ -15861,11 +17064,11 @@
           <c:showPercent val="0"/>
           <c:showBubbleSize val="0"/>
         </c:dLbls>
-        <c:axId val="352949392"/>
-        <c:axId val="352951744"/>
+        <c:axId val="286956120"/>
+        <c:axId val="485433824"/>
       </c:scatterChart>
       <c:valAx>
-        <c:axId val="352949392"/>
+        <c:axId val="286956120"/>
         <c:scaling>
           <c:orientation val="minMax"/>
         </c:scaling>
@@ -15977,12 +17180,12 @@
             <a:endParaRPr lang="fr-FR"/>
           </a:p>
         </c:txPr>
-        <c:crossAx val="352951744"/>
+        <c:crossAx val="485433824"/>
         <c:crosses val="autoZero"/>
         <c:crossBetween val="midCat"/>
       </c:valAx>
       <c:valAx>
-        <c:axId val="352951744"/>
+        <c:axId val="485433824"/>
         <c:scaling>
           <c:orientation val="minMax"/>
         </c:scaling>
@@ -16094,7 +17297,7 @@
             <a:endParaRPr lang="fr-FR"/>
           </a:p>
         </c:txPr>
-        <c:crossAx val="352949392"/>
+        <c:crossAx val="286956120"/>
         <c:crosses val="autoZero"/>
         <c:crossBetween val="midCat"/>
       </c:valAx>
@@ -16141,7 +17344,7 @@
 </c:chartSpace>
 </file>
 
-<file path=word/charts/chart5.xml><?xml version="1.0" encoding="utf-8"?>
+<file path=word/charts/chart6.xml><?xml version="1.0" encoding="utf-8"?>
 <c:chartSpace xmlns:c="http://schemas.openxmlformats.org/drawingml/2006/chart" xmlns:a="http://schemas.openxmlformats.org/drawingml/2006/main" xmlns:r="http://schemas.openxmlformats.org/officeDocument/2006/relationships">
   <c:date1904 val="0"/>
   <c:lang val="fr-FR"/>
@@ -16418,11 +17621,11 @@
           <c:showPercent val="0"/>
           <c:showBubbleSize val="0"/>
         </c:dLbls>
-        <c:axId val="352951352"/>
-        <c:axId val="352950176"/>
+        <c:axId val="485435000"/>
+        <c:axId val="481721176"/>
       </c:scatterChart>
       <c:valAx>
-        <c:axId val="352951352"/>
+        <c:axId val="485435000"/>
         <c:scaling>
           <c:orientation val="minMax"/>
         </c:scaling>
@@ -16534,12 +17737,12 @@
             <a:endParaRPr lang="fr-FR"/>
           </a:p>
         </c:txPr>
-        <c:crossAx val="352950176"/>
+        <c:crossAx val="481721176"/>
         <c:crosses val="autoZero"/>
         <c:crossBetween val="midCat"/>
       </c:valAx>
       <c:valAx>
-        <c:axId val="352950176"/>
+        <c:axId val="481721176"/>
         <c:scaling>
           <c:orientation val="minMax"/>
         </c:scaling>
@@ -16651,7 +17854,7 @@
             <a:endParaRPr lang="fr-FR"/>
           </a:p>
         </c:txPr>
-        <c:crossAx val="352951352"/>
+        <c:crossAx val="485435000"/>
         <c:crosses val="autoZero"/>
         <c:crossBetween val="midCat"/>
       </c:valAx>
@@ -16698,7 +17901,7 @@
 </c:chartSpace>
 </file>
 
-<file path=word/charts/chart6.xml><?xml version="1.0" encoding="utf-8"?>
+<file path=word/charts/chart7.xml><?xml version="1.0" encoding="utf-8"?>
 <c:chartSpace xmlns:c="http://schemas.openxmlformats.org/drawingml/2006/chart" xmlns:a="http://schemas.openxmlformats.org/drawingml/2006/main" xmlns:r="http://schemas.openxmlformats.org/officeDocument/2006/relationships">
   <c:date1904 val="0"/>
   <c:lang val="fr-FR"/>
@@ -17094,11 +18297,11 @@
           <c:showPercent val="0"/>
           <c:showBubbleSize val="0"/>
         </c:dLbls>
-        <c:axId val="348718440"/>
-        <c:axId val="348718048"/>
+        <c:axId val="481722352"/>
+        <c:axId val="376256448"/>
       </c:scatterChart>
       <c:valAx>
-        <c:axId val="348718440"/>
+        <c:axId val="481722352"/>
         <c:scaling>
           <c:orientation val="minMax"/>
         </c:scaling>
@@ -17215,12 +18418,12 @@
             <a:endParaRPr lang="fr-FR"/>
           </a:p>
         </c:txPr>
-        <c:crossAx val="348718048"/>
+        <c:crossAx val="376256448"/>
         <c:crosses val="autoZero"/>
         <c:crossBetween val="midCat"/>
       </c:valAx>
       <c:valAx>
-        <c:axId val="348718048"/>
+        <c:axId val="376256448"/>
         <c:scaling>
           <c:orientation val="minMax"/>
         </c:scaling>
@@ -17337,7 +18540,7 @@
             <a:endParaRPr lang="fr-FR"/>
           </a:p>
         </c:txPr>
-        <c:crossAx val="348718440"/>
+        <c:crossAx val="481722352"/>
         <c:crosses val="autoZero"/>
         <c:crossBetween val="midCat"/>
       </c:valAx>
@@ -17616,6 +18819,46 @@
 </file>
 
 <file path=word/charts/colors6.xml><?xml version="1.0" encoding="utf-8"?>
+<cs:colorStyle xmlns:cs="http://schemas.microsoft.com/office/drawing/2012/chartStyle" xmlns:a="http://schemas.openxmlformats.org/drawingml/2006/main" meth="cycle" id="10">
+  <a:schemeClr val="accent1"/>
+  <a:schemeClr val="accent2"/>
+  <a:schemeClr val="accent3"/>
+  <a:schemeClr val="accent4"/>
+  <a:schemeClr val="accent5"/>
+  <a:schemeClr val="accent6"/>
+  <cs:variation/>
+  <cs:variation>
+    <a:lumMod val="60000"/>
+  </cs:variation>
+  <cs:variation>
+    <a:lumMod val="80000"/>
+    <a:lumOff val="20000"/>
+  </cs:variation>
+  <cs:variation>
+    <a:lumMod val="80000"/>
+  </cs:variation>
+  <cs:variation>
+    <a:lumMod val="60000"/>
+    <a:lumOff val="40000"/>
+  </cs:variation>
+  <cs:variation>
+    <a:lumMod val="50000"/>
+  </cs:variation>
+  <cs:variation>
+    <a:lumMod val="70000"/>
+    <a:lumOff val="30000"/>
+  </cs:variation>
+  <cs:variation>
+    <a:lumMod val="70000"/>
+  </cs:variation>
+  <cs:variation>
+    <a:lumMod val="50000"/>
+    <a:lumOff val="50000"/>
+  </cs:variation>
+</cs:colorStyle>
+</file>
+
+<file path=word/charts/colors7.xml><?xml version="1.0" encoding="utf-8"?>
 <cs:colorStyle xmlns:cs="http://schemas.microsoft.com/office/drawing/2012/chartStyle" xmlns:a="http://schemas.openxmlformats.org/drawingml/2006/main" meth="cycle" id="10">
   <a:schemeClr val="accent1"/>
   <a:schemeClr val="accent2"/>
@@ -20751,6 +21994,522 @@
 </cs:chartStyle>
 </file>
 
+<file path=word/charts/style7.xml><?xml version="1.0" encoding="utf-8"?>
+<cs:chartStyle xmlns:cs="http://schemas.microsoft.com/office/drawing/2012/chartStyle" xmlns:a="http://schemas.openxmlformats.org/drawingml/2006/main" id="240">
+  <cs:axisTitle>
+    <cs:lnRef idx="0"/>
+    <cs:fillRef idx="0"/>
+    <cs:effectRef idx="0"/>
+    <cs:fontRef idx="minor">
+      <a:schemeClr val="tx1">
+        <a:lumMod val="65000"/>
+        <a:lumOff val="35000"/>
+      </a:schemeClr>
+    </cs:fontRef>
+    <cs:defRPr sz="1000" kern="1200"/>
+  </cs:axisTitle>
+  <cs:categoryAxis>
+    <cs:lnRef idx="0"/>
+    <cs:fillRef idx="0"/>
+    <cs:effectRef idx="0"/>
+    <cs:fontRef idx="minor">
+      <a:schemeClr val="tx1">
+        <a:lumMod val="65000"/>
+        <a:lumOff val="35000"/>
+      </a:schemeClr>
+    </cs:fontRef>
+    <cs:spPr>
+      <a:ln w="9525" cap="flat" cmpd="sng" algn="ctr">
+        <a:solidFill>
+          <a:schemeClr val="tx1">
+            <a:lumMod val="25000"/>
+            <a:lumOff val="75000"/>
+          </a:schemeClr>
+        </a:solidFill>
+        <a:round/>
+      </a:ln>
+    </cs:spPr>
+    <cs:defRPr sz="900" kern="1200"/>
+  </cs:categoryAxis>
+  <cs:chartArea mods="allowNoFillOverride allowNoLineOverride">
+    <cs:lnRef idx="0"/>
+    <cs:fillRef idx="0"/>
+    <cs:effectRef idx="0"/>
+    <cs:fontRef idx="minor">
+      <a:schemeClr val="tx1"/>
+    </cs:fontRef>
+    <cs:spPr>
+      <a:solidFill>
+        <a:schemeClr val="bg1"/>
+      </a:solidFill>
+      <a:ln w="9525" cap="flat" cmpd="sng" algn="ctr">
+        <a:solidFill>
+          <a:schemeClr val="tx1">
+            <a:lumMod val="15000"/>
+            <a:lumOff val="85000"/>
+          </a:schemeClr>
+        </a:solidFill>
+        <a:round/>
+      </a:ln>
+    </cs:spPr>
+    <cs:defRPr sz="1000" kern="1200"/>
+  </cs:chartArea>
+  <cs:dataLabel>
+    <cs:lnRef idx="0"/>
+    <cs:fillRef idx="0"/>
+    <cs:effectRef idx="0"/>
+    <cs:fontRef idx="minor">
+      <a:schemeClr val="tx1">
+        <a:lumMod val="75000"/>
+        <a:lumOff val="25000"/>
+      </a:schemeClr>
+    </cs:fontRef>
+    <cs:defRPr sz="900" kern="1200"/>
+  </cs:dataLabel>
+  <cs:dataLabelCallout>
+    <cs:lnRef idx="0"/>
+    <cs:fillRef idx="0"/>
+    <cs:effectRef idx="0"/>
+    <cs:fontRef idx="minor">
+      <a:schemeClr val="dk1">
+        <a:lumMod val="65000"/>
+        <a:lumOff val="35000"/>
+      </a:schemeClr>
+    </cs:fontRef>
+    <cs:spPr>
+      <a:solidFill>
+        <a:schemeClr val="lt1"/>
+      </a:solidFill>
+      <a:ln>
+        <a:solidFill>
+          <a:schemeClr val="dk1">
+            <a:lumMod val="25000"/>
+            <a:lumOff val="75000"/>
+          </a:schemeClr>
+        </a:solidFill>
+      </a:ln>
+    </cs:spPr>
+    <cs:defRPr sz="900" kern="1200"/>
+    <cs:bodyPr rot="0" spcFirstLastPara="1" vertOverflow="clip" horzOverflow="clip" vert="horz" wrap="square" lIns="36576" tIns="18288" rIns="36576" bIns="18288" anchor="ctr" anchorCtr="1">
+      <a:spAutoFit/>
+    </cs:bodyPr>
+  </cs:dataLabelCallout>
+  <cs:dataPoint>
+    <cs:lnRef idx="0"/>
+    <cs:fillRef idx="1">
+      <cs:styleClr val="auto"/>
+    </cs:fillRef>
+    <cs:effectRef idx="0"/>
+    <cs:fontRef idx="minor">
+      <a:schemeClr val="tx1"/>
+    </cs:fontRef>
+  </cs:dataPoint>
+  <cs:dataPoint3D>
+    <cs:lnRef idx="0"/>
+    <cs:fillRef idx="1">
+      <cs:styleClr val="auto"/>
+    </cs:fillRef>
+    <cs:effectRef idx="0"/>
+    <cs:fontRef idx="minor">
+      <a:schemeClr val="tx1"/>
+    </cs:fontRef>
+  </cs:dataPoint3D>
+  <cs:dataPointLine>
+    <cs:lnRef idx="0">
+      <cs:styleClr val="auto"/>
+    </cs:lnRef>
+    <cs:fillRef idx="1"/>
+    <cs:effectRef idx="0"/>
+    <cs:fontRef idx="minor">
+      <a:schemeClr val="tx1"/>
+    </cs:fontRef>
+    <cs:spPr>
+      <a:ln w="19050" cap="rnd">
+        <a:solidFill>
+          <a:schemeClr val="phClr"/>
+        </a:solidFill>
+        <a:round/>
+      </a:ln>
+    </cs:spPr>
+  </cs:dataPointLine>
+  <cs:dataPointMarker>
+    <cs:lnRef idx="0">
+      <cs:styleClr val="auto"/>
+    </cs:lnRef>
+    <cs:fillRef idx="1">
+      <cs:styleClr val="auto"/>
+    </cs:fillRef>
+    <cs:effectRef idx="0"/>
+    <cs:fontRef idx="minor">
+      <a:schemeClr val="tx1"/>
+    </cs:fontRef>
+    <cs:spPr>
+      <a:ln w="9525">
+        <a:solidFill>
+          <a:schemeClr val="phClr"/>
+        </a:solidFill>
+      </a:ln>
+    </cs:spPr>
+  </cs:dataPointMarker>
+  <cs:dataPointMarkerLayout symbol="circle" size="5"/>
+  <cs:dataPointWireframe>
+    <cs:lnRef idx="0">
+      <cs:styleClr val="auto"/>
+    </cs:lnRef>
+    <cs:fillRef idx="0"/>
+    <cs:effectRef idx="0"/>
+    <cs:fontRef idx="minor">
+      <a:schemeClr val="dk1"/>
+    </cs:fontRef>
+    <cs:spPr>
+      <a:ln w="9525" cap="rnd">
+        <a:solidFill>
+          <a:schemeClr val="phClr"/>
+        </a:solidFill>
+        <a:round/>
+      </a:ln>
+    </cs:spPr>
+  </cs:dataPointWireframe>
+  <cs:dataTable>
+    <cs:lnRef idx="0"/>
+    <cs:fillRef idx="0"/>
+    <cs:effectRef idx="0"/>
+    <cs:fontRef idx="minor">
+      <a:schemeClr val="tx1">
+        <a:lumMod val="65000"/>
+        <a:lumOff val="35000"/>
+      </a:schemeClr>
+    </cs:fontRef>
+    <cs:spPr>
+      <a:noFill/>
+      <a:ln w="9525" cap="flat" cmpd="sng" algn="ctr">
+        <a:solidFill>
+          <a:schemeClr val="tx1">
+            <a:lumMod val="15000"/>
+            <a:lumOff val="85000"/>
+          </a:schemeClr>
+        </a:solidFill>
+        <a:round/>
+      </a:ln>
+    </cs:spPr>
+    <cs:defRPr sz="900" kern="1200"/>
+  </cs:dataTable>
+  <cs:downBar>
+    <cs:lnRef idx="0"/>
+    <cs:fillRef idx="0"/>
+    <cs:effectRef idx="0"/>
+    <cs:fontRef idx="minor">
+      <a:schemeClr val="tx1"/>
+    </cs:fontRef>
+    <cs:spPr>
+      <a:solidFill>
+        <a:schemeClr val="dk1">
+          <a:lumMod val="75000"/>
+          <a:lumOff val="25000"/>
+        </a:schemeClr>
+      </a:solidFill>
+      <a:ln w="9525" cap="flat" cmpd="sng" algn="ctr">
+        <a:solidFill>
+          <a:schemeClr val="tx1">
+            <a:lumMod val="65000"/>
+            <a:lumOff val="35000"/>
+          </a:schemeClr>
+        </a:solidFill>
+        <a:round/>
+      </a:ln>
+    </cs:spPr>
+  </cs:downBar>
+  <cs:dropLine>
+    <cs:lnRef idx="0"/>
+    <cs:fillRef idx="0"/>
+    <cs:effectRef idx="0"/>
+    <cs:fontRef idx="minor">
+      <a:schemeClr val="tx1"/>
+    </cs:fontRef>
+    <cs:spPr>
+      <a:ln w="9525" cap="flat" cmpd="sng" algn="ctr">
+        <a:solidFill>
+          <a:schemeClr val="tx1">
+            <a:lumMod val="35000"/>
+            <a:lumOff val="65000"/>
+          </a:schemeClr>
+        </a:solidFill>
+        <a:round/>
+      </a:ln>
+    </cs:spPr>
+  </cs:dropLine>
+  <cs:errorBar>
+    <cs:lnRef idx="0"/>
+    <cs:fillRef idx="0"/>
+    <cs:effectRef idx="0"/>
+    <cs:fontRef idx="minor">
+      <a:schemeClr val="tx1"/>
+    </cs:fontRef>
+    <cs:spPr>
+      <a:ln w="9525" cap="flat" cmpd="sng" algn="ctr">
+        <a:solidFill>
+          <a:schemeClr val="tx1">
+            <a:lumMod val="65000"/>
+            <a:lumOff val="35000"/>
+          </a:schemeClr>
+        </a:solidFill>
+        <a:round/>
+      </a:ln>
+    </cs:spPr>
+  </cs:errorBar>
+  <cs:floor>
+    <cs:lnRef idx="0"/>
+    <cs:fillRef idx="0"/>
+    <cs:effectRef idx="0"/>
+    <cs:fontRef idx="minor">
+      <a:schemeClr val="tx1"/>
+    </cs:fontRef>
+    <cs:spPr>
+      <a:noFill/>
+      <a:ln>
+        <a:noFill/>
+      </a:ln>
+    </cs:spPr>
+  </cs:floor>
+  <cs:gridlineMajor>
+    <cs:lnRef idx="0"/>
+    <cs:fillRef idx="0"/>
+    <cs:effectRef idx="0"/>
+    <cs:fontRef idx="minor">
+      <a:schemeClr val="tx1"/>
+    </cs:fontRef>
+    <cs:spPr>
+      <a:ln w="9525" cap="flat" cmpd="sng" algn="ctr">
+        <a:solidFill>
+          <a:schemeClr val="tx1">
+            <a:lumMod val="15000"/>
+            <a:lumOff val="85000"/>
+          </a:schemeClr>
+        </a:solidFill>
+        <a:round/>
+      </a:ln>
+    </cs:spPr>
+  </cs:gridlineMajor>
+  <cs:gridlineMinor>
+    <cs:lnRef idx="0"/>
+    <cs:fillRef idx="0"/>
+    <cs:effectRef idx="0"/>
+    <cs:fontRef idx="minor">
+      <a:schemeClr val="tx1"/>
+    </cs:fontRef>
+    <cs:spPr>
+      <a:ln w="9525" cap="flat" cmpd="sng" algn="ctr">
+        <a:solidFill>
+          <a:schemeClr val="tx1">
+            <a:lumMod val="5000"/>
+            <a:lumOff val="95000"/>
+          </a:schemeClr>
+        </a:solidFill>
+        <a:round/>
+      </a:ln>
+    </cs:spPr>
+  </cs:gridlineMinor>
+  <cs:hiLoLine>
+    <cs:lnRef idx="0"/>
+    <cs:fillRef idx="0"/>
+    <cs:effectRef idx="0"/>
+    <cs:fontRef idx="minor">
+      <a:schemeClr val="tx1"/>
+    </cs:fontRef>
+    <cs:spPr>
+      <a:ln w="9525" cap="flat" cmpd="sng" algn="ctr">
+        <a:solidFill>
+          <a:schemeClr val="tx1">
+            <a:lumMod val="50000"/>
+            <a:lumOff val="50000"/>
+          </a:schemeClr>
+        </a:solidFill>
+        <a:round/>
+      </a:ln>
+    </cs:spPr>
+  </cs:hiLoLine>
+  <cs:leaderLine>
+    <cs:lnRef idx="0"/>
+    <cs:fillRef idx="0"/>
+    <cs:effectRef idx="0"/>
+    <cs:fontRef idx="minor">
+      <a:schemeClr val="tx1"/>
+    </cs:fontRef>
+    <cs:spPr>
+      <a:ln w="9525" cap="flat" cmpd="sng" algn="ctr">
+        <a:solidFill>
+          <a:schemeClr val="tx1">
+            <a:lumMod val="35000"/>
+            <a:lumOff val="65000"/>
+          </a:schemeClr>
+        </a:solidFill>
+        <a:round/>
+      </a:ln>
+    </cs:spPr>
+  </cs:leaderLine>
+  <cs:legend>
+    <cs:lnRef idx="0"/>
+    <cs:fillRef idx="0"/>
+    <cs:effectRef idx="0"/>
+    <cs:fontRef idx="minor">
+      <a:schemeClr val="tx1">
+        <a:lumMod val="65000"/>
+        <a:lumOff val="35000"/>
+      </a:schemeClr>
+    </cs:fontRef>
+    <cs:defRPr sz="900" kern="1200"/>
+  </cs:legend>
+  <cs:plotArea mods="allowNoFillOverride allowNoLineOverride">
+    <cs:lnRef idx="0"/>
+    <cs:fillRef idx="0"/>
+    <cs:effectRef idx="0"/>
+    <cs:fontRef idx="minor">
+      <a:schemeClr val="tx1"/>
+    </cs:fontRef>
+  </cs:plotArea>
+  <cs:plotArea3D mods="allowNoFillOverride allowNoLineOverride">
+    <cs:lnRef idx="0"/>
+    <cs:fillRef idx="0"/>
+    <cs:effectRef idx="0"/>
+    <cs:fontRef idx="minor">
+      <a:schemeClr val="tx1"/>
+    </cs:fontRef>
+  </cs:plotArea3D>
+  <cs:seriesAxis>
+    <cs:lnRef idx="0"/>
+    <cs:fillRef idx="0"/>
+    <cs:effectRef idx="0"/>
+    <cs:fontRef idx="minor">
+      <a:schemeClr val="tx1">
+        <a:lumMod val="65000"/>
+        <a:lumOff val="35000"/>
+      </a:schemeClr>
+    </cs:fontRef>
+    <cs:defRPr sz="900" kern="1200"/>
+  </cs:seriesAxis>
+  <cs:seriesLine>
+    <cs:lnRef idx="0"/>
+    <cs:fillRef idx="0"/>
+    <cs:effectRef idx="0"/>
+    <cs:fontRef idx="minor">
+      <a:schemeClr val="tx1"/>
+    </cs:fontRef>
+    <cs:spPr>
+      <a:ln w="9525" cap="flat" cmpd="sng" algn="ctr">
+        <a:solidFill>
+          <a:schemeClr val="tx1">
+            <a:lumMod val="35000"/>
+            <a:lumOff val="65000"/>
+          </a:schemeClr>
+        </a:solidFill>
+        <a:round/>
+      </a:ln>
+    </cs:spPr>
+  </cs:seriesLine>
+  <cs:title>
+    <cs:lnRef idx="0"/>
+    <cs:fillRef idx="0"/>
+    <cs:effectRef idx="0"/>
+    <cs:fontRef idx="minor">
+      <a:schemeClr val="tx1">
+        <a:lumMod val="65000"/>
+        <a:lumOff val="35000"/>
+      </a:schemeClr>
+    </cs:fontRef>
+    <cs:defRPr sz="1400" b="0" kern="1200" spc="0" baseline="0"/>
+  </cs:title>
+  <cs:trendline>
+    <cs:lnRef idx="0">
+      <cs:styleClr val="auto"/>
+    </cs:lnRef>
+    <cs:fillRef idx="0"/>
+    <cs:effectRef idx="0"/>
+    <cs:fontRef idx="minor">
+      <a:schemeClr val="tx1"/>
+    </cs:fontRef>
+    <cs:spPr>
+      <a:ln w="19050" cap="rnd">
+        <a:solidFill>
+          <a:schemeClr val="phClr"/>
+        </a:solidFill>
+        <a:prstDash val="sysDot"/>
+      </a:ln>
+    </cs:spPr>
+  </cs:trendline>
+  <cs:trendlineLabel>
+    <cs:lnRef idx="0"/>
+    <cs:fillRef idx="0"/>
+    <cs:effectRef idx="0"/>
+    <cs:fontRef idx="minor">
+      <a:schemeClr val="tx1">
+        <a:lumMod val="65000"/>
+        <a:lumOff val="35000"/>
+      </a:schemeClr>
+    </cs:fontRef>
+    <cs:defRPr sz="900" kern="1200"/>
+  </cs:trendlineLabel>
+  <cs:upBar>
+    <cs:lnRef idx="0"/>
+    <cs:fillRef idx="0"/>
+    <cs:effectRef idx="0"/>
+    <cs:fontRef idx="minor">
+      <a:schemeClr val="tx1"/>
+    </cs:fontRef>
+    <cs:spPr>
+      <a:solidFill>
+        <a:schemeClr val="lt1"/>
+      </a:solidFill>
+      <a:ln w="9525" cap="flat" cmpd="sng" algn="ctr">
+        <a:solidFill>
+          <a:schemeClr val="tx1">
+            <a:lumMod val="65000"/>
+            <a:lumOff val="35000"/>
+          </a:schemeClr>
+        </a:solidFill>
+        <a:round/>
+      </a:ln>
+    </cs:spPr>
+  </cs:upBar>
+  <cs:valueAxis>
+    <cs:lnRef idx="0"/>
+    <cs:fillRef idx="0"/>
+    <cs:effectRef idx="0"/>
+    <cs:fontRef idx="minor">
+      <a:schemeClr val="tx1">
+        <a:lumMod val="65000"/>
+        <a:lumOff val="35000"/>
+      </a:schemeClr>
+    </cs:fontRef>
+    <cs:spPr>
+      <a:ln w="9525" cap="flat" cmpd="sng" algn="ctr">
+        <a:solidFill>
+          <a:schemeClr val="tx1">
+            <a:lumMod val="25000"/>
+            <a:lumOff val="75000"/>
+          </a:schemeClr>
+        </a:solidFill>
+        <a:round/>
+      </a:ln>
+    </cs:spPr>
+    <cs:defRPr sz="900" kern="1200"/>
+  </cs:valueAxis>
+  <cs:wall>
+    <cs:lnRef idx="0"/>
+    <cs:fillRef idx="0"/>
+    <cs:effectRef idx="0"/>
+    <cs:fontRef idx="minor">
+      <a:schemeClr val="tx1"/>
+    </cs:fontRef>
+    <cs:spPr>
+      <a:noFill/>
+      <a:ln>
+        <a:noFill/>
+      </a:ln>
+    </cs:spPr>
+  </cs:wall>
+</cs:chartStyle>
+</file>
+
 <file path=word/theme/theme1.xml><?xml version="1.0" encoding="utf-8"?>
 <a:theme xmlns:a="http://schemas.openxmlformats.org/drawingml/2006/main" name="Thème Office">
   <a:themeElements>
@@ -21017,7 +22776,7 @@
 </file>
 
 <file path=customXml/itemProps1.xml><?xml version="1.0" encoding="utf-8"?>
-<ds:datastoreItem xmlns:ds="http://schemas.openxmlformats.org/officeDocument/2006/customXml" ds:itemID="{A554BB43-3AC6-46C1-8E06-346C5C7E907C}">
+<ds:datastoreItem xmlns:ds="http://schemas.openxmlformats.org/officeDocument/2006/customXml" ds:itemID="{123E23D5-1CE5-49E2-A554-8093149639F7}">
   <ds:schemaRefs>
     <ds:schemaRef ds:uri="http://schemas.openxmlformats.org/officeDocument/2006/bibliography"/>
   </ds:schemaRefs>

</xml_diff>